<commit_message>
[update] Adicionou a Introdução (Tema do Projeto)
Foi feita a parte da introdução que fala sobre o tema do projeto
</commit_message>
<xml_diff>
--- a/2026/trabalhos/TCC/TCC_Historiando.docx
+++ b/2026/trabalhos/TCC/TCC_Historiando.docx
@@ -242,500 +242,480 @@
         </w:rPr>
         <w:t>Historiando</w:t>
       </w:r>
-      <w:r>
-        <w:rPr>
+    </w:p>
+    <w:p>
+      <w:pPr>
+        <w:spacing w:line="360" w:lineRule="auto"/>
+        <w:jc w:val="center"/>
+        <w:rPr>
+          <w:b/>
+        </w:rPr>
+      </w:pPr>
+    </w:p>
+    <w:p>
+      <w:pPr>
+        <w:spacing w:line="360" w:lineRule="auto"/>
+        <w:jc w:val="center"/>
+        <w:rPr>
+          <w:b/>
+        </w:rPr>
+      </w:pPr>
+    </w:p>
+    <w:p>
+      <w:pPr>
+        <w:spacing w:line="360" w:lineRule="auto"/>
+        <w:jc w:val="center"/>
+        <w:rPr>
+          <w:b/>
+        </w:rPr>
+      </w:pPr>
+    </w:p>
+    <w:p>
+      <w:pPr>
+        <w:spacing w:line="360" w:lineRule="auto"/>
+        <w:jc w:val="center"/>
+        <w:rPr>
+          <w:b/>
+        </w:rPr>
+      </w:pPr>
+    </w:p>
+    <w:p>
+      <w:pPr>
+        <w:spacing w:line="360" w:lineRule="auto"/>
+        <w:jc w:val="center"/>
+        <w:rPr>
+          <w:b/>
+        </w:rPr>
+      </w:pPr>
+    </w:p>
+    <w:p>
+      <w:pPr>
+        <w:spacing w:line="360" w:lineRule="auto"/>
+        <w:jc w:val="center"/>
+        <w:rPr>
+          <w:b/>
+        </w:rPr>
+      </w:pPr>
+    </w:p>
+    <w:p>
+      <w:pPr>
+        <w:spacing w:line="360" w:lineRule="auto"/>
+        <w:jc w:val="center"/>
+        <w:rPr>
+          <w:b/>
+        </w:rPr>
+      </w:pPr>
+    </w:p>
+    <w:p>
+      <w:pPr>
+        <w:spacing w:line="360" w:lineRule="auto"/>
+        <w:jc w:val="center"/>
+        <w:rPr>
+          <w:b/>
+        </w:rPr>
+      </w:pPr>
+    </w:p>
+    <w:p>
+      <w:pPr>
+        <w:spacing w:line="360" w:lineRule="auto"/>
+        <w:jc w:val="center"/>
+        <w:rPr>
+          <w:b/>
+        </w:rPr>
+      </w:pPr>
+    </w:p>
+    <w:p>
+      <w:pPr>
+        <w:spacing w:line="360" w:lineRule="auto"/>
+        <w:jc w:val="right"/>
+        <w:rPr>
+          <w:b/>
+        </w:rPr>
+      </w:pPr>
+    </w:p>
+    <w:p>
+      <w:pPr>
+        <w:spacing w:line="360" w:lineRule="auto"/>
+        <w:jc w:val="center"/>
+        <w:rPr>
+          <w:b/>
           <w:sz w:val="28"/>
           <w:szCs w:val="28"/>
         </w:rPr>
-        <w:t>:</w:t>
-      </w:r>
-    </w:p>
-    <w:p>
-      <w:pPr>
-        <w:pStyle w:val="SubttulodoTrabalho"/>
-        <w:spacing w:line="360" w:lineRule="auto"/>
-        <w:rPr>
-          <w:b/>
-          <w:szCs w:val="32"/>
-        </w:rPr>
-      </w:pPr>
-      <w:r>
-        <w:rPr>
-          <w:b/>
-          <w:szCs w:val="32"/>
-        </w:rPr>
-        <w:t>Subtítulo do Trabalho, se houver</w:t>
-      </w:r>
-    </w:p>
-    <w:p>
-      <w:pPr>
-        <w:spacing w:line="360" w:lineRule="auto"/>
-        <w:jc w:val="center"/>
-        <w:rPr>
-          <w:b/>
-        </w:rPr>
-      </w:pPr>
-    </w:p>
-    <w:p>
-      <w:pPr>
-        <w:spacing w:line="360" w:lineRule="auto"/>
-        <w:jc w:val="center"/>
-        <w:rPr>
-          <w:b/>
-        </w:rPr>
-      </w:pPr>
-    </w:p>
-    <w:p>
-      <w:pPr>
-        <w:spacing w:line="360" w:lineRule="auto"/>
-        <w:jc w:val="center"/>
-        <w:rPr>
-          <w:b/>
-        </w:rPr>
-      </w:pPr>
-    </w:p>
-    <w:p>
-      <w:pPr>
-        <w:spacing w:line="360" w:lineRule="auto"/>
-        <w:jc w:val="center"/>
-        <w:rPr>
-          <w:b/>
-        </w:rPr>
-      </w:pPr>
-    </w:p>
-    <w:p>
-      <w:pPr>
-        <w:spacing w:line="360" w:lineRule="auto"/>
-        <w:jc w:val="center"/>
-        <w:rPr>
-          <w:b/>
-        </w:rPr>
-      </w:pPr>
-    </w:p>
-    <w:p>
-      <w:pPr>
-        <w:spacing w:line="360" w:lineRule="auto"/>
-        <w:jc w:val="center"/>
-        <w:rPr>
-          <w:b/>
-        </w:rPr>
-      </w:pPr>
-    </w:p>
-    <w:p>
-      <w:pPr>
-        <w:spacing w:line="360" w:lineRule="auto"/>
-        <w:jc w:val="center"/>
-        <w:rPr>
-          <w:b/>
-        </w:rPr>
-      </w:pPr>
-    </w:p>
-    <w:p>
-      <w:pPr>
-        <w:spacing w:line="360" w:lineRule="auto"/>
-        <w:jc w:val="center"/>
-        <w:rPr>
-          <w:b/>
-        </w:rPr>
-      </w:pPr>
-    </w:p>
-    <w:p>
-      <w:pPr>
-        <w:spacing w:line="360" w:lineRule="auto"/>
-        <w:jc w:val="center"/>
-        <w:rPr>
-          <w:b/>
-        </w:rPr>
-      </w:pPr>
-    </w:p>
-    <w:p>
-      <w:pPr>
-        <w:spacing w:line="360" w:lineRule="auto"/>
-        <w:jc w:val="right"/>
-        <w:rPr>
-          <w:b/>
-        </w:rPr>
-      </w:pPr>
-    </w:p>
-    <w:p>
-      <w:pPr>
-        <w:spacing w:line="360" w:lineRule="auto"/>
-        <w:jc w:val="center"/>
+      </w:pPr>
+      <w:r>
         <w:rPr>
           <w:b/>
           <w:sz w:val="28"/>
           <w:szCs w:val="28"/>
         </w:rPr>
-      </w:pPr>
-      <w:r>
+        <w:t>Campinas</w:t>
+      </w:r>
+    </w:p>
+    <w:p>
+      <w:pPr>
+        <w:spacing w:line="360" w:lineRule="auto"/>
+        <w:jc w:val="center"/>
         <w:rPr>
           <w:b/>
           <w:sz w:val="28"/>
           <w:szCs w:val="28"/>
         </w:rPr>
-        <w:t>Campinas</w:t>
-      </w:r>
-    </w:p>
-    <w:p>
-      <w:pPr>
-        <w:spacing w:line="360" w:lineRule="auto"/>
-        <w:jc w:val="center"/>
+      </w:pPr>
+      <w:r>
         <w:rPr>
           <w:b/>
           <w:sz w:val="28"/>
           <w:szCs w:val="28"/>
         </w:rPr>
-      </w:pPr>
+        <w:t>202</w:t>
+      </w:r>
       <w:r>
         <w:rPr>
           <w:b/>
           <w:sz w:val="28"/>
           <w:szCs w:val="28"/>
         </w:rPr>
-        <w:t>202</w:t>
-      </w:r>
-      <w:r>
-        <w:rPr>
-          <w:b/>
+        <w:t>6</w:t>
+      </w:r>
+    </w:p>
+    <w:p>
+      <w:pPr>
+        <w:spacing w:line="360" w:lineRule="auto"/>
+        <w:jc w:val="center"/>
+      </w:pPr>
+    </w:p>
+    <w:p>
+      <w:pPr>
+        <w:spacing w:line="360" w:lineRule="auto"/>
+        <w:jc w:val="center"/>
+      </w:pPr>
+    </w:p>
+    <w:p>
+      <w:pPr>
+        <w:spacing w:line="360" w:lineRule="auto"/>
+        <w:jc w:val="center"/>
+      </w:pPr>
+    </w:p>
+    <w:p>
+      <w:pPr>
+        <w:spacing w:line="360" w:lineRule="auto"/>
+        <w:jc w:val="center"/>
+      </w:pPr>
+    </w:p>
+    <w:p>
+      <w:pPr>
+        <w:spacing w:line="360" w:lineRule="auto"/>
+        <w:jc w:val="center"/>
+        <w:rPr>
+          <w:b/>
+          <w:bCs/>
           <w:sz w:val="28"/>
           <w:szCs w:val="28"/>
         </w:rPr>
-        <w:t>6</w:t>
-      </w:r>
-    </w:p>
-    <w:p>
-      <w:pPr>
-        <w:spacing w:line="360" w:lineRule="auto"/>
-        <w:jc w:val="center"/>
-      </w:pPr>
-    </w:p>
-    <w:p>
-      <w:pPr>
-        <w:spacing w:line="360" w:lineRule="auto"/>
-        <w:jc w:val="center"/>
-      </w:pPr>
-    </w:p>
-    <w:p>
-      <w:pPr>
-        <w:spacing w:line="360" w:lineRule="auto"/>
-        <w:jc w:val="center"/>
-      </w:pPr>
-    </w:p>
-    <w:p>
-      <w:pPr>
-        <w:spacing w:line="360" w:lineRule="auto"/>
-        <w:jc w:val="center"/>
-      </w:pPr>
-    </w:p>
-    <w:p>
-      <w:pPr>
-        <w:spacing w:line="360" w:lineRule="auto"/>
-        <w:jc w:val="center"/>
+      </w:pPr>
+      <w:r>
         <w:rPr>
           <w:b/>
           <w:bCs/>
           <w:sz w:val="28"/>
           <w:szCs w:val="28"/>
         </w:rPr>
-      </w:pPr>
-      <w:r>
+        <w:t>Julia Mendes Pereira</w:t>
+      </w:r>
+    </w:p>
+    <w:p>
+      <w:pPr>
+        <w:spacing w:line="360" w:lineRule="auto"/>
+        <w:jc w:val="center"/>
         <w:rPr>
           <w:b/>
           <w:bCs/>
           <w:sz w:val="28"/>
           <w:szCs w:val="28"/>
         </w:rPr>
-        <w:t>Julia Mendes Pereira</w:t>
-      </w:r>
-    </w:p>
-    <w:p>
-      <w:pPr>
-        <w:spacing w:line="360" w:lineRule="auto"/>
-        <w:jc w:val="center"/>
+      </w:pPr>
+      <w:r>
         <w:rPr>
           <w:b/>
           <w:bCs/>
           <w:sz w:val="28"/>
           <w:szCs w:val="28"/>
         </w:rPr>
-      </w:pPr>
-      <w:r>
-        <w:rPr>
-          <w:b/>
+        <w:t>Maria Júlia da Silva Araújo</w:t>
+      </w:r>
+    </w:p>
+    <w:p>
+      <w:pPr>
+        <w:spacing w:line="360" w:lineRule="auto"/>
+        <w:jc w:val="center"/>
+      </w:pPr>
+    </w:p>
+    <w:p>
+      <w:pPr>
+        <w:spacing w:line="360" w:lineRule="auto"/>
+        <w:jc w:val="center"/>
+      </w:pPr>
+    </w:p>
+    <w:p>
+      <w:pPr>
+        <w:spacing w:line="360" w:lineRule="auto"/>
+        <w:jc w:val="center"/>
+      </w:pPr>
+    </w:p>
+    <w:p>
+      <w:pPr>
+        <w:spacing w:line="360" w:lineRule="auto"/>
+        <w:jc w:val="center"/>
+      </w:pPr>
+    </w:p>
+    <w:p>
+      <w:pPr>
+        <w:spacing w:line="360" w:lineRule="auto"/>
+        <w:jc w:val="center"/>
+      </w:pPr>
+    </w:p>
+    <w:p>
+      <w:pPr>
+        <w:spacing w:line="360" w:lineRule="auto"/>
+        <w:jc w:val="center"/>
+      </w:pPr>
+    </w:p>
+    <w:p>
+      <w:pPr>
+        <w:pStyle w:val="TtulodoTrabalho"/>
+        <w:spacing w:line="360" w:lineRule="auto"/>
+        <w:rPr>
           <w:bCs/>
           <w:sz w:val="28"/>
           <w:szCs w:val="28"/>
         </w:rPr>
-        <w:t>Maria Júlia da Silva Araújo</w:t>
-      </w:r>
-    </w:p>
-    <w:p>
-      <w:pPr>
-        <w:spacing w:line="360" w:lineRule="auto"/>
-        <w:jc w:val="center"/>
-      </w:pPr>
-    </w:p>
-    <w:p>
-      <w:pPr>
-        <w:spacing w:line="360" w:lineRule="auto"/>
-        <w:jc w:val="center"/>
-      </w:pPr>
-    </w:p>
-    <w:p>
-      <w:pPr>
-        <w:spacing w:line="360" w:lineRule="auto"/>
-        <w:jc w:val="center"/>
-      </w:pPr>
-    </w:p>
-    <w:p>
-      <w:pPr>
-        <w:spacing w:line="360" w:lineRule="auto"/>
-        <w:jc w:val="center"/>
-      </w:pPr>
-    </w:p>
-    <w:p>
-      <w:pPr>
-        <w:spacing w:line="360" w:lineRule="auto"/>
-        <w:jc w:val="center"/>
-      </w:pPr>
-    </w:p>
-    <w:p>
-      <w:pPr>
-        <w:spacing w:line="360" w:lineRule="auto"/>
-        <w:jc w:val="center"/>
-      </w:pPr>
-    </w:p>
-    <w:p>
-      <w:pPr>
-        <w:pStyle w:val="TtulodoTrabalho"/>
-        <w:spacing w:line="360" w:lineRule="auto"/>
+      </w:pPr>
+      <w:r>
         <w:rPr>
           <w:bCs/>
           <w:sz w:val="28"/>
           <w:szCs w:val="28"/>
         </w:rPr>
-      </w:pPr>
-      <w:r>
-        <w:rPr>
+        <w:t>HISTORIANDO</w:t>
+      </w:r>
+    </w:p>
+    <w:p>
+      <w:pPr>
+        <w:pStyle w:val="SubttulodoTrabalho"/>
+        <w:spacing w:line="360" w:lineRule="auto"/>
+        <w:rPr>
+          <w:b/>
+          <w:bCs/>
+          <w:szCs w:val="32"/>
+        </w:rPr>
+      </w:pPr>
+    </w:p>
+    <w:p>
+      <w:pPr>
+        <w:spacing w:line="360" w:lineRule="auto"/>
+        <w:jc w:val="center"/>
+      </w:pPr>
+    </w:p>
+    <w:p>
+      <w:pPr>
+        <w:spacing w:line="360" w:lineRule="auto"/>
+        <w:jc w:val="center"/>
+      </w:pPr>
+    </w:p>
+    <w:p>
+      <w:pPr>
+        <w:spacing w:line="360" w:lineRule="auto"/>
+        <w:jc w:val="center"/>
+      </w:pPr>
+    </w:p>
+    <w:p>
+      <w:pPr>
+        <w:spacing w:line="360" w:lineRule="auto"/>
+        <w:jc w:val="center"/>
+      </w:pPr>
+    </w:p>
+    <w:p>
+      <w:pPr>
+        <w:spacing w:line="360" w:lineRule="auto"/>
+        <w:jc w:val="center"/>
+      </w:pPr>
+    </w:p>
+    <w:p>
+      <w:pPr>
+        <w:pStyle w:val="NaturezadoTrabalho"/>
+        <w:ind w:left="4536"/>
+      </w:pPr>
+      <w:r>
+        <w:rPr>
+          <w:sz w:val="22"/>
+        </w:rPr>
+        <w:t xml:space="preserve">Trabalho de Conclusão de Curso apresentado </w:t>
+      </w:r>
+      <w:r>
+        <w:rPr>
+          <w:sz w:val="22"/>
+        </w:rPr>
+        <w:t xml:space="preserve">ao Curso Técnico em Desenvolvimento de Sistemas </w:t>
+      </w:r>
+      <w:r>
+        <w:rPr>
+          <w:sz w:val="22"/>
+        </w:rPr>
+        <w:t xml:space="preserve">da </w:t>
+      </w:r>
+      <w:r>
+        <w:rPr>
+          <w:sz w:val="22"/>
+        </w:rPr>
+        <w:t>ETEC Bento Quirino</w:t>
+      </w:r>
+      <w:r>
+        <w:rPr>
+          <w:sz w:val="22"/>
+        </w:rPr>
+        <w:t>, orienta</w:t>
+      </w:r>
+      <w:r>
+        <w:rPr>
+          <w:sz w:val="22"/>
+        </w:rPr>
+        <w:t xml:space="preserve">do pelo </w:t>
+      </w:r>
+      <w:r>
+        <w:rPr>
+          <w:sz w:val="22"/>
+        </w:rPr>
+        <w:t>Prof</w:t>
+      </w:r>
+      <w:r>
+        <w:rPr>
+          <w:sz w:val="22"/>
+        </w:rPr>
+        <w:t>.</w:t>
+      </w:r>
+      <w:r>
+        <w:rPr>
+          <w:sz w:val="22"/>
+        </w:rPr>
+        <w:t xml:space="preserve"> XXX</w:t>
+      </w:r>
+      <w:r>
+        <w:rPr>
+          <w:sz w:val="22"/>
+        </w:rPr>
+        <w:t xml:space="preserve">, como requisito parcial para obtenção do título de Técnico em </w:t>
+      </w:r>
+      <w:r>
+        <w:rPr>
+          <w:sz w:val="22"/>
+        </w:rPr>
+        <w:t>Desenvolvimento de Sistemas</w:t>
+      </w:r>
+      <w:r>
+        <w:rPr>
+          <w:sz w:val="24"/>
+          <w:szCs w:val="24"/>
+        </w:rPr>
+        <w:t>.</w:t>
+      </w:r>
+    </w:p>
+    <w:p>
+      <w:pPr>
+        <w:spacing w:line="360" w:lineRule="auto"/>
+        <w:jc w:val="center"/>
+        <w:rPr>
+          <w:szCs w:val="24"/>
+        </w:rPr>
+      </w:pPr>
+    </w:p>
+    <w:p>
+      <w:pPr>
+        <w:spacing w:line="360" w:lineRule="auto"/>
+        <w:jc w:val="center"/>
+        <w:rPr>
+          <w:szCs w:val="24"/>
+        </w:rPr>
+      </w:pPr>
+    </w:p>
+    <w:p>
+      <w:pPr>
+        <w:pStyle w:val="SubttulodoTrabalho"/>
+        <w:spacing w:line="360" w:lineRule="auto"/>
+        <w:rPr>
+          <w:sz w:val="24"/>
+          <w:szCs w:val="24"/>
+        </w:rPr>
+      </w:pPr>
+    </w:p>
+    <w:p>
+      <w:pPr>
+        <w:spacing w:line="360" w:lineRule="auto"/>
+        <w:jc w:val="center"/>
+        <w:rPr>
+          <w:szCs w:val="24"/>
+        </w:rPr>
+      </w:pPr>
+    </w:p>
+    <w:p>
+      <w:pPr>
+        <w:spacing w:line="360" w:lineRule="auto"/>
+        <w:jc w:val="center"/>
+        <w:rPr>
+          <w:szCs w:val="24"/>
+        </w:rPr>
+      </w:pPr>
+    </w:p>
+    <w:p>
+      <w:pPr>
+        <w:spacing w:line="360" w:lineRule="auto"/>
+        <w:jc w:val="center"/>
+        <w:rPr>
+          <w:szCs w:val="24"/>
+        </w:rPr>
+      </w:pPr>
+    </w:p>
+    <w:p>
+      <w:pPr>
+        <w:spacing w:line="360" w:lineRule="auto"/>
+        <w:jc w:val="center"/>
+        <w:rPr>
+          <w:szCs w:val="24"/>
+        </w:rPr>
+      </w:pPr>
+    </w:p>
+    <w:p>
+      <w:pPr>
+        <w:spacing w:line="360" w:lineRule="auto"/>
+        <w:jc w:val="center"/>
+        <w:rPr>
+          <w:szCs w:val="24"/>
+        </w:rPr>
+      </w:pPr>
+    </w:p>
+    <w:p>
+      <w:pPr>
+        <w:spacing w:line="360" w:lineRule="auto"/>
+        <w:jc w:val="center"/>
+        <w:rPr>
+          <w:b/>
           <w:bCs/>
           <w:sz w:val="28"/>
           <w:szCs w:val="28"/>
         </w:rPr>
-        <w:t>HISTORIANDO</w:t>
-      </w:r>
-      <w:r>
-        <w:rPr>
+      </w:pPr>
+      <w:r>
+        <w:rPr>
+          <w:b/>
           <w:bCs/>
           <w:sz w:val="28"/>
           <w:szCs w:val="28"/>
         </w:rPr>
-        <w:t>:</w:t>
-      </w:r>
-    </w:p>
-    <w:p>
-      <w:pPr>
-        <w:pStyle w:val="SubttulodoTrabalho"/>
-        <w:spacing w:line="360" w:lineRule="auto"/>
-        <w:rPr>
-          <w:b/>
-          <w:bCs/>
-          <w:szCs w:val="32"/>
-        </w:rPr>
-      </w:pPr>
-      <w:r>
-        <w:rPr>
-          <w:b/>
-          <w:bCs/>
-          <w:szCs w:val="32"/>
-        </w:rPr>
-        <w:t>Subtítulo do Trabalho, se houver</w:t>
-      </w:r>
-    </w:p>
-    <w:p>
-      <w:pPr>
-        <w:spacing w:line="360" w:lineRule="auto"/>
-        <w:jc w:val="center"/>
-      </w:pPr>
-    </w:p>
-    <w:p>
-      <w:pPr>
-        <w:spacing w:line="360" w:lineRule="auto"/>
-        <w:jc w:val="center"/>
-      </w:pPr>
-    </w:p>
-    <w:p>
-      <w:pPr>
-        <w:spacing w:line="360" w:lineRule="auto"/>
-        <w:jc w:val="center"/>
-      </w:pPr>
-    </w:p>
-    <w:p>
-      <w:pPr>
-        <w:spacing w:line="360" w:lineRule="auto"/>
-        <w:jc w:val="center"/>
-      </w:pPr>
-    </w:p>
-    <w:p>
-      <w:pPr>
-        <w:spacing w:line="360" w:lineRule="auto"/>
-        <w:jc w:val="center"/>
-      </w:pPr>
-    </w:p>
-    <w:p>
-      <w:pPr>
-        <w:pStyle w:val="NaturezadoTrabalho"/>
-        <w:ind w:left="4536"/>
-      </w:pPr>
-      <w:r>
-        <w:rPr>
-          <w:sz w:val="22"/>
-        </w:rPr>
-        <w:t xml:space="preserve">Trabalho de Conclusão de Curso apresentado </w:t>
-      </w:r>
-      <w:r>
-        <w:rPr>
-          <w:sz w:val="22"/>
-        </w:rPr>
-        <w:t xml:space="preserve">ao Curso Técnico em Desenvolvimento de Sistemas </w:t>
-      </w:r>
-      <w:r>
-        <w:rPr>
-          <w:sz w:val="22"/>
-        </w:rPr>
-        <w:t xml:space="preserve">da </w:t>
-      </w:r>
-      <w:r>
-        <w:rPr>
-          <w:sz w:val="22"/>
-        </w:rPr>
-        <w:t>ETEC Bento Quirino</w:t>
-      </w:r>
-      <w:r>
-        <w:rPr>
-          <w:sz w:val="22"/>
-        </w:rPr>
-        <w:t>, orienta</w:t>
-      </w:r>
-      <w:r>
-        <w:rPr>
-          <w:sz w:val="22"/>
-        </w:rPr>
-        <w:t xml:space="preserve">do pelo </w:t>
-      </w:r>
-      <w:r>
-        <w:rPr>
-          <w:sz w:val="22"/>
-        </w:rPr>
-        <w:t>Prof</w:t>
-      </w:r>
-      <w:r>
-        <w:rPr>
-          <w:sz w:val="22"/>
-        </w:rPr>
-        <w:t>.</w:t>
-      </w:r>
-      <w:r>
-        <w:rPr>
-          <w:sz w:val="22"/>
-        </w:rPr>
-        <w:t xml:space="preserve"> XXX</w:t>
-      </w:r>
-      <w:r>
-        <w:rPr>
-          <w:sz w:val="22"/>
-        </w:rPr>
-        <w:t xml:space="preserve">, como requisito parcial para obtenção do título de Técnico em </w:t>
-      </w:r>
-      <w:r>
-        <w:rPr>
-          <w:sz w:val="22"/>
-        </w:rPr>
-        <w:t>Desenvolvimento de Sistemas</w:t>
-      </w:r>
-      <w:r>
-        <w:rPr>
-          <w:sz w:val="24"/>
-          <w:szCs w:val="24"/>
-        </w:rPr>
-        <w:t>.</w:t>
-      </w:r>
-    </w:p>
-    <w:p>
-      <w:pPr>
-        <w:spacing w:line="360" w:lineRule="auto"/>
-        <w:jc w:val="center"/>
-        <w:rPr>
-          <w:szCs w:val="24"/>
-        </w:rPr>
-      </w:pPr>
-    </w:p>
-    <w:p>
-      <w:pPr>
-        <w:spacing w:line="360" w:lineRule="auto"/>
-        <w:jc w:val="center"/>
-        <w:rPr>
-          <w:szCs w:val="24"/>
-        </w:rPr>
-      </w:pPr>
-    </w:p>
-    <w:p>
-      <w:pPr>
-        <w:pStyle w:val="SubttulodoTrabalho"/>
-        <w:spacing w:line="360" w:lineRule="auto"/>
-        <w:rPr>
-          <w:sz w:val="24"/>
-          <w:szCs w:val="24"/>
-        </w:rPr>
-      </w:pPr>
-    </w:p>
-    <w:p>
-      <w:pPr>
-        <w:spacing w:line="360" w:lineRule="auto"/>
-        <w:jc w:val="center"/>
-        <w:rPr>
-          <w:szCs w:val="24"/>
-        </w:rPr>
-      </w:pPr>
-    </w:p>
-    <w:p>
-      <w:pPr>
-        <w:spacing w:line="360" w:lineRule="auto"/>
-        <w:jc w:val="center"/>
-        <w:rPr>
-          <w:szCs w:val="24"/>
-        </w:rPr>
-      </w:pPr>
-    </w:p>
-    <w:p>
-      <w:pPr>
-        <w:spacing w:line="360" w:lineRule="auto"/>
-        <w:jc w:val="center"/>
-        <w:rPr>
-          <w:szCs w:val="24"/>
-        </w:rPr>
-      </w:pPr>
-    </w:p>
-    <w:p>
-      <w:pPr>
-        <w:spacing w:line="360" w:lineRule="auto"/>
-        <w:jc w:val="center"/>
-        <w:rPr>
-          <w:szCs w:val="24"/>
-        </w:rPr>
-      </w:pPr>
-    </w:p>
-    <w:p>
-      <w:pPr>
-        <w:spacing w:line="360" w:lineRule="auto"/>
-        <w:jc w:val="center"/>
-        <w:rPr>
-          <w:szCs w:val="24"/>
-        </w:rPr>
-      </w:pPr>
-    </w:p>
-    <w:p>
-      <w:pPr>
-        <w:spacing w:line="360" w:lineRule="auto"/>
+        <w:t>Campinas</w:t>
+      </w:r>
+    </w:p>
+    <w:p>
+      <w:pPr>
         <w:jc w:val="center"/>
         <w:rPr>
           <w:b/>
@@ -751,48 +731,28 @@
           <w:sz w:val="28"/>
           <w:szCs w:val="28"/>
         </w:rPr>
-        <w:t>Campinas</w:t>
-      </w:r>
-    </w:p>
-    <w:p>
-      <w:pPr>
-        <w:jc w:val="center"/>
+        <w:t>202</w:t>
+      </w:r>
+      <w:r>
         <w:rPr>
           <w:b/>
           <w:bCs/>
           <w:sz w:val="28"/>
           <w:szCs w:val="28"/>
         </w:rPr>
-      </w:pPr>
-      <w:r>
-        <w:rPr>
+        <w:t>6</w:t>
+      </w:r>
+    </w:p>
+    <w:p>
+      <w:pPr>
+        <w:jc w:val="center"/>
+        <w:rPr>
+          <w:rFonts w:cs="Arial"/>
           <w:b/>
           <w:bCs/>
           <w:sz w:val="28"/>
           <w:szCs w:val="28"/>
         </w:rPr>
-        <w:t>202</w:t>
-      </w:r>
-      <w:r>
-        <w:rPr>
-          <w:b/>
-          <w:bCs/>
-          <w:sz w:val="28"/>
-          <w:szCs w:val="28"/>
-        </w:rPr>
-        <w:t>6</w:t>
-      </w:r>
-    </w:p>
-    <w:p>
-      <w:pPr>
-        <w:jc w:val="center"/>
-        <w:rPr>
-          <w:rFonts w:cs="Arial"/>
-          <w:b/>
-          <w:bCs/>
-          <w:sz w:val="28"/>
-          <w:szCs w:val="28"/>
-        </w:rPr>
       </w:pPr>
     </w:p>
     <w:p>
@@ -1018,8 +978,6 @@
         </w:rPr>
         <w:t>; immersive learning.</w:t>
       </w:r>
-      <w:bookmarkStart w:id="0" w:name="_GoBack"/>
-      <w:bookmarkEnd w:id="0"/>
     </w:p>
     <w:p>
       <w:pPr>
@@ -1385,6 +1343,93 @@
         <w:spacing w:after="0" w:line="360" w:lineRule="auto"/>
         <w:jc w:val="left"/>
       </w:pPr>
+      <w:r>
+        <w:t>Segundo o historiador Américo Villela, “um pouco d</w:t>
+      </w:r>
+      <w:r>
+        <w:t xml:space="preserve">o papel da disciplina </w:t>
+      </w:r>
+      <w:r>
+        <w:t>H</w:t>
+      </w:r>
+      <w:r>
+        <w:t>istória no ensino médio</w:t>
+      </w:r>
+      <w:r>
+        <w:t xml:space="preserve">, isso é, </w:t>
+      </w:r>
+      <w:r>
+        <w:t>qualificar o aluno para entender a realidade social que ele vive e atuar como agente de trans</w:t>
+      </w:r>
+      <w:r>
+        <w:t xml:space="preserve">formação dessa realidade </w:t>
+      </w:r>
+      <w:r>
+        <w:t>social. ”</w:t>
+      </w:r>
+      <w:r>
+        <w:t xml:space="preserve"> </w:t>
+      </w:r>
+      <w:r>
+        <w:t>Desse modo, o entendimento acerca de assuntos históricos torna-se essencial para a transformação social, uma vez que ela é alcançada por meio da compreensão dos mecanismos que conduzem a determinadas situações. A partir dessa compreensão da dinâmica social e da evolução histórica, é possível estabelecer medidas que contribuam para a construção de um futuro diferente.</w:t>
+      </w:r>
+      <w:r>
+        <w:t xml:space="preserve"> </w:t>
+      </w:r>
+    </w:p>
+    <w:p>
+      <w:pPr>
+        <w:pStyle w:val="Texto-Resumo"/>
+        <w:spacing w:after="0" w:line="360" w:lineRule="auto"/>
+        <w:jc w:val="left"/>
+        <w:rPr>
+          <w:rFonts w:cs="Arial"/>
+          <w:snapToGrid/>
+          <w:color w:val="000000" w:themeColor="text1"/>
+          <w:szCs w:val="24"/>
+        </w:rPr>
+      </w:pPr>
+      <w:r>
+        <w:rPr>
+          <w:rFonts w:cs="Arial"/>
+          <w:snapToGrid/>
+          <w:color w:val="000000" w:themeColor="text1"/>
+          <w:szCs w:val="24"/>
+        </w:rPr>
+        <w:t>Além disso, a história nos ensina empatia e respeito às diferenças. Ao aprender sobre culturas, movimentos sociais e acontecimentos globais, os estudantes ampliam sua visão de mundo, entendendo melhor a importância da diversidade e da luta por igualdade.</w:t>
+      </w:r>
+      <w:r>
+        <w:rPr>
+          <w:rFonts w:cs="Arial"/>
+          <w:snapToGrid/>
+          <w:color w:val="000000" w:themeColor="text1"/>
+          <w:szCs w:val="24"/>
+        </w:rPr>
+        <w:t xml:space="preserve"> (UBES)</w:t>
+      </w:r>
+    </w:p>
+    <w:p>
+      <w:pPr>
+        <w:pStyle w:val="Texto-Resumo"/>
+        <w:spacing w:after="0" w:line="360" w:lineRule="auto"/>
+        <w:jc w:val="left"/>
+      </w:pPr>
+      <w:r>
+        <w:t>Sendo assim, este Trabalho de Conclusão de Curso (TCC) dedica-se ao desenvolvimento de um jogo educativo que auxilie</w:t>
+      </w:r>
+      <w:r>
+        <w:t xml:space="preserve"> estudantes</w:t>
+      </w:r>
+      <w:r>
+        <w:t xml:space="preserve"> na assimilação de conteúdos históricos, especificamente sobre os períodos Pré-Colonial e Colonial do Brasil, utilizando uma abordagem lúdica e imersiva.</w:t>
+      </w:r>
+    </w:p>
+    <w:p>
+      <w:pPr>
+        <w:pStyle w:val="Texto-Resumo"/>
+        <w:spacing w:after="0" w:line="360" w:lineRule="auto"/>
+        <w:jc w:val="left"/>
+      </w:pPr>
     </w:p>
     <w:p>
       <w:pPr>
@@ -1683,6 +1728,8 @@
         <w:spacing w:after="0" w:line="360" w:lineRule="auto"/>
         <w:jc w:val="left"/>
       </w:pPr>
+      <w:bookmarkStart w:id="0" w:name="_GoBack"/>
+      <w:bookmarkEnd w:id="0"/>
     </w:p>
     <w:p>
       <w:pPr>
@@ -1835,7 +1882,6 @@
           <w:b/>
           <w:szCs w:val="24"/>
         </w:rPr>
-        <w:lastRenderedPageBreak/>
         <w:t>2. DESENVOLVIMENTO</w:t>
       </w:r>
     </w:p>
@@ -2151,7 +2197,6 @@
           <w:b/>
           <w:szCs w:val="24"/>
         </w:rPr>
-        <w:lastRenderedPageBreak/>
         <w:t>3. CONSIDERAÇÕES FINAIS</w:t>
       </w:r>
     </w:p>
@@ -2465,7 +2510,6 @@
         <w:rPr>
           <w:b/>
         </w:rPr>
-        <w:lastRenderedPageBreak/>
         <w:t>REFERÊNCIAS</w:t>
       </w:r>
     </w:p>
@@ -2556,6 +2600,15 @@
           <w:szCs w:val="22"/>
         </w:rPr>
       </w:pPr>
+      <w:r>
+        <w:rPr>
+          <w:rFonts w:cs="Arial"/>
+          <w:bCs/>
+          <w:sz w:val="22"/>
+          <w:szCs w:val="22"/>
+        </w:rPr>
+        <w:t>https://www.ubes.org.br/2024/a-importancia-de-estudar-historia-nas-escolas/</w:t>
+      </w:r>
     </w:p>
     <w:sectPr>
       <w:headerReference w:type="default" r:id="rId10"/>
@@ -2722,7 +2775,7 @@
           <w:rPr>
             <w:noProof/>
           </w:rPr>
-          <w:t>7</w:t>
+          <w:t>6</w:t>
         </w:r>
         <w:r>
           <w:fldChar w:fldCharType="end"/>
@@ -4106,7 +4159,7 @@
 </file>
 
 <file path=customXml/itemProps1.xml><?xml version="1.0" encoding="utf-8"?>
-<ds:datastoreItem xmlns:ds="http://schemas.openxmlformats.org/officeDocument/2006/customXml" ds:itemID="{D3DCEF8B-E8FB-481E-985B-06393E1D388B}">
+<ds:datastoreItem xmlns:ds="http://schemas.openxmlformats.org/officeDocument/2006/customXml" ds:itemID="{D34DA10D-A492-4D08-BAD4-4CD594219B41}">
   <ds:schemaRefs>
     <ds:schemaRef ds:uri="http://schemas.openxmlformats.org/officeDocument/2006/bibliography"/>
   </ds:schemaRefs>

</xml_diff>

<commit_message>
Add textos bases de medot/justif/probl
</commit_message>
<xml_diff>
--- a/2026/trabalhos/TCC/TCC_Historiando.docx
+++ b/2026/trabalhos/TCC/TCC_Historiando.docx
@@ -1,6 +1,6 @@
 
 <file path=word/document.xml><?xml version="1.0" encoding="utf-8"?>
-<w:document xmlns:wpc="http://schemas.microsoft.com/office/word/2010/wordprocessingCanvas" xmlns:cx="http://schemas.microsoft.com/office/drawing/2014/chartex" xmlns:cx1="http://schemas.microsoft.com/office/drawing/2015/9/8/chartex" xmlns:mc="http://schemas.openxmlformats.org/markup-compatibility/2006" xmlns:o="urn:schemas-microsoft-com:office:office" xmlns:r="http://schemas.openxmlformats.org/officeDocument/2006/relationships" xmlns:m="http://schemas.openxmlformats.org/officeDocument/2006/math" xmlns:v="urn:schemas-microsoft-com:vml" xmlns:wp14="http://schemas.microsoft.com/office/word/2010/wordprocessingDrawing" xmlns:wp="http://schemas.openxmlformats.org/drawingml/2006/wordprocessingDrawing" xmlns:w10="urn:schemas-microsoft-com:office:word" xmlns:w="http://schemas.openxmlformats.org/wordprocessingml/2006/main" xmlns:w14="http://schemas.microsoft.com/office/word/2010/wordml" xmlns:w15="http://schemas.microsoft.com/office/word/2012/wordml" xmlns:w16se="http://schemas.microsoft.com/office/word/2015/wordml/symex" xmlns:wpg="http://schemas.microsoft.com/office/word/2010/wordprocessingGroup" xmlns:wpi="http://schemas.microsoft.com/office/word/2010/wordprocessingInk" xmlns:wne="http://schemas.microsoft.com/office/word/2006/wordml" xmlns:wps="http://schemas.microsoft.com/office/word/2010/wordprocessingShape" mc:Ignorable="w14 w15 w16se wp14">
+<w:document xmlns:wpc="http://schemas.microsoft.com/office/word/2010/wordprocessingCanvas" xmlns:cx="http://schemas.microsoft.com/office/drawing/2014/chartex" xmlns:cx1="http://schemas.microsoft.com/office/drawing/2015/9/8/chartex" xmlns:cx2="http://schemas.microsoft.com/office/drawing/2015/10/21/chartex" xmlns:cx3="http://schemas.microsoft.com/office/drawing/2016/5/9/chartex" xmlns:cx4="http://schemas.microsoft.com/office/drawing/2016/5/10/chartex" xmlns:cx5="http://schemas.microsoft.com/office/drawing/2016/5/11/chartex" xmlns:cx6="http://schemas.microsoft.com/office/drawing/2016/5/12/chartex" xmlns:cx7="http://schemas.microsoft.com/office/drawing/2016/5/13/chartex" xmlns:cx8="http://schemas.microsoft.com/office/drawing/2016/5/14/chartex" xmlns:mc="http://schemas.openxmlformats.org/markup-compatibility/2006" xmlns:aink="http://schemas.microsoft.com/office/drawing/2016/ink" xmlns:am3d="http://schemas.microsoft.com/office/drawing/2017/model3d" xmlns:o="urn:schemas-microsoft-com:office:office" xmlns:oel="http://schemas.microsoft.com/office/2019/extlst" xmlns:r="http://schemas.openxmlformats.org/officeDocument/2006/relationships" xmlns:m="http://schemas.openxmlformats.org/officeDocument/2006/math" xmlns:v="urn:schemas-microsoft-com:vml" xmlns:wp14="http://schemas.microsoft.com/office/word/2010/wordprocessingDrawing" xmlns:wp="http://schemas.openxmlformats.org/drawingml/2006/wordprocessingDrawing" xmlns:w10="urn:schemas-microsoft-com:office:word" xmlns:w="http://schemas.openxmlformats.org/wordprocessingml/2006/main" xmlns:w14="http://schemas.microsoft.com/office/word/2010/wordml" xmlns:w15="http://schemas.microsoft.com/office/word/2012/wordml" xmlns:w16cex="http://schemas.microsoft.com/office/word/2018/wordml/cex" xmlns:w16cid="http://schemas.microsoft.com/office/word/2016/wordml/cid" xmlns:w16="http://schemas.microsoft.com/office/word/2018/wordml" xmlns:w16du="http://schemas.microsoft.com/office/word/2023/wordml/word16du" xmlns:w16sdtdh="http://schemas.microsoft.com/office/word/2020/wordml/sdtdatahash" xmlns:w16sdtfl="http://schemas.microsoft.com/office/word/2024/wordml/sdtformatlock" xmlns:w16se="http://schemas.microsoft.com/office/word/2015/wordml/symex" xmlns:wpg="http://schemas.microsoft.com/office/word/2010/wordprocessingGroup" xmlns:wpi="http://schemas.microsoft.com/office/word/2010/wordprocessingInk" xmlns:wne="http://schemas.microsoft.com/office/word/2006/wordml" xmlns:wps="http://schemas.microsoft.com/office/word/2010/wordprocessingShape" mc:Ignorable="w14 w15 w16se w16cid w16 w16cex w16sdtdh w16sdtfl w16du wp14">
   <w:body>
     <w:p>
       <w:pPr>
@@ -598,7 +598,7 @@
         <w:rPr>
           <w:sz w:val="22"/>
         </w:rPr>
-        <w:t xml:space="preserve"> XXX</w:t>
+        <w:t xml:space="preserve"> Adriano Doimo</w:t>
       </w:r>
       <w:r>
         <w:rPr>
@@ -793,35 +793,31 @@
         <w:rPr>
           <w:rFonts w:ascii="Arial" w:hAnsi="Arial" w:cs="Arial"/>
         </w:rPr>
-        <w:t xml:space="preserve"> na compreensão dos processos históricos brasileiros, utilizando a interação narrativa e a participação ativa do jogador como ferramentas de aprendizagem. A metodologia adotada baseia-se em pesquisas historiográficas, referências sobre </w:t>
-      </w:r>
-      <w:proofErr w:type="spellStart"/>
+        <w:t xml:space="preserve"> na compreensão dos processos históricos brasileiros, utilizando a interação narrativa e a participação ativa do jogador como ferramentas de aprendizagem. A metodologia adotada baseia-se em pesquisas historiográficas, referências sobre gamificação e </w:t>
+      </w:r>
       <w:r>
         <w:rPr>
           <w:rFonts w:ascii="Arial" w:hAnsi="Arial" w:cs="Arial"/>
         </w:rPr>
-        <w:t>gamificação</w:t>
-      </w:r>
-      <w:proofErr w:type="spellEnd"/>
+        <w:t xml:space="preserve">na </w:t>
+      </w:r>
       <w:r>
         <w:rPr>
           <w:rFonts w:ascii="Arial" w:hAnsi="Arial" w:cs="Arial"/>
         </w:rPr>
-        <w:t xml:space="preserve"> e construção narrativa interativa, com foco na valorização dos povos originários, na contextualização histórica e na perspectiva </w:t>
-      </w:r>
-      <w:proofErr w:type="spellStart"/>
+        <w:t xml:space="preserve">construção </w:t>
+      </w:r>
       <w:r>
         <w:rPr>
           <w:rFonts w:ascii="Arial" w:hAnsi="Arial" w:cs="Arial"/>
         </w:rPr>
-        <w:t>decolonial</w:t>
-      </w:r>
-      <w:proofErr w:type="spellEnd"/>
+        <w:t xml:space="preserve">de uma </w:t>
+      </w:r>
       <w:r>
         <w:rPr>
           <w:rFonts w:ascii="Arial" w:hAnsi="Arial" w:cs="Arial"/>
         </w:rPr>
-        <w:t>. O jogo propõe a inserção do jogador em diferentes períodos históricos, permitindo a vivência de acontecimentos, culturas e conflitos presentes na formação do Brasil. Como resultado, espera-se contribuir para a ampliação do interesse pela História, facilitar a fixação dos conteúdos estudados e promover uma aprendizagem mais dinâmica, crítica e acessível.</w:t>
+        <w:t>narrativa interativa, com foco na valorização dos povos originários, na contextualização histórica e na perspectiva decolonial. O jogo propõe a inserção do jogador em diferentes períodos históricos, permitindo a vivência de acontecimentos, culturas e conflitos presentes na formação do Brasil. Como resultado, espera-se contribuir para a ampliação do interesse pela História, facilitar a fixação dos conteúdos estudados e promover uma aprendizagem mais dinâmica, crítica e acessível.</w:t>
       </w:r>
     </w:p>
     <w:p>
@@ -844,35 +840,7 @@
         <w:rPr>
           <w:rFonts w:ascii="Arial" w:hAnsi="Arial" w:cs="Arial"/>
         </w:rPr>
-        <w:t xml:space="preserve">: jogo educativo; história do Brasil; povos originários; </w:t>
-      </w:r>
-      <w:proofErr w:type="spellStart"/>
-      <w:r>
-        <w:rPr>
-          <w:rFonts w:ascii="Arial" w:hAnsi="Arial" w:cs="Arial"/>
-        </w:rPr>
-        <w:t>gamificação</w:t>
-      </w:r>
-      <w:proofErr w:type="spellEnd"/>
-      <w:r>
-        <w:rPr>
-          <w:rFonts w:ascii="Arial" w:hAnsi="Arial" w:cs="Arial"/>
-        </w:rPr>
-        <w:t xml:space="preserve">; </w:t>
-      </w:r>
-      <w:proofErr w:type="spellStart"/>
-      <w:r>
-        <w:rPr>
-          <w:rFonts w:ascii="Arial" w:hAnsi="Arial" w:cs="Arial"/>
-        </w:rPr>
-        <w:t>decolonialidade</w:t>
-      </w:r>
-      <w:proofErr w:type="spellEnd"/>
-      <w:r>
-        <w:rPr>
-          <w:rFonts w:ascii="Arial" w:hAnsi="Arial" w:cs="Arial"/>
-        </w:rPr>
-        <w:t>; aprendizagem imersiva.</w:t>
+        <w:t>: jogo educativo; história do Brasil; povos originários; gamificação; decolonialidade; aprendizagem imersiva.</w:t>
       </w:r>
     </w:p>
     <w:p>
@@ -903,80 +871,32 @@
           <w:rFonts w:ascii="Arial" w:hAnsi="Arial" w:cs="Arial"/>
           <w:lang w:val="en-US"/>
         </w:rPr>
-        <w:t xml:space="preserve">The present work presents the development of the </w:t>
-      </w:r>
-      <w:proofErr w:type="spellStart"/>
-      <w:r>
+        <w:t>The present work presents the development of the Historiando project, an educational game focused on teaching Pre-Colonial and Colonial Brazilian History through a ludic and immersive approach. The project aims to assist elementary and high school students in understanding Brazilian historical processes by using narrative interaction and the player’s active participation as learning tools. The adopted methodology is based on historiographical research, references on gamification, and interactive narrative construction, focusing on the appreciation of Indigenous peoples, historical contextualization, and a decolonial perspective. The game proposes the insertion of the player into different historical periods, allowing the experience of events, cultures, and conflicts related to the formation of Brazil. As a result, the project is expected to contribute to increasing interest in History, facilitating content retention, and promoting a more dynamic, critical, and accessible learning process.</w:t>
+      </w:r>
+    </w:p>
+    <w:p>
+      <w:pPr>
+        <w:pStyle w:val="NormalWeb"/>
+        <w:jc w:val="both"/>
         <w:rPr>
           <w:rFonts w:ascii="Arial" w:hAnsi="Arial" w:cs="Arial"/>
           <w:lang w:val="en-US"/>
         </w:rPr>
-        <w:t>Historiando</w:t>
-      </w:r>
-      <w:proofErr w:type="spellEnd"/>
+      </w:pPr>
+      <w:r>
+        <w:rPr>
+          <w:rFonts w:ascii="Arial" w:hAnsi="Arial" w:cs="Arial"/>
+          <w:b/>
+          <w:lang w:val="en-US"/>
+        </w:rPr>
+        <w:t>Keywords</w:t>
+      </w:r>
       <w:r>
         <w:rPr>
           <w:rFonts w:ascii="Arial" w:hAnsi="Arial" w:cs="Arial"/>
           <w:lang w:val="en-US"/>
         </w:rPr>
-        <w:t xml:space="preserve"> project, an educational game focused on teaching Pre-Colonial and Colonial Brazilian History through a ludic and immersive approach. The project aims to assist elementary and high school students in understanding Brazilian historical processes by using narrative interaction and the player’s active participation as learning tools. The adopted methodology is based on historiographical research, references on gamification, and interactive narrative construction, focusing on the appreciation of Indigenous peoples, historical contextualization, and a </w:t>
-      </w:r>
-      <w:proofErr w:type="spellStart"/>
-      <w:r>
-        <w:rPr>
-          <w:rFonts w:ascii="Arial" w:hAnsi="Arial" w:cs="Arial"/>
-          <w:lang w:val="en-US"/>
-        </w:rPr>
-        <w:t>decolonial</w:t>
-      </w:r>
-      <w:proofErr w:type="spellEnd"/>
-      <w:r>
-        <w:rPr>
-          <w:rFonts w:ascii="Arial" w:hAnsi="Arial" w:cs="Arial"/>
-          <w:lang w:val="en-US"/>
-        </w:rPr>
-        <w:t xml:space="preserve"> perspective. The game proposes the insertion of the player into different historical periods, allowing the experience of events, cultures, and conflicts related to the formation of Brazil. As a result, the project is expected to contribute to increasing interest in History, facilitating content retention, and promoting a more dynamic, critical, and accessible learning process.</w:t>
-      </w:r>
-    </w:p>
-    <w:p>
-      <w:pPr>
-        <w:pStyle w:val="NormalWeb"/>
-        <w:jc w:val="both"/>
-        <w:rPr>
-          <w:rFonts w:ascii="Arial" w:hAnsi="Arial" w:cs="Arial"/>
-          <w:lang w:val="en-US"/>
-        </w:rPr>
-      </w:pPr>
-      <w:r>
-        <w:rPr>
-          <w:rFonts w:ascii="Arial" w:hAnsi="Arial" w:cs="Arial"/>
-          <w:b/>
-          <w:lang w:val="en-US"/>
-        </w:rPr>
-        <w:t>Keywords</w:t>
-      </w:r>
-      <w:r>
-        <w:rPr>
-          <w:rFonts w:ascii="Arial" w:hAnsi="Arial" w:cs="Arial"/>
-          <w:lang w:val="en-US"/>
-        </w:rPr>
-        <w:t xml:space="preserve">: educational game; History of Brazil; Indigenous peoples; gamification; </w:t>
-      </w:r>
-      <w:proofErr w:type="spellStart"/>
-      <w:r>
-        <w:rPr>
-          <w:rFonts w:ascii="Arial" w:hAnsi="Arial" w:cs="Arial"/>
-          <w:lang w:val="en-US"/>
-        </w:rPr>
-        <w:t>decoloniality</w:t>
-      </w:r>
-      <w:proofErr w:type="spellEnd"/>
-      <w:r>
-        <w:rPr>
-          <w:rFonts w:ascii="Arial" w:hAnsi="Arial" w:cs="Arial"/>
-          <w:lang w:val="en-US"/>
-        </w:rPr>
-        <w:t>; immersive learning.</w:t>
+        <w:t>: educational game; History of Brazil; Indigenous peoples; gamification; decoloniality; immersive learning.</w:t>
       </w:r>
     </w:p>
     <w:p>
@@ -1341,10 +1261,9 @@
       <w:pPr>
         <w:pStyle w:val="Texto-Resumo"/>
         <w:spacing w:after="0" w:line="360" w:lineRule="auto"/>
-        <w:jc w:val="left"/>
-      </w:pPr>
-      <w:r>
-        <w:t>Segundo o historiador Américo Villela, “um pouco d</w:t>
+      </w:pPr>
+      <w:r>
+        <w:t>Segundo o historiador Américo Villela, um pouco d</w:t>
       </w:r>
       <w:r>
         <w:t xml:space="preserve">o papel da disciplina </w:t>
@@ -1365,23 +1284,19 @@
         <w:t xml:space="preserve">formação dessa realidade </w:t>
       </w:r>
       <w:r>
-        <w:t>social. ”</w:t>
-      </w:r>
-      <w:r>
-        <w:t xml:space="preserve"> </w:t>
-      </w:r>
-      <w:r>
-        <w:t>Desse modo, o entendimento acerca de assuntos históricos torna-se essencial para a transformação social, uma vez que ela é alcançada por meio da compreensão dos mecanismos que conduzem a determinadas situações. A partir dessa compreensão da dinâmica social e da evolução histórica, é possível estabelecer medidas que contribuam para a construção de um futuro diferente.</w:t>
-      </w:r>
-      <w:r>
-        <w:t xml:space="preserve"> </w:t>
-      </w:r>
-    </w:p>
-    <w:p>
-      <w:pPr>
-        <w:pStyle w:val="Texto-Resumo"/>
-        <w:spacing w:after="0" w:line="360" w:lineRule="auto"/>
-        <w:jc w:val="left"/>
+        <w:t xml:space="preserve">social. </w:t>
+      </w:r>
+      <w:r>
+        <w:t xml:space="preserve">(informação verbal) ¹. </w:t>
+      </w:r>
+      <w:r>
+        <w:t xml:space="preserve">Desse modo, o entendimento acerca de assuntos históricos torna-se essencial para a transformação social, uma vez que ela é alcançada por meio da compreensão dos mecanismos que conduzem a determinadas situações. A partir dessa compreensão da dinâmica social e da evolução histórica, é possível estabelecer medidas que contribuam para a construção de um futuro diferente. </w:t>
+      </w:r>
+    </w:p>
+    <w:p>
+      <w:pPr>
+        <w:pStyle w:val="Texto-Resumo"/>
+        <w:spacing w:after="0" w:line="360" w:lineRule="auto"/>
         <w:rPr>
           <w:rFonts w:cs="Arial"/>
           <w:snapToGrid/>
@@ -1412,16 +1327,9 @@
       <w:pPr>
         <w:pStyle w:val="Texto-Resumo"/>
         <w:spacing w:after="0" w:line="360" w:lineRule="auto"/>
-        <w:jc w:val="left"/>
-      </w:pPr>
-      <w:r>
-        <w:t>Sendo assim, este Trabalho de Conclusão de Curso (TCC) dedica-se ao desenvolvimento de um jogo educativo que auxilie</w:t>
-      </w:r>
-      <w:r>
-        <w:t xml:space="preserve"> estudantes</w:t>
-      </w:r>
-      <w:r>
-        <w:t xml:space="preserve"> na assimilação de conteúdos históricos, especificamente sobre os períodos Pré-Colonial e Colonial do Brasil, utilizando uma abordagem lúdica e imersiva.</w:t>
+      </w:pPr>
+      <w:r>
+        <w:t>Sendo assim, este Trabalho de Conclusão de Curso (TCC) dedica-se ao desenvolvimento de um jogo educativo que auxilie estudantes na assimilação de conteúdos históricos, especificamente sobre os períodos Pré-Colonial e Colonial do Brasil, utilizando uma abordagem lúdica e imersiva.</w:t>
       </w:r>
     </w:p>
     <w:p>
@@ -1471,35 +1379,71 @@
         <w:pStyle w:val="Texto-Resumo"/>
         <w:spacing w:after="0" w:line="360" w:lineRule="auto"/>
         <w:jc w:val="left"/>
-      </w:pPr>
-    </w:p>
-    <w:p>
-      <w:pPr>
-        <w:pStyle w:val="Texto-Resumo"/>
-        <w:spacing w:after="0" w:line="360" w:lineRule="auto"/>
-        <w:jc w:val="left"/>
-      </w:pPr>
-    </w:p>
-    <w:p>
-      <w:pPr>
-        <w:pStyle w:val="Texto-Resumo"/>
-        <w:spacing w:after="0" w:line="360" w:lineRule="auto"/>
-        <w:jc w:val="left"/>
-      </w:pPr>
-    </w:p>
-    <w:p>
-      <w:pPr>
-        <w:pStyle w:val="Texto-Resumo"/>
-        <w:spacing w:after="0" w:line="360" w:lineRule="auto"/>
-        <w:jc w:val="left"/>
-        <w:rPr>
-          <w:b/>
-        </w:rPr>
-      </w:pPr>
-      <w:r>
-        <w:rPr>
-          <w:b/>
-        </w:rPr>
+        <w:rPr>
+          <w:b/>
+        </w:rPr>
+      </w:pPr>
+    </w:p>
+    <w:p>
+      <w:pPr>
+        <w:spacing w:before="120" w:after="120" w:line="360" w:lineRule="auto"/>
+        <w:rPr>
+          <w:bCs/>
+          <w:szCs w:val="24"/>
+        </w:rPr>
+      </w:pPr>
+      <w:r>
+        <w:rPr>
+          <w:bCs/>
+          <w:szCs w:val="24"/>
+        </w:rPr>
+        <w:t>É notado no ambiente escolar e social uma taxa significativa de pessoas que tem dificuldade ou desinteresse na história do Brasil pré-colonial e colonial, sendo que, como momento de formação do país, ela é um ponto essencial para entender aspectos da sociedade brasileira, como: o início do seu desenvolvimento étnico, o qual se deu com os povos originários, europeus, em sua maioria portugueses, e povos africanos. Estes contribuíram para a construção do Brasil como país mais miscigenado do mundo. E deixaram como legado seus costumes e tradições, por exemplo o idioma (língua portuguesa), o qual possui traços dos três grupos</w:t>
+      </w:r>
+      <w:r>
+        <w:rPr>
+          <w:bCs/>
+          <w:szCs w:val="24"/>
+        </w:rPr>
+        <w:t>.</w:t>
+      </w:r>
+    </w:p>
+    <w:p>
+      <w:pPr>
+        <w:spacing w:before="120" w:after="120" w:line="360" w:lineRule="auto"/>
+        <w:rPr>
+          <w:bCs/>
+          <w:szCs w:val="24"/>
+        </w:rPr>
+      </w:pPr>
+    </w:p>
+    <w:p>
+      <w:pPr>
+        <w:pStyle w:val="Texto-Resumo"/>
+        <w:spacing w:after="0" w:line="360" w:lineRule="auto"/>
+        <w:jc w:val="left"/>
+      </w:pPr>
+    </w:p>
+    <w:p>
+      <w:pPr>
+        <w:pStyle w:val="Texto-Resumo"/>
+        <w:spacing w:after="0" w:line="360" w:lineRule="auto"/>
+        <w:jc w:val="left"/>
+      </w:pPr>
+    </w:p>
+    <w:p>
+      <w:pPr>
+        <w:pStyle w:val="Texto-Resumo"/>
+        <w:spacing w:after="0" w:line="360" w:lineRule="auto"/>
+        <w:jc w:val="left"/>
+        <w:rPr>
+          <w:b/>
+        </w:rPr>
+      </w:pPr>
+      <w:r>
+        <w:rPr>
+          <w:b/>
+        </w:rPr>
+        <w:lastRenderedPageBreak/>
         <w:t xml:space="preserve">1.2 </w:t>
       </w:r>
       <w:r>
@@ -1572,6 +1516,42 @@
         <w:pStyle w:val="Texto-Resumo"/>
         <w:spacing w:after="0" w:line="360" w:lineRule="auto"/>
         <w:jc w:val="left"/>
+        <w:rPr>
+          <w:b/>
+        </w:rPr>
+      </w:pPr>
+    </w:p>
+    <w:p>
+      <w:pPr>
+        <w:spacing w:before="120" w:after="120" w:line="360" w:lineRule="auto"/>
+        <w:rPr>
+          <w:rFonts w:cs="Arial"/>
+        </w:rPr>
+      </w:pPr>
+      <w:r>
+        <w:rPr>
+          <w:rFonts w:cs="Arial"/>
+        </w:rPr>
+        <w:t>Por meio da aplicação de um questionário</w:t>
+      </w:r>
+      <w:r>
+        <w:rPr>
+          <w:rFonts w:cs="Arial"/>
+        </w:rPr>
+        <w:t>, em 2025,</w:t>
+      </w:r>
+      <w:r>
+        <w:rPr>
+          <w:rFonts w:cs="Arial"/>
+        </w:rPr>
+        <w:t xml:space="preserve"> aos estudantes da escola Etec Bento Quirino, observou-se um desinteresse significativo pelos conteúdos abordados nas disciplinas de História. Os estudantes relataram falta de interesse pelo tema, o que pode estar relacionado à forma limitada como os conteúdos são apresentados, bem como as técnicas de ensino utilizadas no processo de aprendizagem. Mesmo entre os estudantes que demonstram interesse pela disciplina, são mencionadas dificuldades em aprender o conteúdo devido à metodologia adotada. Considerando que os jogos sérios – jogos desenvolvidos com fins educacionais – têm como proposta ensinar por meio da jogabilidade, este trabalho propõe o desenvolvimento de um jogo de aventura como forma de complementar o método de ensino em sala de aula, buscando transmitir o conhecimento por meio de diferentes formas de comunicação.</w:t>
+      </w:r>
+    </w:p>
+    <w:p>
+      <w:pPr>
+        <w:pStyle w:val="Texto-Resumo"/>
+        <w:spacing w:after="0" w:line="360" w:lineRule="auto"/>
+        <w:jc w:val="left"/>
       </w:pPr>
     </w:p>
     <w:p>
@@ -1728,8 +1708,6 @@
         <w:spacing w:after="0" w:line="360" w:lineRule="auto"/>
         <w:jc w:val="left"/>
       </w:pPr>
-      <w:bookmarkStart w:id="0" w:name="_GoBack"/>
-      <w:bookmarkEnd w:id="0"/>
     </w:p>
     <w:p>
       <w:pPr>
@@ -1756,6 +1734,157 @@
         </w:rPr>
         <w:t>Metodologia</w:t>
       </w:r>
+    </w:p>
+    <w:p>
+      <w:pPr>
+        <w:pStyle w:val="Texto-Resumo"/>
+        <w:spacing w:after="0" w:line="360" w:lineRule="auto"/>
+        <w:jc w:val="left"/>
+        <w:rPr>
+          <w:b/>
+        </w:rPr>
+      </w:pPr>
+    </w:p>
+    <w:p>
+      <w:pPr>
+        <w:spacing w:after="120" w:line="360" w:lineRule="auto"/>
+        <w:rPr>
+          <w:rFonts w:cs="Arial"/>
+        </w:rPr>
+      </w:pPr>
+      <w:r>
+        <w:rPr>
+          <w:rFonts w:cs="Arial"/>
+        </w:rPr>
+        <w:t xml:space="preserve">Em relação à construção da narrativa do jogo de aventura, será realizado um levantamento de conteúdos da História do Brasil pré-colonial e colonial, abordados na disciplina de História do </w:t>
+      </w:r>
+      <w:r>
+        <w:rPr>
+          <w:rFonts w:cs="Arial"/>
+        </w:rPr>
+        <w:t>E</w:t>
+      </w:r>
+      <w:r>
+        <w:rPr>
+          <w:rFonts w:cs="Arial"/>
+        </w:rPr>
+        <w:t xml:space="preserve">nsino </w:t>
+      </w:r>
+      <w:r>
+        <w:rPr>
+          <w:rFonts w:cs="Arial"/>
+        </w:rPr>
+        <w:t>M</w:t>
+      </w:r>
+      <w:r>
+        <w:rPr>
+          <w:rFonts w:cs="Arial"/>
+        </w:rPr>
+        <w:t xml:space="preserve">édio. </w:t>
+      </w:r>
+      <w:r>
+        <w:rPr>
+          <w:rFonts w:cs="Arial"/>
+        </w:rPr>
+        <w:t>Desta forma, p</w:t>
+      </w:r>
+      <w:r>
+        <w:rPr>
+          <w:rFonts w:cs="Arial"/>
+        </w:rPr>
+        <w:t>ara que o jogador avance</w:t>
+      </w:r>
+      <w:r>
+        <w:rPr>
+          <w:rFonts w:cs="Arial"/>
+        </w:rPr>
+        <w:t xml:space="preserve"> de fase</w:t>
+      </w:r>
+      <w:r>
+        <w:rPr>
+          <w:rFonts w:cs="Arial"/>
+        </w:rPr>
+        <w:t>, será necessário superar níveis de dificuldade, além de realizar atividades e responder a questões aplicadas nas fases bônus do jogo. Além dis</w:t>
+      </w:r>
+      <w:r>
+        <w:rPr>
+          <w:rFonts w:cs="Arial"/>
+        </w:rPr>
+        <w:t>t</w:t>
+      </w:r>
+      <w:r>
+        <w:rPr>
+          <w:rFonts w:cs="Arial"/>
+        </w:rPr>
+        <w:t xml:space="preserve">o, será </w:t>
+      </w:r>
+      <w:r>
+        <w:rPr>
+          <w:rFonts w:cs="Arial"/>
+        </w:rPr>
+        <w:lastRenderedPageBreak/>
+        <w:t xml:space="preserve">implementado um sistema de conquistas, </w:t>
+      </w:r>
+      <w:r>
+        <w:rPr>
+          <w:rFonts w:cs="Arial"/>
+        </w:rPr>
+        <w:t>em que</w:t>
+      </w:r>
+      <w:r>
+        <w:rPr>
+          <w:rFonts w:cs="Arial"/>
+        </w:rPr>
+        <w:t xml:space="preserve"> o jogador deverá cumprir as atividades propostas dentro de um determinado período</w:t>
+      </w:r>
+      <w:r>
+        <w:rPr>
+          <w:rFonts w:cs="Arial"/>
+        </w:rPr>
+        <w:t>.</w:t>
+      </w:r>
+      <w:r>
+        <w:rPr>
+          <w:rFonts w:cs="Arial"/>
+        </w:rPr>
+        <w:t xml:space="preserve"> </w:t>
+      </w:r>
+      <w:r>
+        <w:rPr>
+          <w:rFonts w:cs="Arial"/>
+        </w:rPr>
+        <w:t xml:space="preserve">Já em relação </w:t>
+      </w:r>
+      <w:r>
+        <w:rPr>
+          <w:rFonts w:cs="Arial"/>
+        </w:rPr>
+        <w:t xml:space="preserve">à parte técnica do jogo, os personagens serão desenvolvidos por meio de ferramentas de renderização de objetos 3D, como o Blender, e os mecanismos do jogo serão desenvolvidos utilizando a </w:t>
+      </w:r>
+      <w:proofErr w:type="spellStart"/>
+      <w:r>
+        <w:rPr>
+          <w:rFonts w:cs="Arial"/>
+        </w:rPr>
+        <w:t>engine</w:t>
+      </w:r>
+      <w:proofErr w:type="spellEnd"/>
+      <w:r>
+        <w:rPr>
+          <w:rFonts w:cs="Arial"/>
+        </w:rPr>
+        <w:t xml:space="preserve"> Godot 4.</w:t>
+      </w:r>
+    </w:p>
+    <w:p>
+      <w:pPr>
+        <w:pStyle w:val="Texto-Resumo"/>
+        <w:spacing w:after="0" w:line="360" w:lineRule="auto"/>
+        <w:jc w:val="left"/>
+        <w:rPr>
+          <w:b/>
+        </w:rPr>
+      </w:pPr>
     </w:p>
     <w:p>
       <w:pPr>
@@ -2623,7 +2752,7 @@
 </file>
 
 <file path=word/endnotes.xml><?xml version="1.0" encoding="utf-8"?>
-<w:endnotes xmlns:wpc="http://schemas.microsoft.com/office/word/2010/wordprocessingCanvas" xmlns:cx="http://schemas.microsoft.com/office/drawing/2014/chartex" xmlns:cx1="http://schemas.microsoft.com/office/drawing/2015/9/8/chartex" xmlns:mc="http://schemas.openxmlformats.org/markup-compatibility/2006" xmlns:o="urn:schemas-microsoft-com:office:office" xmlns:r="http://schemas.openxmlformats.org/officeDocument/2006/relationships" xmlns:m="http://schemas.openxmlformats.org/officeDocument/2006/math" xmlns:v="urn:schemas-microsoft-com:vml" xmlns:wp14="http://schemas.microsoft.com/office/word/2010/wordprocessingDrawing" xmlns:wp="http://schemas.openxmlformats.org/drawingml/2006/wordprocessingDrawing" xmlns:w10="urn:schemas-microsoft-com:office:word" xmlns:w="http://schemas.openxmlformats.org/wordprocessingml/2006/main" xmlns:w14="http://schemas.microsoft.com/office/word/2010/wordml" xmlns:w15="http://schemas.microsoft.com/office/word/2012/wordml" xmlns:w16se="http://schemas.microsoft.com/office/word/2015/wordml/symex" xmlns:wpg="http://schemas.microsoft.com/office/word/2010/wordprocessingGroup" xmlns:wpi="http://schemas.microsoft.com/office/word/2010/wordprocessingInk" xmlns:wne="http://schemas.microsoft.com/office/word/2006/wordml" xmlns:wps="http://schemas.microsoft.com/office/word/2010/wordprocessingShape" mc:Ignorable="w14 w15 w16se wp14">
+<w:endnotes xmlns:wpc="http://schemas.microsoft.com/office/word/2010/wordprocessingCanvas" xmlns:cx="http://schemas.microsoft.com/office/drawing/2014/chartex" xmlns:cx1="http://schemas.microsoft.com/office/drawing/2015/9/8/chartex" xmlns:cx2="http://schemas.microsoft.com/office/drawing/2015/10/21/chartex" xmlns:cx3="http://schemas.microsoft.com/office/drawing/2016/5/9/chartex" xmlns:cx4="http://schemas.microsoft.com/office/drawing/2016/5/10/chartex" xmlns:cx5="http://schemas.microsoft.com/office/drawing/2016/5/11/chartex" xmlns:cx6="http://schemas.microsoft.com/office/drawing/2016/5/12/chartex" xmlns:cx7="http://schemas.microsoft.com/office/drawing/2016/5/13/chartex" xmlns:cx8="http://schemas.microsoft.com/office/drawing/2016/5/14/chartex" xmlns:mc="http://schemas.openxmlformats.org/markup-compatibility/2006" xmlns:aink="http://schemas.microsoft.com/office/drawing/2016/ink" xmlns:am3d="http://schemas.microsoft.com/office/drawing/2017/model3d" xmlns:o="urn:schemas-microsoft-com:office:office" xmlns:oel="http://schemas.microsoft.com/office/2019/extlst" xmlns:r="http://schemas.openxmlformats.org/officeDocument/2006/relationships" xmlns:m="http://schemas.openxmlformats.org/officeDocument/2006/math" xmlns:v="urn:schemas-microsoft-com:vml" xmlns:wp14="http://schemas.microsoft.com/office/word/2010/wordprocessingDrawing" xmlns:wp="http://schemas.openxmlformats.org/drawingml/2006/wordprocessingDrawing" xmlns:w10="urn:schemas-microsoft-com:office:word" xmlns:w="http://schemas.openxmlformats.org/wordprocessingml/2006/main" xmlns:w14="http://schemas.microsoft.com/office/word/2010/wordml" xmlns:w15="http://schemas.microsoft.com/office/word/2012/wordml" xmlns:w16cex="http://schemas.microsoft.com/office/word/2018/wordml/cex" xmlns:w16cid="http://schemas.microsoft.com/office/word/2016/wordml/cid" xmlns:w16="http://schemas.microsoft.com/office/word/2018/wordml" xmlns:w16du="http://schemas.microsoft.com/office/word/2023/wordml/word16du" xmlns:w16sdtdh="http://schemas.microsoft.com/office/word/2020/wordml/sdtdatahash" xmlns:w16sdtfl="http://schemas.microsoft.com/office/word/2024/wordml/sdtformatlock" xmlns:w16se="http://schemas.microsoft.com/office/word/2015/wordml/symex" xmlns:wpg="http://schemas.microsoft.com/office/word/2010/wordprocessingGroup" xmlns:wpi="http://schemas.microsoft.com/office/word/2010/wordprocessingInk" xmlns:wne="http://schemas.microsoft.com/office/word/2006/wordml" xmlns:wps="http://schemas.microsoft.com/office/word/2010/wordprocessingShape" mc:Ignorable="w14 w15 w16se w16cid w16 w16cex w16sdtdh w16sdtfl w16du wp14">
   <w:endnote w:type="separator" w:id="-1">
     <w:p>
       <w:r>
@@ -2642,7 +2771,7 @@
 </file>
 
 <file path=word/footer1.xml><?xml version="1.0" encoding="utf-8"?>
-<w:ftr xmlns:wpc="http://schemas.microsoft.com/office/word/2010/wordprocessingCanvas" xmlns:cx="http://schemas.microsoft.com/office/drawing/2014/chartex" xmlns:cx1="http://schemas.microsoft.com/office/drawing/2015/9/8/chartex" xmlns:mc="http://schemas.openxmlformats.org/markup-compatibility/2006" xmlns:o="urn:schemas-microsoft-com:office:office" xmlns:r="http://schemas.openxmlformats.org/officeDocument/2006/relationships" xmlns:m="http://schemas.openxmlformats.org/officeDocument/2006/math" xmlns:v="urn:schemas-microsoft-com:vml" xmlns:wp14="http://schemas.microsoft.com/office/word/2010/wordprocessingDrawing" xmlns:wp="http://schemas.openxmlformats.org/drawingml/2006/wordprocessingDrawing" xmlns:w10="urn:schemas-microsoft-com:office:word" xmlns:w="http://schemas.openxmlformats.org/wordprocessingml/2006/main" xmlns:w14="http://schemas.microsoft.com/office/word/2010/wordml" xmlns:w15="http://schemas.microsoft.com/office/word/2012/wordml" xmlns:w16se="http://schemas.microsoft.com/office/word/2015/wordml/symex" xmlns:wpg="http://schemas.microsoft.com/office/word/2010/wordprocessingGroup" xmlns:wpi="http://schemas.microsoft.com/office/word/2010/wordprocessingInk" xmlns:wne="http://schemas.microsoft.com/office/word/2006/wordml" xmlns:wps="http://schemas.microsoft.com/office/word/2010/wordprocessingShape" mc:Ignorable="w14 w15 w16se wp14">
+<w:ftr xmlns:wpc="http://schemas.microsoft.com/office/word/2010/wordprocessingCanvas" xmlns:cx="http://schemas.microsoft.com/office/drawing/2014/chartex" xmlns:cx1="http://schemas.microsoft.com/office/drawing/2015/9/8/chartex" xmlns:cx2="http://schemas.microsoft.com/office/drawing/2015/10/21/chartex" xmlns:cx3="http://schemas.microsoft.com/office/drawing/2016/5/9/chartex" xmlns:cx4="http://schemas.microsoft.com/office/drawing/2016/5/10/chartex" xmlns:cx5="http://schemas.microsoft.com/office/drawing/2016/5/11/chartex" xmlns:cx6="http://schemas.microsoft.com/office/drawing/2016/5/12/chartex" xmlns:cx7="http://schemas.microsoft.com/office/drawing/2016/5/13/chartex" xmlns:cx8="http://schemas.microsoft.com/office/drawing/2016/5/14/chartex" xmlns:mc="http://schemas.openxmlformats.org/markup-compatibility/2006" xmlns:aink="http://schemas.microsoft.com/office/drawing/2016/ink" xmlns:am3d="http://schemas.microsoft.com/office/drawing/2017/model3d" xmlns:o="urn:schemas-microsoft-com:office:office" xmlns:oel="http://schemas.microsoft.com/office/2019/extlst" xmlns:r="http://schemas.openxmlformats.org/officeDocument/2006/relationships" xmlns:m="http://schemas.openxmlformats.org/officeDocument/2006/math" xmlns:v="urn:schemas-microsoft-com:vml" xmlns:wp14="http://schemas.microsoft.com/office/word/2010/wordprocessingDrawing" xmlns:wp="http://schemas.openxmlformats.org/drawingml/2006/wordprocessingDrawing" xmlns:w10="urn:schemas-microsoft-com:office:word" xmlns:w="http://schemas.openxmlformats.org/wordprocessingml/2006/main" xmlns:w14="http://schemas.microsoft.com/office/word/2010/wordml" xmlns:w15="http://schemas.microsoft.com/office/word/2012/wordml" xmlns:w16cex="http://schemas.microsoft.com/office/word/2018/wordml/cex" xmlns:w16cid="http://schemas.microsoft.com/office/word/2016/wordml/cid" xmlns:w16="http://schemas.microsoft.com/office/word/2018/wordml" xmlns:w16du="http://schemas.microsoft.com/office/word/2023/wordml/word16du" xmlns:w16sdtdh="http://schemas.microsoft.com/office/word/2020/wordml/sdtdatahash" xmlns:w16sdtfl="http://schemas.microsoft.com/office/word/2024/wordml/sdtformatlock" xmlns:w16se="http://schemas.microsoft.com/office/word/2015/wordml/symex" xmlns:wpg="http://schemas.microsoft.com/office/word/2010/wordprocessingGroup" xmlns:wpi="http://schemas.microsoft.com/office/word/2010/wordprocessingInk" xmlns:wne="http://schemas.microsoft.com/office/word/2006/wordml" xmlns:wps="http://schemas.microsoft.com/office/word/2010/wordprocessingShape" mc:Ignorable="w14 w15 w16se w16cid w16 w16cex w16sdtdh w16sdtfl w16du wp14">
   <w:p>
     <w:pPr>
       <w:pStyle w:val="Rodap"/>
@@ -2716,7 +2845,7 @@
 </file>
 
 <file path=word/footnotes.xml><?xml version="1.0" encoding="utf-8"?>
-<w:footnotes xmlns:wpc="http://schemas.microsoft.com/office/word/2010/wordprocessingCanvas" xmlns:cx="http://schemas.microsoft.com/office/drawing/2014/chartex" xmlns:cx1="http://schemas.microsoft.com/office/drawing/2015/9/8/chartex" xmlns:mc="http://schemas.openxmlformats.org/markup-compatibility/2006" xmlns:o="urn:schemas-microsoft-com:office:office" xmlns:r="http://schemas.openxmlformats.org/officeDocument/2006/relationships" xmlns:m="http://schemas.openxmlformats.org/officeDocument/2006/math" xmlns:v="urn:schemas-microsoft-com:vml" xmlns:wp14="http://schemas.microsoft.com/office/word/2010/wordprocessingDrawing" xmlns:wp="http://schemas.openxmlformats.org/drawingml/2006/wordprocessingDrawing" xmlns:w10="urn:schemas-microsoft-com:office:word" xmlns:w="http://schemas.openxmlformats.org/wordprocessingml/2006/main" xmlns:w14="http://schemas.microsoft.com/office/word/2010/wordml" xmlns:w15="http://schemas.microsoft.com/office/word/2012/wordml" xmlns:w16se="http://schemas.microsoft.com/office/word/2015/wordml/symex" xmlns:wpg="http://schemas.microsoft.com/office/word/2010/wordprocessingGroup" xmlns:wpi="http://schemas.microsoft.com/office/word/2010/wordprocessingInk" xmlns:wne="http://schemas.microsoft.com/office/word/2006/wordml" xmlns:wps="http://schemas.microsoft.com/office/word/2010/wordprocessingShape" mc:Ignorable="w14 w15 w16se wp14">
+<w:footnotes xmlns:wpc="http://schemas.microsoft.com/office/word/2010/wordprocessingCanvas" xmlns:cx="http://schemas.microsoft.com/office/drawing/2014/chartex" xmlns:cx1="http://schemas.microsoft.com/office/drawing/2015/9/8/chartex" xmlns:cx2="http://schemas.microsoft.com/office/drawing/2015/10/21/chartex" xmlns:cx3="http://schemas.microsoft.com/office/drawing/2016/5/9/chartex" xmlns:cx4="http://schemas.microsoft.com/office/drawing/2016/5/10/chartex" xmlns:cx5="http://schemas.microsoft.com/office/drawing/2016/5/11/chartex" xmlns:cx6="http://schemas.microsoft.com/office/drawing/2016/5/12/chartex" xmlns:cx7="http://schemas.microsoft.com/office/drawing/2016/5/13/chartex" xmlns:cx8="http://schemas.microsoft.com/office/drawing/2016/5/14/chartex" xmlns:mc="http://schemas.openxmlformats.org/markup-compatibility/2006" xmlns:aink="http://schemas.microsoft.com/office/drawing/2016/ink" xmlns:am3d="http://schemas.microsoft.com/office/drawing/2017/model3d" xmlns:o="urn:schemas-microsoft-com:office:office" xmlns:oel="http://schemas.microsoft.com/office/2019/extlst" xmlns:r="http://schemas.openxmlformats.org/officeDocument/2006/relationships" xmlns:m="http://schemas.openxmlformats.org/officeDocument/2006/math" xmlns:v="urn:schemas-microsoft-com:vml" xmlns:wp14="http://schemas.microsoft.com/office/word/2010/wordprocessingDrawing" xmlns:wp="http://schemas.openxmlformats.org/drawingml/2006/wordprocessingDrawing" xmlns:w10="urn:schemas-microsoft-com:office:word" xmlns:w="http://schemas.openxmlformats.org/wordprocessingml/2006/main" xmlns:w14="http://schemas.microsoft.com/office/word/2010/wordml" xmlns:w15="http://schemas.microsoft.com/office/word/2012/wordml" xmlns:w16cex="http://schemas.microsoft.com/office/word/2018/wordml/cex" xmlns:w16cid="http://schemas.microsoft.com/office/word/2016/wordml/cid" xmlns:w16="http://schemas.microsoft.com/office/word/2018/wordml" xmlns:w16du="http://schemas.microsoft.com/office/word/2023/wordml/word16du" xmlns:w16sdtdh="http://schemas.microsoft.com/office/word/2020/wordml/sdtdatahash" xmlns:w16sdtfl="http://schemas.microsoft.com/office/word/2024/wordml/sdtformatlock" xmlns:w16se="http://schemas.microsoft.com/office/word/2015/wordml/symex" xmlns:wpg="http://schemas.microsoft.com/office/word/2010/wordprocessingGroup" xmlns:wpi="http://schemas.microsoft.com/office/word/2010/wordprocessingInk" xmlns:wne="http://schemas.microsoft.com/office/word/2006/wordml" xmlns:wps="http://schemas.microsoft.com/office/word/2010/wordprocessingShape" mc:Ignorable="w14 w15 w16se w16cid w16 w16cex w16sdtdh w16sdtfl w16du wp14">
   <w:footnote w:type="separator" w:id="-1">
     <w:p>
       <w:r>
@@ -2735,7 +2864,7 @@
 </file>
 
 <file path=word/header1.xml><?xml version="1.0" encoding="utf-8"?>
-<w:hdr xmlns:wpc="http://schemas.microsoft.com/office/word/2010/wordprocessingCanvas" xmlns:cx="http://schemas.microsoft.com/office/drawing/2014/chartex" xmlns:cx1="http://schemas.microsoft.com/office/drawing/2015/9/8/chartex" xmlns:mc="http://schemas.openxmlformats.org/markup-compatibility/2006" xmlns:o="urn:schemas-microsoft-com:office:office" xmlns:r="http://schemas.openxmlformats.org/officeDocument/2006/relationships" xmlns:m="http://schemas.openxmlformats.org/officeDocument/2006/math" xmlns:v="urn:schemas-microsoft-com:vml" xmlns:wp14="http://schemas.microsoft.com/office/word/2010/wordprocessingDrawing" xmlns:wp="http://schemas.openxmlformats.org/drawingml/2006/wordprocessingDrawing" xmlns:w10="urn:schemas-microsoft-com:office:word" xmlns:w="http://schemas.openxmlformats.org/wordprocessingml/2006/main" xmlns:w14="http://schemas.microsoft.com/office/word/2010/wordml" xmlns:w15="http://schemas.microsoft.com/office/word/2012/wordml" xmlns:w16se="http://schemas.microsoft.com/office/word/2015/wordml/symex" xmlns:wpg="http://schemas.microsoft.com/office/word/2010/wordprocessingGroup" xmlns:wpi="http://schemas.microsoft.com/office/word/2010/wordprocessingInk" xmlns:wne="http://schemas.microsoft.com/office/word/2006/wordml" xmlns:wps="http://schemas.microsoft.com/office/word/2010/wordprocessingShape" mc:Ignorable="w14 w15 w16se wp14">
+<w:hdr xmlns:wpc="http://schemas.microsoft.com/office/word/2010/wordprocessingCanvas" xmlns:cx="http://schemas.microsoft.com/office/drawing/2014/chartex" xmlns:cx1="http://schemas.microsoft.com/office/drawing/2015/9/8/chartex" xmlns:cx2="http://schemas.microsoft.com/office/drawing/2015/10/21/chartex" xmlns:cx3="http://schemas.microsoft.com/office/drawing/2016/5/9/chartex" xmlns:cx4="http://schemas.microsoft.com/office/drawing/2016/5/10/chartex" xmlns:cx5="http://schemas.microsoft.com/office/drawing/2016/5/11/chartex" xmlns:cx6="http://schemas.microsoft.com/office/drawing/2016/5/12/chartex" xmlns:cx7="http://schemas.microsoft.com/office/drawing/2016/5/13/chartex" xmlns:cx8="http://schemas.microsoft.com/office/drawing/2016/5/14/chartex" xmlns:mc="http://schemas.openxmlformats.org/markup-compatibility/2006" xmlns:aink="http://schemas.microsoft.com/office/drawing/2016/ink" xmlns:am3d="http://schemas.microsoft.com/office/drawing/2017/model3d" xmlns:o="urn:schemas-microsoft-com:office:office" xmlns:oel="http://schemas.microsoft.com/office/2019/extlst" xmlns:r="http://schemas.openxmlformats.org/officeDocument/2006/relationships" xmlns:m="http://schemas.openxmlformats.org/officeDocument/2006/math" xmlns:v="urn:schemas-microsoft-com:vml" xmlns:wp14="http://schemas.microsoft.com/office/word/2010/wordprocessingDrawing" xmlns:wp="http://schemas.openxmlformats.org/drawingml/2006/wordprocessingDrawing" xmlns:w10="urn:schemas-microsoft-com:office:word" xmlns:w="http://schemas.openxmlformats.org/wordprocessingml/2006/main" xmlns:w14="http://schemas.microsoft.com/office/word/2010/wordml" xmlns:w15="http://schemas.microsoft.com/office/word/2012/wordml" xmlns:w16cex="http://schemas.microsoft.com/office/word/2018/wordml/cex" xmlns:w16cid="http://schemas.microsoft.com/office/word/2016/wordml/cid" xmlns:w16="http://schemas.microsoft.com/office/word/2018/wordml" xmlns:w16du="http://schemas.microsoft.com/office/word/2023/wordml/word16du" xmlns:w16sdtdh="http://schemas.microsoft.com/office/word/2020/wordml/sdtdatahash" xmlns:w16sdtfl="http://schemas.microsoft.com/office/word/2024/wordml/sdtformatlock" xmlns:w16se="http://schemas.microsoft.com/office/word/2015/wordml/symex" xmlns:wpg="http://schemas.microsoft.com/office/word/2010/wordprocessingGroup" xmlns:wpi="http://schemas.microsoft.com/office/word/2010/wordprocessingInk" xmlns:wne="http://schemas.microsoft.com/office/word/2006/wordml" xmlns:wps="http://schemas.microsoft.com/office/word/2010/wordprocessingShape" mc:Ignorable="w14 w15 w16se w16cid w16 w16cex w16sdtdh w16sdtfl w16du wp14">
   <w:p>
     <w:pPr>
       <w:pStyle w:val="Cabealho"/>
@@ -2746,7 +2875,7 @@
 </file>
 
 <file path=word/header2.xml><?xml version="1.0" encoding="utf-8"?>
-<w:hdr xmlns:wpc="http://schemas.microsoft.com/office/word/2010/wordprocessingCanvas" xmlns:cx="http://schemas.microsoft.com/office/drawing/2014/chartex" xmlns:cx1="http://schemas.microsoft.com/office/drawing/2015/9/8/chartex" xmlns:mc="http://schemas.openxmlformats.org/markup-compatibility/2006" xmlns:o="urn:schemas-microsoft-com:office:office" xmlns:r="http://schemas.openxmlformats.org/officeDocument/2006/relationships" xmlns:m="http://schemas.openxmlformats.org/officeDocument/2006/math" xmlns:v="urn:schemas-microsoft-com:vml" xmlns:wp14="http://schemas.microsoft.com/office/word/2010/wordprocessingDrawing" xmlns:wp="http://schemas.openxmlformats.org/drawingml/2006/wordprocessingDrawing" xmlns:w10="urn:schemas-microsoft-com:office:word" xmlns:w="http://schemas.openxmlformats.org/wordprocessingml/2006/main" xmlns:w14="http://schemas.microsoft.com/office/word/2010/wordml" xmlns:w15="http://schemas.microsoft.com/office/word/2012/wordml" xmlns:w16se="http://schemas.microsoft.com/office/word/2015/wordml/symex" xmlns:wpg="http://schemas.microsoft.com/office/word/2010/wordprocessingGroup" xmlns:wpi="http://schemas.microsoft.com/office/word/2010/wordprocessingInk" xmlns:wne="http://schemas.microsoft.com/office/word/2006/wordml" xmlns:wps="http://schemas.microsoft.com/office/word/2010/wordprocessingShape" mc:Ignorable="w14 w15 w16se wp14">
+<w:hdr xmlns:wpc="http://schemas.microsoft.com/office/word/2010/wordprocessingCanvas" xmlns:cx="http://schemas.microsoft.com/office/drawing/2014/chartex" xmlns:cx1="http://schemas.microsoft.com/office/drawing/2015/9/8/chartex" xmlns:cx2="http://schemas.microsoft.com/office/drawing/2015/10/21/chartex" xmlns:cx3="http://schemas.microsoft.com/office/drawing/2016/5/9/chartex" xmlns:cx4="http://schemas.microsoft.com/office/drawing/2016/5/10/chartex" xmlns:cx5="http://schemas.microsoft.com/office/drawing/2016/5/11/chartex" xmlns:cx6="http://schemas.microsoft.com/office/drawing/2016/5/12/chartex" xmlns:cx7="http://schemas.microsoft.com/office/drawing/2016/5/13/chartex" xmlns:cx8="http://schemas.microsoft.com/office/drawing/2016/5/14/chartex" xmlns:mc="http://schemas.openxmlformats.org/markup-compatibility/2006" xmlns:aink="http://schemas.microsoft.com/office/drawing/2016/ink" xmlns:am3d="http://schemas.microsoft.com/office/drawing/2017/model3d" xmlns:o="urn:schemas-microsoft-com:office:office" xmlns:oel="http://schemas.microsoft.com/office/2019/extlst" xmlns:r="http://schemas.openxmlformats.org/officeDocument/2006/relationships" xmlns:m="http://schemas.openxmlformats.org/officeDocument/2006/math" xmlns:v="urn:schemas-microsoft-com:vml" xmlns:wp14="http://schemas.microsoft.com/office/word/2010/wordprocessingDrawing" xmlns:wp="http://schemas.openxmlformats.org/drawingml/2006/wordprocessingDrawing" xmlns:w10="urn:schemas-microsoft-com:office:word" xmlns:w="http://schemas.openxmlformats.org/wordprocessingml/2006/main" xmlns:w14="http://schemas.microsoft.com/office/word/2010/wordml" xmlns:w15="http://schemas.microsoft.com/office/word/2012/wordml" xmlns:w16cex="http://schemas.microsoft.com/office/word/2018/wordml/cex" xmlns:w16cid="http://schemas.microsoft.com/office/word/2016/wordml/cid" xmlns:w16="http://schemas.microsoft.com/office/word/2018/wordml" xmlns:w16du="http://schemas.microsoft.com/office/word/2023/wordml/word16du" xmlns:w16sdtdh="http://schemas.microsoft.com/office/word/2020/wordml/sdtdatahash" xmlns:w16sdtfl="http://schemas.microsoft.com/office/word/2024/wordml/sdtformatlock" xmlns:w16se="http://schemas.microsoft.com/office/word/2015/wordml/symex" xmlns:wpg="http://schemas.microsoft.com/office/word/2010/wordprocessingGroup" xmlns:wpi="http://schemas.microsoft.com/office/word/2010/wordprocessingInk" xmlns:wne="http://schemas.microsoft.com/office/word/2006/wordml" xmlns:wps="http://schemas.microsoft.com/office/word/2010/wordprocessingShape" mc:Ignorable="w14 w15 w16se w16cid w16 w16cex w16sdtdh w16sdtfl w16du wp14">
   <w:sdt>
     <w:sdtPr>
       <w:id w:val="1684550503"/>
@@ -2755,7 +2884,6 @@
         <w:docPartUnique/>
       </w:docPartObj>
     </w:sdtPr>
-    <w:sdtEndPr/>
     <w:sdtContent>
       <w:p>
         <w:pPr>
@@ -2792,7 +2920,7 @@
 </file>
 
 <file path=word/numbering.xml><?xml version="1.0" encoding="utf-8"?>
-<w:numbering xmlns:wpc="http://schemas.microsoft.com/office/word/2010/wordprocessingCanvas" xmlns:cx="http://schemas.microsoft.com/office/drawing/2014/chartex" xmlns:cx1="http://schemas.microsoft.com/office/drawing/2015/9/8/chartex" xmlns:mc="http://schemas.openxmlformats.org/markup-compatibility/2006" xmlns:o="urn:schemas-microsoft-com:office:office" xmlns:r="http://schemas.openxmlformats.org/officeDocument/2006/relationships" xmlns:m="http://schemas.openxmlformats.org/officeDocument/2006/math" xmlns:v="urn:schemas-microsoft-com:vml" xmlns:wp14="http://schemas.microsoft.com/office/word/2010/wordprocessingDrawing" xmlns:wp="http://schemas.openxmlformats.org/drawingml/2006/wordprocessingDrawing" xmlns:w10="urn:schemas-microsoft-com:office:word" xmlns:w="http://schemas.openxmlformats.org/wordprocessingml/2006/main" xmlns:w14="http://schemas.microsoft.com/office/word/2010/wordml" xmlns:w15="http://schemas.microsoft.com/office/word/2012/wordml" xmlns:w16se="http://schemas.microsoft.com/office/word/2015/wordml/symex" xmlns:wpg="http://schemas.microsoft.com/office/word/2010/wordprocessingGroup" xmlns:wpi="http://schemas.microsoft.com/office/word/2010/wordprocessingInk" xmlns:wne="http://schemas.microsoft.com/office/word/2006/wordml" xmlns:wps="http://schemas.microsoft.com/office/word/2010/wordprocessingShape" mc:Ignorable="w14 w15 w16se wp14">
+<w:numbering xmlns:wpc="http://schemas.microsoft.com/office/word/2010/wordprocessingCanvas" xmlns:cx="http://schemas.microsoft.com/office/drawing/2014/chartex" xmlns:cx1="http://schemas.microsoft.com/office/drawing/2015/9/8/chartex" xmlns:cx2="http://schemas.microsoft.com/office/drawing/2015/10/21/chartex" xmlns:cx3="http://schemas.microsoft.com/office/drawing/2016/5/9/chartex" xmlns:cx4="http://schemas.microsoft.com/office/drawing/2016/5/10/chartex" xmlns:cx5="http://schemas.microsoft.com/office/drawing/2016/5/11/chartex" xmlns:cx6="http://schemas.microsoft.com/office/drawing/2016/5/12/chartex" xmlns:cx7="http://schemas.microsoft.com/office/drawing/2016/5/13/chartex" xmlns:cx8="http://schemas.microsoft.com/office/drawing/2016/5/14/chartex" xmlns:mc="http://schemas.openxmlformats.org/markup-compatibility/2006" xmlns:aink="http://schemas.microsoft.com/office/drawing/2016/ink" xmlns:am3d="http://schemas.microsoft.com/office/drawing/2017/model3d" xmlns:o="urn:schemas-microsoft-com:office:office" xmlns:oel="http://schemas.microsoft.com/office/2019/extlst" xmlns:r="http://schemas.openxmlformats.org/officeDocument/2006/relationships" xmlns:m="http://schemas.openxmlformats.org/officeDocument/2006/math" xmlns:v="urn:schemas-microsoft-com:vml" xmlns:wp14="http://schemas.microsoft.com/office/word/2010/wordprocessingDrawing" xmlns:wp="http://schemas.openxmlformats.org/drawingml/2006/wordprocessingDrawing" xmlns:w10="urn:schemas-microsoft-com:office:word" xmlns:w="http://schemas.openxmlformats.org/wordprocessingml/2006/main" xmlns:w14="http://schemas.microsoft.com/office/word/2010/wordml" xmlns:w15="http://schemas.microsoft.com/office/word/2012/wordml" xmlns:w16cex="http://schemas.microsoft.com/office/word/2018/wordml/cex" xmlns:w16cid="http://schemas.microsoft.com/office/word/2016/wordml/cid" xmlns:w16="http://schemas.microsoft.com/office/word/2018/wordml" xmlns:w16du="http://schemas.microsoft.com/office/word/2023/wordml/word16du" xmlns:w16sdtdh="http://schemas.microsoft.com/office/word/2020/wordml/sdtdatahash" xmlns:w16sdtfl="http://schemas.microsoft.com/office/word/2024/wordml/sdtformatlock" xmlns:w16se="http://schemas.microsoft.com/office/word/2015/wordml/symex" xmlns:wpg="http://schemas.microsoft.com/office/word/2010/wordprocessingGroup" xmlns:wpi="http://schemas.microsoft.com/office/word/2010/wordprocessingInk" xmlns:wne="http://schemas.microsoft.com/office/word/2006/wordml" xmlns:wps="http://schemas.microsoft.com/office/word/2010/wordprocessingShape" mc:Ignorable="w14 w15 w16se w16cid w16 w16cex w16sdtdh w16sdtfl w16du wp14">
   <w:abstractNum w:abstractNumId="0" w15:restartNumberingAfterBreak="0">
     <w:nsid w:val="1E6535D4"/>
     <w:multiLevelType w:val="multilevel"/>
@@ -3265,23 +3393,23 @@
       </w:pPr>
     </w:lvl>
   </w:abstractNum>
-  <w:num w:numId="1">
+  <w:num w:numId="1" w16cid:durableId="1368142790">
     <w:abstractNumId w:val="3"/>
   </w:num>
-  <w:num w:numId="2">
+  <w:num w:numId="2" w16cid:durableId="1832334015">
     <w:abstractNumId w:val="1"/>
   </w:num>
-  <w:num w:numId="3">
+  <w:num w:numId="3" w16cid:durableId="1398934964">
     <w:abstractNumId w:val="0"/>
   </w:num>
-  <w:num w:numId="4">
+  <w:num w:numId="4" w16cid:durableId="970788587">
     <w:abstractNumId w:val="2"/>
   </w:num>
 </w:numbering>
 </file>
 
 <file path=word/styles.xml><?xml version="1.0" encoding="utf-8"?>
-<w:styles xmlns:mc="http://schemas.openxmlformats.org/markup-compatibility/2006" xmlns:r="http://schemas.openxmlformats.org/officeDocument/2006/relationships" xmlns:w="http://schemas.openxmlformats.org/wordprocessingml/2006/main" xmlns:w14="http://schemas.microsoft.com/office/word/2010/wordml" xmlns:w15="http://schemas.microsoft.com/office/word/2012/wordml" xmlns:w16se="http://schemas.microsoft.com/office/word/2015/wordml/symex" mc:Ignorable="w14 w15 w16se">
+<w:styles xmlns:mc="http://schemas.openxmlformats.org/markup-compatibility/2006" xmlns:r="http://schemas.openxmlformats.org/officeDocument/2006/relationships" xmlns:w="http://schemas.openxmlformats.org/wordprocessingml/2006/main" xmlns:w14="http://schemas.microsoft.com/office/word/2010/wordml" xmlns:w15="http://schemas.microsoft.com/office/word/2012/wordml" xmlns:w16cex="http://schemas.microsoft.com/office/word/2018/wordml/cex" xmlns:w16cid="http://schemas.microsoft.com/office/word/2016/wordml/cid" xmlns:w16="http://schemas.microsoft.com/office/word/2018/wordml" xmlns:w16du="http://schemas.microsoft.com/office/word/2023/wordml/word16du" xmlns:w16sdtdh="http://schemas.microsoft.com/office/word/2020/wordml/sdtdatahash" xmlns:w16sdtfl="http://schemas.microsoft.com/office/word/2024/wordml/sdtformatlock" xmlns:w16se="http://schemas.microsoft.com/office/word/2015/wordml/symex" mc:Ignorable="w14 w15 w16se w16cid w16 w16cex w16sdtdh w16sdtfl w16du">
   <w:docDefaults>
     <w:rPrDefault>
       <w:rPr>
@@ -3297,7 +3425,7 @@
       </w:pPr>
     </w:pPrDefault>
   </w:docDefaults>
-  <w:latentStyles w:defLockedState="0" w:defUIPriority="99" w:defSemiHidden="0" w:defUnhideWhenUsed="0" w:defQFormat="0" w:count="371">
+  <w:latentStyles w:defLockedState="0" w:defUIPriority="99" w:defSemiHidden="0" w:defUnhideWhenUsed="0" w:defQFormat="0" w:count="376">
     <w:lsdException w:name="Normal" w:uiPriority="0" w:qFormat="1"/>
     <w:lsdException w:name="heading 1" w:uiPriority="9" w:qFormat="1"/>
     <w:lsdException w:name="heading 2" w:semiHidden="1" w:uiPriority="9" w:unhideWhenUsed="1" w:qFormat="1"/>
@@ -3669,6 +3797,11 @@
     <w:lsdException w:name="List Table 5 Dark Accent 6" w:uiPriority="50"/>
     <w:lsdException w:name="List Table 6 Colorful Accent 6" w:uiPriority="51"/>
     <w:lsdException w:name="List Table 7 Colorful Accent 6" w:uiPriority="52"/>
+    <w:lsdException w:name="Mention" w:semiHidden="1" w:unhideWhenUsed="1"/>
+    <w:lsdException w:name="Smart Hyperlink" w:semiHidden="1" w:unhideWhenUsed="1"/>
+    <w:lsdException w:name="Hashtag" w:semiHidden="1" w:unhideWhenUsed="1"/>
+    <w:lsdException w:name="Unresolved Mention" w:semiHidden="1" w:unhideWhenUsed="1"/>
+    <w:lsdException w:name="Smart Link" w:semiHidden="1" w:unhideWhenUsed="1"/>
   </w:latentStyles>
   <w:style w:type="paragraph" w:default="1" w:styleId="Normal">
     <w:name w:val="Normal"/>

</xml_diff>

<commit_message>
[update] Ajustes no documento e nos textos bases
</commit_message>
<xml_diff>
--- a/2026/trabalhos/TCC/TCC_Historiando.docx
+++ b/2026/trabalhos/TCC/TCC_Historiando.docx
@@ -1,6 +1,6 @@
 
 <file path=word/document.xml><?xml version="1.0" encoding="utf-8"?>
-<w:document xmlns:wpc="http://schemas.microsoft.com/office/word/2010/wordprocessingCanvas" xmlns:cx="http://schemas.microsoft.com/office/drawing/2014/chartex" xmlns:cx1="http://schemas.microsoft.com/office/drawing/2015/9/8/chartex" xmlns:cx2="http://schemas.microsoft.com/office/drawing/2015/10/21/chartex" xmlns:cx3="http://schemas.microsoft.com/office/drawing/2016/5/9/chartex" xmlns:cx4="http://schemas.microsoft.com/office/drawing/2016/5/10/chartex" xmlns:cx5="http://schemas.microsoft.com/office/drawing/2016/5/11/chartex" xmlns:cx6="http://schemas.microsoft.com/office/drawing/2016/5/12/chartex" xmlns:cx7="http://schemas.microsoft.com/office/drawing/2016/5/13/chartex" xmlns:cx8="http://schemas.microsoft.com/office/drawing/2016/5/14/chartex" xmlns:mc="http://schemas.openxmlformats.org/markup-compatibility/2006" xmlns:aink="http://schemas.microsoft.com/office/drawing/2016/ink" xmlns:am3d="http://schemas.microsoft.com/office/drawing/2017/model3d" xmlns:o="urn:schemas-microsoft-com:office:office" xmlns:oel="http://schemas.microsoft.com/office/2019/extlst" xmlns:r="http://schemas.openxmlformats.org/officeDocument/2006/relationships" xmlns:m="http://schemas.openxmlformats.org/officeDocument/2006/math" xmlns:v="urn:schemas-microsoft-com:vml" xmlns:wp14="http://schemas.microsoft.com/office/word/2010/wordprocessingDrawing" xmlns:wp="http://schemas.openxmlformats.org/drawingml/2006/wordprocessingDrawing" xmlns:w10="urn:schemas-microsoft-com:office:word" xmlns:w="http://schemas.openxmlformats.org/wordprocessingml/2006/main" xmlns:w14="http://schemas.microsoft.com/office/word/2010/wordml" xmlns:w15="http://schemas.microsoft.com/office/word/2012/wordml" xmlns:w16cex="http://schemas.microsoft.com/office/word/2018/wordml/cex" xmlns:w16cid="http://schemas.microsoft.com/office/word/2016/wordml/cid" xmlns:w16="http://schemas.microsoft.com/office/word/2018/wordml" xmlns:w16du="http://schemas.microsoft.com/office/word/2023/wordml/word16du" xmlns:w16sdtdh="http://schemas.microsoft.com/office/word/2020/wordml/sdtdatahash" xmlns:w16sdtfl="http://schemas.microsoft.com/office/word/2024/wordml/sdtformatlock" xmlns:w16se="http://schemas.microsoft.com/office/word/2015/wordml/symex" xmlns:wpg="http://schemas.microsoft.com/office/word/2010/wordprocessingGroup" xmlns:wpi="http://schemas.microsoft.com/office/word/2010/wordprocessingInk" xmlns:wne="http://schemas.microsoft.com/office/word/2006/wordml" xmlns:wps="http://schemas.microsoft.com/office/word/2010/wordprocessingShape" mc:Ignorable="w14 w15 w16se w16cid w16 w16cex w16sdtdh w16sdtfl w16du wp14">
+<w:document xmlns:wpc="http://schemas.microsoft.com/office/word/2010/wordprocessingCanvas" xmlns:cx="http://schemas.microsoft.com/office/drawing/2014/chartex" xmlns:cx1="http://schemas.microsoft.com/office/drawing/2015/9/8/chartex" xmlns:mc="http://schemas.openxmlformats.org/markup-compatibility/2006" xmlns:o="urn:schemas-microsoft-com:office:office" xmlns:r="http://schemas.openxmlformats.org/officeDocument/2006/relationships" xmlns:m="http://schemas.openxmlformats.org/officeDocument/2006/math" xmlns:v="urn:schemas-microsoft-com:vml" xmlns:wp14="http://schemas.microsoft.com/office/word/2010/wordprocessingDrawing" xmlns:wp="http://schemas.openxmlformats.org/drawingml/2006/wordprocessingDrawing" xmlns:w10="urn:schemas-microsoft-com:office:word" xmlns:w="http://schemas.openxmlformats.org/wordprocessingml/2006/main" xmlns:w14="http://schemas.microsoft.com/office/word/2010/wordml" xmlns:w15="http://schemas.microsoft.com/office/word/2012/wordml" xmlns:w16se="http://schemas.microsoft.com/office/word/2015/wordml/symex" xmlns:wpg="http://schemas.microsoft.com/office/word/2010/wordprocessingGroup" xmlns:wpi="http://schemas.microsoft.com/office/word/2010/wordprocessingInk" xmlns:wne="http://schemas.microsoft.com/office/word/2006/wordml" xmlns:wps="http://schemas.microsoft.com/office/word/2010/wordprocessingShape" mc:Ignorable="w14 w15 w16se wp14">
   <w:body>
     <w:p>
       <w:pPr>
@@ -772,6 +772,7 @@
     <w:p>
       <w:pPr>
         <w:pStyle w:val="NormalWeb"/>
+        <w:spacing w:line="360" w:lineRule="auto"/>
         <w:jc w:val="both"/>
         <w:rPr>
           <w:rFonts w:ascii="Arial" w:hAnsi="Arial" w:cs="Arial"/>
@@ -823,6 +824,7 @@
     <w:p>
       <w:pPr>
         <w:pStyle w:val="NormalWeb"/>
+        <w:spacing w:line="360" w:lineRule="auto"/>
         <w:jc w:val="both"/>
         <w:rPr>
           <w:rFonts w:ascii="Arial" w:hAnsi="Arial" w:cs="Arial"/>
@@ -851,15 +853,89 @@
     </w:p>
     <w:p>
       <w:pPr>
+        <w:pStyle w:val="Resumo-Texto"/>
+        <w:spacing w:after="0" w:line="360" w:lineRule="auto"/>
+      </w:pPr>
+    </w:p>
+    <w:p>
+      <w:pPr>
+        <w:pStyle w:val="Resumo-Texto"/>
+        <w:spacing w:after="0" w:line="360" w:lineRule="auto"/>
+      </w:pPr>
+    </w:p>
+    <w:p>
+      <w:pPr>
+        <w:pStyle w:val="Resumo-Texto"/>
+        <w:spacing w:after="0" w:line="360" w:lineRule="auto"/>
+      </w:pPr>
+    </w:p>
+    <w:p>
+      <w:pPr>
+        <w:pStyle w:val="Resumo-Texto"/>
+        <w:spacing w:after="0" w:line="360" w:lineRule="auto"/>
+      </w:pPr>
+    </w:p>
+    <w:p>
+      <w:pPr>
+        <w:pStyle w:val="Resumo-Texto"/>
+        <w:spacing w:after="0" w:line="360" w:lineRule="auto"/>
+      </w:pPr>
+    </w:p>
+    <w:p>
+      <w:pPr>
+        <w:pStyle w:val="Resumo-Texto"/>
+        <w:spacing w:after="0" w:line="360" w:lineRule="auto"/>
+      </w:pPr>
+    </w:p>
+    <w:p>
+      <w:pPr>
+        <w:pStyle w:val="Resumo-Texto"/>
+        <w:spacing w:after="0" w:line="360" w:lineRule="auto"/>
+      </w:pPr>
+    </w:p>
+    <w:p>
+      <w:pPr>
+        <w:pStyle w:val="Resumo-Texto"/>
+        <w:spacing w:after="0" w:line="360" w:lineRule="auto"/>
+      </w:pPr>
+    </w:p>
+    <w:p>
+      <w:pPr>
+        <w:pStyle w:val="Resumo-Texto"/>
+        <w:spacing w:after="0" w:line="360" w:lineRule="auto"/>
+      </w:pPr>
+    </w:p>
+    <w:p>
+      <w:pPr>
+        <w:pStyle w:val="Resumo-Texto"/>
+        <w:spacing w:after="0" w:line="360" w:lineRule="auto"/>
+      </w:pPr>
+    </w:p>
+    <w:p>
+      <w:pPr>
+        <w:pStyle w:val="Resumo-Texto"/>
+        <w:spacing w:after="0" w:line="360" w:lineRule="auto"/>
+      </w:pPr>
+    </w:p>
+    <w:p>
+      <w:pPr>
+        <w:pStyle w:val="Resumo-Texto"/>
+        <w:spacing w:after="0" w:line="360" w:lineRule="auto"/>
+      </w:pPr>
+    </w:p>
+    <w:p>
+      <w:pPr>
         <w:pStyle w:val="Resumo-Ttulo"/>
       </w:pPr>
       <w:r>
+        <w:lastRenderedPageBreak/>
         <w:t>ABstract</w:t>
       </w:r>
     </w:p>
     <w:p>
       <w:pPr>
         <w:pStyle w:val="NormalWeb"/>
+        <w:spacing w:line="360" w:lineRule="auto"/>
         <w:jc w:val="both"/>
         <w:rPr>
           <w:rFonts w:ascii="Arial" w:hAnsi="Arial" w:cs="Arial"/>
@@ -877,6 +953,7 @@
     <w:p>
       <w:pPr>
         <w:pStyle w:val="NormalWeb"/>
+        <w:spacing w:line="360" w:lineRule="auto"/>
         <w:jc w:val="both"/>
         <w:rPr>
           <w:rFonts w:ascii="Arial" w:hAnsi="Arial" w:cs="Arial"/>
@@ -1329,15 +1406,14 @@
         <w:spacing w:after="0" w:line="360" w:lineRule="auto"/>
       </w:pPr>
       <w:r>
-        <w:t>Sendo assim, este Trabalho de Conclusão de Curso (TCC) dedica-se ao desenvolvimento de um jogo educativo que auxilie estudantes na assimilação de conteúdos históricos, especificamente sobre os períodos Pré-Colonial e Colonial do Brasil, utilizando uma abordagem lúdica e imersiva.</w:t>
-      </w:r>
-    </w:p>
-    <w:p>
-      <w:pPr>
-        <w:pStyle w:val="Texto-Resumo"/>
-        <w:spacing w:after="0" w:line="360" w:lineRule="auto"/>
-        <w:jc w:val="left"/>
-      </w:pPr>
+        <w:t>Sendo assim, este Trabalho de Conclusão de Curso (TCC) dedica-se ao desenvolvimento de um jogo educativo que auxilie estudantes na assimilação de conteúdos históricos, esp</w:t>
+      </w:r>
+      <w:r>
+        <w:t>ecificamente sobre os períodos pré-colonial e c</w:t>
+      </w:r>
+      <w:r>
+        <w:t>olonial do Brasil, utilizando uma abordagem lúdica e imersiva.</w:t>
+      </w:r>
     </w:p>
     <w:p>
       <w:pPr>
@@ -1397,84 +1473,141 @@
           <w:bCs/>
           <w:szCs w:val="24"/>
         </w:rPr>
-        <w:t>É notado no ambiente escolar e social uma taxa significativa de pessoas que tem dificuldade ou desinteresse na história do Brasil pré-colonial e colonial, sendo que, como momento de formação do país, ela é um ponto essencial para entender aspectos da sociedade brasileira, como: o início do seu desenvolvimento étnico, o qual se deu com os povos originários, europeus, em sua maioria portugueses, e povos africanos. Estes contribuíram para a construção do Brasil como país mais miscigenado do mundo. E deixaram como legado seus costumes e tradições, por exemplo o idioma (língua portuguesa), o qual possui traços dos três grupos</w:t>
+        <w:t xml:space="preserve">É notado no ambiente escolar e social uma taxa significativa de pessoas que tem dificuldade ou desinteresse na história do Brasil pré-colonial e colonial, sendo que, como momento de formação do país, ela é um ponto essencial para entender aspectos da sociedade brasileira, como: o início do seu desenvolvimento étnico, o qual se deu com os povos originários, europeus, em sua maioria portugueses, e povos africanos. Estes contribuíram para a construção do Brasil como </w:t>
       </w:r>
       <w:r>
         <w:rPr>
           <w:bCs/>
           <w:szCs w:val="24"/>
         </w:rPr>
-        <w:t>.</w:t>
-      </w:r>
+        <w:t xml:space="preserve">o </w:t>
+      </w:r>
+      <w:r>
+        <w:rPr>
+          <w:bCs/>
+          <w:szCs w:val="24"/>
+        </w:rPr>
+        <w:t>p</w:t>
+      </w:r>
+      <w:r>
+        <w:rPr>
+          <w:bCs/>
+          <w:szCs w:val="24"/>
+        </w:rPr>
+        <w:t>aís mais miscigenado do mundo e</w:t>
+      </w:r>
+      <w:r>
+        <w:rPr>
+          <w:bCs/>
+          <w:szCs w:val="24"/>
+        </w:rPr>
+        <w:t xml:space="preserve"> deixaram como legado seus costumes e tradições, por exemplo o idioma (língua portuguesa), o qual possui traços dos três grupos.</w:t>
+      </w:r>
+    </w:p>
+    <w:p>
+      <w:pPr>
+        <w:pStyle w:val="Texto-Resumo"/>
+        <w:spacing w:after="0" w:line="360" w:lineRule="auto"/>
+        <w:jc w:val="left"/>
+      </w:pPr>
+    </w:p>
+    <w:p>
+      <w:pPr>
+        <w:pStyle w:val="Texto-Resumo"/>
+        <w:spacing w:after="0" w:line="360" w:lineRule="auto"/>
+        <w:jc w:val="left"/>
+        <w:rPr>
+          <w:b/>
+        </w:rPr>
+      </w:pPr>
+      <w:r>
+        <w:rPr>
+          <w:b/>
+        </w:rPr>
+        <w:t xml:space="preserve">1.2 </w:t>
+      </w:r>
+      <w:r>
+        <w:rPr>
+          <w:b/>
+        </w:rPr>
+        <w:t>H</w:t>
+      </w:r>
+      <w:r>
+        <w:rPr>
+          <w:b/>
+        </w:rPr>
+        <w:t>ipóteses</w:t>
+      </w:r>
+    </w:p>
+    <w:p>
+      <w:pPr>
+        <w:pStyle w:val="Texto-Resumo"/>
+        <w:spacing w:after="0" w:line="360" w:lineRule="auto"/>
+        <w:jc w:val="left"/>
+        <w:rPr>
+          <w:b/>
+        </w:rPr>
+      </w:pPr>
+    </w:p>
+    <w:p>
+      <w:pPr>
+        <w:pStyle w:val="Texto-Resumo"/>
+        <w:spacing w:after="0" w:line="360" w:lineRule="auto"/>
+        <w:jc w:val="left"/>
+      </w:pPr>
+    </w:p>
+    <w:p>
+      <w:pPr>
+        <w:pStyle w:val="Texto-Resumo"/>
+        <w:spacing w:after="0" w:line="360" w:lineRule="auto"/>
+        <w:jc w:val="left"/>
+        <w:rPr>
+          <w:b/>
+        </w:rPr>
+      </w:pPr>
+      <w:r>
+        <w:rPr>
+          <w:b/>
+        </w:rPr>
+        <w:lastRenderedPageBreak/>
+        <w:t>1.</w:t>
+      </w:r>
+      <w:r>
+        <w:rPr>
+          <w:b/>
+        </w:rPr>
+        <w:t>3 J</w:t>
+      </w:r>
+      <w:r>
+        <w:rPr>
+          <w:b/>
+        </w:rPr>
+        <w:t>ustificativa</w:t>
+      </w:r>
+    </w:p>
+    <w:p>
+      <w:pPr>
+        <w:pStyle w:val="Texto-Resumo"/>
+        <w:spacing w:after="0" w:line="360" w:lineRule="auto"/>
+        <w:jc w:val="left"/>
+        <w:rPr>
+          <w:b/>
+        </w:rPr>
+      </w:pPr>
     </w:p>
     <w:p>
       <w:pPr>
         <w:spacing w:before="120" w:after="120" w:line="360" w:lineRule="auto"/>
         <w:rPr>
-          <w:bCs/>
-          <w:szCs w:val="24"/>
-        </w:rPr>
-      </w:pPr>
-    </w:p>
-    <w:p>
-      <w:pPr>
-        <w:pStyle w:val="Texto-Resumo"/>
-        <w:spacing w:after="0" w:line="360" w:lineRule="auto"/>
-        <w:jc w:val="left"/>
-      </w:pPr>
-    </w:p>
-    <w:p>
-      <w:pPr>
-        <w:pStyle w:val="Texto-Resumo"/>
-        <w:spacing w:after="0" w:line="360" w:lineRule="auto"/>
-        <w:jc w:val="left"/>
-      </w:pPr>
-    </w:p>
-    <w:p>
-      <w:pPr>
-        <w:pStyle w:val="Texto-Resumo"/>
-        <w:spacing w:after="0" w:line="360" w:lineRule="auto"/>
-        <w:jc w:val="left"/>
-        <w:rPr>
-          <w:b/>
-        </w:rPr>
-      </w:pPr>
-      <w:r>
-        <w:rPr>
-          <w:b/>
-        </w:rPr>
-        <w:lastRenderedPageBreak/>
-        <w:t xml:space="preserve">1.2 </w:t>
-      </w:r>
-      <w:r>
-        <w:rPr>
-          <w:b/>
-        </w:rPr>
-        <w:t>H</w:t>
-      </w:r>
-      <w:r>
-        <w:rPr>
-          <w:b/>
-        </w:rPr>
-        <w:t>ipóteses</w:t>
-      </w:r>
-    </w:p>
-    <w:p>
-      <w:pPr>
-        <w:pStyle w:val="Texto-Resumo"/>
-        <w:spacing w:after="0" w:line="360" w:lineRule="auto"/>
-        <w:jc w:val="left"/>
-        <w:rPr>
-          <w:b/>
-        </w:rPr>
-      </w:pPr>
-    </w:p>
-    <w:p>
-      <w:pPr>
-        <w:pStyle w:val="Texto-Resumo"/>
-        <w:spacing w:after="0" w:line="360" w:lineRule="auto"/>
-        <w:jc w:val="left"/>
-      </w:pPr>
+          <w:rFonts w:cs="Arial"/>
+        </w:rPr>
+      </w:pPr>
+      <w:r>
+        <w:rPr>
+          <w:rFonts w:cs="Arial"/>
+        </w:rPr>
+        <w:t>Por meio da aplicação de um questionário, em 2025, aos estudantes da escola Etec Bento Quirino, observou-se um desinteresse significativo pelos conteúdos abordados nas disciplinas de História. Os estudantes relataram falta de interesse pelo tema, o que pode estar relacionado à forma limitada como os conteúdos são apresentados, bem como as técnicas de ensino utilizadas no processo de aprendizagem. Mesmo entre os estudantes que demonstram interesse pela disciplina, são mencionadas dificuldades em aprender o conteúdo devido à metodologia adotada. Considerando que os jogos sérios – jogos desenvolvidos com fins educacionais – têm como proposta ensinar por meio da jogabilidade, este trabalho propõe o desenvolvimento de um jogo de aventura como forma de complementar o método de ensino em sala de aula, buscando transmitir o conhecimento por meio de diferentes formas de comunicação.</w:t>
+      </w:r>
     </w:p>
     <w:p>
       <w:pPr>
@@ -1502,28 +1635,40 @@
         <w:rPr>
           <w:b/>
         </w:rPr>
-        <w:t>3</w:t>
-      </w:r>
-      <w:r>
-        <w:rPr>
-          <w:b/>
-        </w:rPr>
-        <w:t xml:space="preserve"> Justificativa</w:t>
-      </w:r>
-    </w:p>
-    <w:p>
-      <w:pPr>
-        <w:pStyle w:val="Texto-Resumo"/>
-        <w:spacing w:after="0" w:line="360" w:lineRule="auto"/>
-        <w:jc w:val="left"/>
-        <w:rPr>
-          <w:b/>
-        </w:rPr>
-      </w:pPr>
-    </w:p>
-    <w:p>
-      <w:pPr>
-        <w:spacing w:before="120" w:after="120" w:line="360" w:lineRule="auto"/>
+        <w:t>4</w:t>
+      </w:r>
+      <w:r>
+        <w:rPr>
+          <w:b/>
+        </w:rPr>
+        <w:t xml:space="preserve"> </w:t>
+      </w:r>
+      <w:r>
+        <w:rPr>
+          <w:b/>
+        </w:rPr>
+        <w:t>O</w:t>
+      </w:r>
+      <w:r>
+        <w:rPr>
+          <w:b/>
+        </w:rPr>
+        <w:t>bjetivos</w:t>
+      </w:r>
+    </w:p>
+    <w:p>
+      <w:pPr>
+        <w:pStyle w:val="Texto-Resumo"/>
+        <w:spacing w:after="0" w:line="360" w:lineRule="auto"/>
+        <w:jc w:val="left"/>
+        <w:rPr>
+          <w:b/>
+        </w:rPr>
+      </w:pPr>
+    </w:p>
+    <w:p>
+      <w:pPr>
+        <w:spacing w:after="120" w:line="360" w:lineRule="auto"/>
         <w:rPr>
           <w:rFonts w:cs="Arial"/>
         </w:rPr>
@@ -1532,19 +1677,7 @@
         <w:rPr>
           <w:rFonts w:cs="Arial"/>
         </w:rPr>
-        <w:t>Por meio da aplicação de um questionário</w:t>
-      </w:r>
-      <w:r>
-        <w:rPr>
-          <w:rFonts w:cs="Arial"/>
-        </w:rPr>
-        <w:t>, em 2025,</w:t>
-      </w:r>
-      <w:r>
-        <w:rPr>
-          <w:rFonts w:cs="Arial"/>
-        </w:rPr>
-        <w:t xml:space="preserve"> aos estudantes da escola Etec Bento Quirino, observou-se um desinteresse significativo pelos conteúdos abordados nas disciplinas de História. Os estudantes relataram falta de interesse pelo tema, o que pode estar relacionado à forma limitada como os conteúdos são apresentados, bem como as técnicas de ensino utilizadas no processo de aprendizagem. Mesmo entre os estudantes que demonstram interesse pela disciplina, são mencionadas dificuldades em aprender o conteúdo devido à metodologia adotada. Considerando que os jogos sérios – jogos desenvolvidos com fins educacionais – têm como proposta ensinar por meio da jogabilidade, este trabalho propõe o desenvolvimento de um jogo de aventura como forma de complementar o método de ensino em sala de aula, buscando transmitir o conhecimento por meio de diferentes formas de comunicação.</w:t>
+        <w:t>Desenvolver um jogo de aventura, que aborde a História do Brasil pré-colonial e colonial, visando o aprendizado do jogador de maneira lúdica e envolvente. Além de reforçar os conhecimentos apreendidos por meio das fases e desafios e assim estimulará a fixação do conteúdo histórico.</w:t>
       </w:r>
     </w:p>
     <w:p>
@@ -1579,20 +1712,27 @@
         <w:rPr>
           <w:b/>
         </w:rPr>
-        <w:t xml:space="preserve"> </w:t>
-      </w:r>
-      <w:r>
-        <w:rPr>
-          <w:b/>
-        </w:rPr>
-        <w:t>O</w:t>
-      </w:r>
-      <w:r>
-        <w:rPr>
-          <w:b/>
-        </w:rPr>
-        <w:t>bjetivos</w:t>
-      </w:r>
+        <w:t xml:space="preserve">.1 </w:t>
+      </w:r>
+      <w:r>
+        <w:rPr>
+          <w:b/>
+        </w:rPr>
+        <w:t>G</w:t>
+      </w:r>
+      <w:r>
+        <w:rPr>
+          <w:b/>
+        </w:rPr>
+        <w:t>eral</w:t>
+      </w:r>
+    </w:p>
+    <w:p>
+      <w:pPr>
+        <w:pStyle w:val="Texto-Resumo"/>
+        <w:spacing w:after="0" w:line="360" w:lineRule="auto"/>
+        <w:jc w:val="left"/>
+      </w:pPr>
     </w:p>
     <w:p>
       <w:pPr>
@@ -1626,60 +1766,6 @@
         <w:rPr>
           <w:b/>
         </w:rPr>
-        <w:t xml:space="preserve">.1 </w:t>
-      </w:r>
-      <w:r>
-        <w:rPr>
-          <w:b/>
-        </w:rPr>
-        <w:t>G</w:t>
-      </w:r>
-      <w:r>
-        <w:rPr>
-          <w:b/>
-        </w:rPr>
-        <w:t>eral</w:t>
-      </w:r>
-    </w:p>
-    <w:p>
-      <w:pPr>
-        <w:pStyle w:val="Texto-Resumo"/>
-        <w:spacing w:after="0" w:line="360" w:lineRule="auto"/>
-        <w:jc w:val="left"/>
-      </w:pPr>
-    </w:p>
-    <w:p>
-      <w:pPr>
-        <w:pStyle w:val="Texto-Resumo"/>
-        <w:spacing w:after="0" w:line="360" w:lineRule="auto"/>
-        <w:jc w:val="left"/>
-      </w:pPr>
-    </w:p>
-    <w:p>
-      <w:pPr>
-        <w:pStyle w:val="Texto-Resumo"/>
-        <w:spacing w:after="0" w:line="360" w:lineRule="auto"/>
-        <w:jc w:val="left"/>
-        <w:rPr>
-          <w:b/>
-        </w:rPr>
-      </w:pPr>
-      <w:r>
-        <w:rPr>
-          <w:b/>
-        </w:rPr>
-        <w:t>1.</w:t>
-      </w:r>
-      <w:r>
-        <w:rPr>
-          <w:b/>
-        </w:rPr>
-        <w:t>4</w:t>
-      </w:r>
-      <w:r>
-        <w:rPr>
-          <w:b/>
-        </w:rPr>
         <w:t xml:space="preserve">.2 </w:t>
       </w:r>
       <w:r>
@@ -1694,6 +1780,48 @@
         </w:rPr>
         <w:t>specíficos</w:t>
       </w:r>
+    </w:p>
+    <w:p>
+      <w:pPr>
+        <w:pStyle w:val="Texto-Resumo"/>
+        <w:spacing w:after="0" w:line="360" w:lineRule="auto"/>
+        <w:jc w:val="left"/>
+      </w:pPr>
+    </w:p>
+    <w:p>
+      <w:pPr>
+        <w:pStyle w:val="Texto-Resumo"/>
+        <w:spacing w:after="0" w:line="360" w:lineRule="auto"/>
+        <w:jc w:val="left"/>
+      </w:pPr>
+    </w:p>
+    <w:p>
+      <w:pPr>
+        <w:pStyle w:val="Texto-Resumo"/>
+        <w:spacing w:after="0" w:line="360" w:lineRule="auto"/>
+        <w:jc w:val="left"/>
+      </w:pPr>
+    </w:p>
+    <w:p>
+      <w:pPr>
+        <w:pStyle w:val="Texto-Resumo"/>
+        <w:spacing w:after="0" w:line="360" w:lineRule="auto"/>
+        <w:jc w:val="left"/>
+      </w:pPr>
+    </w:p>
+    <w:p>
+      <w:pPr>
+        <w:pStyle w:val="Texto-Resumo"/>
+        <w:spacing w:after="0" w:line="360" w:lineRule="auto"/>
+        <w:jc w:val="left"/>
+      </w:pPr>
+    </w:p>
+    <w:p>
+      <w:pPr>
+        <w:pStyle w:val="Texto-Resumo"/>
+        <w:spacing w:after="0" w:line="360" w:lineRule="auto"/>
+        <w:jc w:val="left"/>
+      </w:pPr>
     </w:p>
     <w:p>
       <w:pPr>
@@ -1726,6 +1854,7 @@
         <w:rPr>
           <w:b/>
         </w:rPr>
+        <w:lastRenderedPageBreak/>
         <w:t xml:space="preserve"> </w:t>
       </w:r>
       <w:r>
@@ -1816,181 +1945,575 @@
         <w:rPr>
           <w:rFonts w:cs="Arial"/>
         </w:rPr>
-        <w:t xml:space="preserve">o, será </w:t>
+        <w:t xml:space="preserve">o, será implementado um sistema de conquistas, </w:t>
       </w:r>
       <w:r>
         <w:rPr>
           <w:rFonts w:cs="Arial"/>
         </w:rPr>
+        <w:t>em que</w:t>
+      </w:r>
+      <w:r>
+        <w:rPr>
+          <w:rFonts w:cs="Arial"/>
+        </w:rPr>
+        <w:t xml:space="preserve"> o jogador deverá cumprir as atividades propostas dentro de um determinado período</w:t>
+      </w:r>
+      <w:r>
+        <w:rPr>
+          <w:rFonts w:cs="Arial"/>
+        </w:rPr>
+        <w:t>.</w:t>
+      </w:r>
+      <w:r>
+        <w:rPr>
+          <w:rFonts w:cs="Arial"/>
+        </w:rPr>
+        <w:t xml:space="preserve"> </w:t>
+      </w:r>
+      <w:r>
+        <w:rPr>
+          <w:rFonts w:cs="Arial"/>
+        </w:rPr>
+        <w:t xml:space="preserve">Já em relação </w:t>
+      </w:r>
+      <w:r>
+        <w:rPr>
+          <w:rFonts w:cs="Arial"/>
+        </w:rPr>
+        <w:t>à parte técnica do jogo, os personagens serão desenvolvidos por meio de ferramentas de renderização de objetos 3D, como o Blender, e os mecanismos do jogo serão desenvolvidos utilizando a engine Godot 4.</w:t>
+      </w:r>
+    </w:p>
+    <w:p>
+      <w:pPr>
+        <w:pStyle w:val="Texto-Resumo"/>
+        <w:spacing w:after="0" w:line="360" w:lineRule="auto"/>
+        <w:jc w:val="left"/>
+        <w:rPr>
+          <w:b/>
+        </w:rPr>
+      </w:pPr>
+    </w:p>
+    <w:p>
+      <w:pPr>
+        <w:pStyle w:val="Texto-Resumo"/>
+        <w:spacing w:after="0" w:line="360" w:lineRule="auto"/>
+        <w:jc w:val="left"/>
+        <w:rPr>
+          <w:bCs/>
+        </w:rPr>
+      </w:pPr>
+    </w:p>
+    <w:p>
+      <w:pPr>
+        <w:pStyle w:val="Texto-Resumo"/>
+        <w:spacing w:after="0" w:line="360" w:lineRule="auto"/>
+        <w:jc w:val="left"/>
+        <w:rPr>
+          <w:bCs/>
+        </w:rPr>
+      </w:pPr>
+    </w:p>
+    <w:p>
+      <w:pPr>
+        <w:pStyle w:val="Texto-Resumo"/>
+        <w:spacing w:after="0" w:line="360" w:lineRule="auto"/>
+        <w:jc w:val="left"/>
+        <w:rPr>
+          <w:bCs/>
+        </w:rPr>
+      </w:pPr>
+    </w:p>
+    <w:p>
+      <w:pPr>
+        <w:pStyle w:val="Texto-Resumo"/>
+        <w:spacing w:after="0" w:line="360" w:lineRule="auto"/>
+        <w:jc w:val="left"/>
+        <w:rPr>
+          <w:bCs/>
+        </w:rPr>
+      </w:pPr>
+    </w:p>
+    <w:p>
+      <w:pPr>
+        <w:pStyle w:val="Texto-Resumo"/>
+        <w:spacing w:after="0" w:line="360" w:lineRule="auto"/>
+        <w:jc w:val="left"/>
+        <w:rPr>
+          <w:bCs/>
+        </w:rPr>
+      </w:pPr>
+    </w:p>
+    <w:p>
+      <w:pPr>
+        <w:pStyle w:val="Texto-Resumo"/>
+        <w:spacing w:after="0" w:line="360" w:lineRule="auto"/>
+        <w:jc w:val="left"/>
+        <w:rPr>
+          <w:bCs/>
+        </w:rPr>
+      </w:pPr>
+    </w:p>
+    <w:p>
+      <w:pPr>
+        <w:pStyle w:val="Texto-Resumo"/>
+        <w:spacing w:after="0" w:line="360" w:lineRule="auto"/>
+        <w:jc w:val="left"/>
+        <w:rPr>
+          <w:bCs/>
+        </w:rPr>
+      </w:pPr>
+    </w:p>
+    <w:p>
+      <w:pPr>
+        <w:pStyle w:val="Texto-Resumo"/>
+        <w:spacing w:after="0" w:line="360" w:lineRule="auto"/>
+        <w:jc w:val="left"/>
+        <w:rPr>
+          <w:bCs/>
+        </w:rPr>
+      </w:pPr>
+    </w:p>
+    <w:p>
+      <w:pPr>
+        <w:pStyle w:val="Texto-Resumo"/>
+        <w:spacing w:after="0" w:line="360" w:lineRule="auto"/>
+        <w:jc w:val="left"/>
+        <w:rPr>
+          <w:bCs/>
+        </w:rPr>
+      </w:pPr>
+    </w:p>
+    <w:p>
+      <w:pPr>
+        <w:pStyle w:val="Texto-Resumo"/>
+        <w:spacing w:after="0" w:line="360" w:lineRule="auto"/>
+        <w:jc w:val="left"/>
+        <w:rPr>
+          <w:bCs/>
+        </w:rPr>
+      </w:pPr>
+    </w:p>
+    <w:p>
+      <w:pPr>
+        <w:pStyle w:val="Texto-Resumo"/>
+        <w:spacing w:after="0" w:line="360" w:lineRule="auto"/>
+        <w:jc w:val="left"/>
+        <w:rPr>
+          <w:bCs/>
+        </w:rPr>
+      </w:pPr>
+    </w:p>
+    <w:p>
+      <w:pPr>
+        <w:pStyle w:val="Texto-Resumo"/>
+        <w:spacing w:after="0" w:line="360" w:lineRule="auto"/>
+        <w:jc w:val="left"/>
+        <w:rPr>
+          <w:b/>
+          <w:szCs w:val="24"/>
+        </w:rPr>
+      </w:pPr>
+    </w:p>
+    <w:p>
+      <w:pPr>
+        <w:pStyle w:val="Texto-Resumo"/>
+        <w:spacing w:after="0" w:line="360" w:lineRule="auto"/>
+        <w:jc w:val="left"/>
+        <w:rPr>
+          <w:b/>
+          <w:szCs w:val="24"/>
+        </w:rPr>
+      </w:pPr>
+    </w:p>
+    <w:p>
+      <w:pPr>
+        <w:pStyle w:val="Texto-Resumo"/>
+        <w:spacing w:after="0" w:line="360" w:lineRule="auto"/>
+        <w:jc w:val="left"/>
+        <w:rPr>
+          <w:b/>
+          <w:szCs w:val="24"/>
+        </w:rPr>
+      </w:pPr>
+    </w:p>
+    <w:p>
+      <w:pPr>
+        <w:pStyle w:val="Texto-Resumo"/>
+        <w:spacing w:after="0" w:line="360" w:lineRule="auto"/>
+        <w:jc w:val="left"/>
+        <w:rPr>
+          <w:b/>
+          <w:szCs w:val="24"/>
+        </w:rPr>
+      </w:pPr>
+    </w:p>
+    <w:p>
+      <w:pPr>
+        <w:pStyle w:val="Texto-Resumo"/>
+        <w:spacing w:after="0" w:line="360" w:lineRule="auto"/>
+        <w:jc w:val="left"/>
+        <w:rPr>
+          <w:b/>
+          <w:szCs w:val="24"/>
+        </w:rPr>
+      </w:pPr>
+    </w:p>
+    <w:p>
+      <w:pPr>
+        <w:pStyle w:val="Texto-Resumo"/>
+        <w:spacing w:after="0" w:line="360" w:lineRule="auto"/>
+        <w:jc w:val="left"/>
+        <w:rPr>
+          <w:b/>
+          <w:szCs w:val="24"/>
+        </w:rPr>
+      </w:pPr>
+    </w:p>
+    <w:p>
+      <w:pPr>
+        <w:pStyle w:val="Texto-Resumo"/>
+        <w:spacing w:after="0" w:line="360" w:lineRule="auto"/>
+        <w:jc w:val="left"/>
+        <w:rPr>
+          <w:b/>
+          <w:szCs w:val="24"/>
+        </w:rPr>
+      </w:pPr>
+    </w:p>
+    <w:p>
+      <w:pPr>
+        <w:pStyle w:val="Texto-Resumo"/>
+        <w:spacing w:after="0" w:line="360" w:lineRule="auto"/>
+        <w:jc w:val="left"/>
+        <w:rPr>
+          <w:b/>
+          <w:szCs w:val="24"/>
+        </w:rPr>
+      </w:pPr>
+    </w:p>
+    <w:p>
+      <w:pPr>
+        <w:pStyle w:val="Texto-Resumo"/>
+        <w:spacing w:after="0" w:line="360" w:lineRule="auto"/>
+        <w:jc w:val="left"/>
+        <w:rPr>
+          <w:b/>
+          <w:szCs w:val="24"/>
+        </w:rPr>
+      </w:pPr>
+    </w:p>
+    <w:p>
+      <w:pPr>
+        <w:pStyle w:val="Texto-Resumo"/>
+        <w:spacing w:after="0" w:line="360" w:lineRule="auto"/>
+        <w:jc w:val="left"/>
+        <w:rPr>
+          <w:b/>
+          <w:szCs w:val="24"/>
+        </w:rPr>
+      </w:pPr>
+      <w:r>
+        <w:rPr>
+          <w:b/>
+          <w:szCs w:val="24"/>
+        </w:rPr>
         <w:lastRenderedPageBreak/>
-        <w:t xml:space="preserve">implementado um sistema de conquistas, </w:t>
-      </w:r>
-      <w:r>
-        <w:rPr>
-          <w:rFonts w:cs="Arial"/>
-        </w:rPr>
-        <w:t>em que</w:t>
-      </w:r>
-      <w:r>
-        <w:rPr>
-          <w:rFonts w:cs="Arial"/>
-        </w:rPr>
-        <w:t xml:space="preserve"> o jogador deverá cumprir as atividades propostas dentro de um determinado período</w:t>
-      </w:r>
-      <w:r>
-        <w:rPr>
-          <w:rFonts w:cs="Arial"/>
-        </w:rPr>
-        <w:t>.</w:t>
-      </w:r>
-      <w:r>
-        <w:rPr>
-          <w:rFonts w:cs="Arial"/>
-        </w:rPr>
-        <w:t xml:space="preserve"> </w:t>
-      </w:r>
-      <w:r>
-        <w:rPr>
-          <w:rFonts w:cs="Arial"/>
-        </w:rPr>
-        <w:t xml:space="preserve">Já em relação </w:t>
-      </w:r>
-      <w:r>
-        <w:rPr>
-          <w:rFonts w:cs="Arial"/>
-        </w:rPr>
-        <w:t xml:space="preserve">à parte técnica do jogo, os personagens serão desenvolvidos por meio de ferramentas de renderização de objetos 3D, como o Blender, e os mecanismos do jogo serão desenvolvidos utilizando a </w:t>
-      </w:r>
-      <w:proofErr w:type="spellStart"/>
-      <w:r>
-        <w:rPr>
-          <w:rFonts w:cs="Arial"/>
-        </w:rPr>
-        <w:t>engine</w:t>
-      </w:r>
-      <w:proofErr w:type="spellEnd"/>
-      <w:r>
-        <w:rPr>
-          <w:rFonts w:cs="Arial"/>
-        </w:rPr>
-        <w:t xml:space="preserve"> Godot 4.</w:t>
-      </w:r>
-    </w:p>
-    <w:p>
-      <w:pPr>
-        <w:pStyle w:val="Texto-Resumo"/>
-        <w:spacing w:after="0" w:line="360" w:lineRule="auto"/>
-        <w:jc w:val="left"/>
-        <w:rPr>
-          <w:b/>
-        </w:rPr>
-      </w:pPr>
-    </w:p>
-    <w:p>
-      <w:pPr>
-        <w:pStyle w:val="Texto-Resumo"/>
-        <w:spacing w:after="0" w:line="360" w:lineRule="auto"/>
-        <w:jc w:val="left"/>
-        <w:rPr>
-          <w:bCs/>
-        </w:rPr>
-      </w:pPr>
-    </w:p>
-    <w:p>
-      <w:pPr>
-        <w:pStyle w:val="Texto-Resumo"/>
-        <w:spacing w:after="0" w:line="360" w:lineRule="auto"/>
-        <w:jc w:val="left"/>
-        <w:rPr>
-          <w:bCs/>
-        </w:rPr>
-      </w:pPr>
-    </w:p>
-    <w:p>
-      <w:pPr>
-        <w:pStyle w:val="Texto-Resumo"/>
-        <w:spacing w:after="0" w:line="360" w:lineRule="auto"/>
-        <w:jc w:val="left"/>
-        <w:rPr>
-          <w:bCs/>
-        </w:rPr>
-      </w:pPr>
-    </w:p>
-    <w:p>
-      <w:pPr>
-        <w:pStyle w:val="Texto-Resumo"/>
-        <w:spacing w:after="0" w:line="360" w:lineRule="auto"/>
-        <w:jc w:val="left"/>
-        <w:rPr>
-          <w:bCs/>
-        </w:rPr>
-      </w:pPr>
-    </w:p>
-    <w:p>
-      <w:pPr>
-        <w:pStyle w:val="Texto-Resumo"/>
-        <w:spacing w:after="0" w:line="360" w:lineRule="auto"/>
-        <w:jc w:val="left"/>
-        <w:rPr>
-          <w:bCs/>
-        </w:rPr>
-      </w:pPr>
-    </w:p>
-    <w:p>
-      <w:pPr>
-        <w:pStyle w:val="Texto-Resumo"/>
-        <w:spacing w:after="0" w:line="360" w:lineRule="auto"/>
-        <w:jc w:val="left"/>
-        <w:rPr>
-          <w:bCs/>
-        </w:rPr>
-      </w:pPr>
-    </w:p>
-    <w:p>
-      <w:pPr>
-        <w:pStyle w:val="Texto-Resumo"/>
-        <w:spacing w:after="0" w:line="360" w:lineRule="auto"/>
-        <w:jc w:val="left"/>
-        <w:rPr>
-          <w:bCs/>
-        </w:rPr>
-      </w:pPr>
-    </w:p>
-    <w:p>
-      <w:pPr>
-        <w:pStyle w:val="Texto-Resumo"/>
-        <w:spacing w:after="0" w:line="360" w:lineRule="auto"/>
-        <w:jc w:val="left"/>
-        <w:rPr>
-          <w:bCs/>
-        </w:rPr>
-      </w:pPr>
-    </w:p>
-    <w:p>
-      <w:pPr>
-        <w:pStyle w:val="Texto-Resumo"/>
-        <w:spacing w:after="0" w:line="360" w:lineRule="auto"/>
-        <w:jc w:val="left"/>
-        <w:rPr>
-          <w:bCs/>
-        </w:rPr>
-      </w:pPr>
-    </w:p>
-    <w:p>
-      <w:pPr>
-        <w:pStyle w:val="Texto-Resumo"/>
-        <w:spacing w:after="0" w:line="360" w:lineRule="auto"/>
-        <w:jc w:val="left"/>
-        <w:rPr>
-          <w:bCs/>
-        </w:rPr>
-      </w:pPr>
-    </w:p>
-    <w:p>
-      <w:pPr>
-        <w:pStyle w:val="Texto-Resumo"/>
-        <w:spacing w:after="0" w:line="360" w:lineRule="auto"/>
-        <w:jc w:val="left"/>
+        <w:t>2. DESENVOLVIMENTO</w:t>
+      </w:r>
+    </w:p>
+    <w:p>
+      <w:pPr>
+        <w:pStyle w:val="Texto-Resumo"/>
+        <w:spacing w:after="0" w:line="360" w:lineRule="auto"/>
+        <w:rPr>
+          <w:bCs/>
+        </w:rPr>
+      </w:pPr>
+    </w:p>
+    <w:p>
+      <w:pPr>
+        <w:pStyle w:val="Texto-Resumo"/>
+        <w:spacing w:after="0" w:line="360" w:lineRule="auto"/>
+        <w:rPr>
+          <w:bCs/>
+        </w:rPr>
+      </w:pPr>
+    </w:p>
+    <w:p>
+      <w:pPr>
+        <w:pStyle w:val="Texto-Resumo"/>
+        <w:spacing w:after="0" w:line="360" w:lineRule="auto"/>
+        <w:rPr>
+          <w:bCs/>
+        </w:rPr>
+      </w:pPr>
+    </w:p>
+    <w:p>
+      <w:pPr>
+        <w:pStyle w:val="Texto-Resumo"/>
+        <w:spacing w:after="0" w:line="360" w:lineRule="auto"/>
+        <w:rPr>
+          <w:bCs/>
+        </w:rPr>
+      </w:pPr>
+    </w:p>
+    <w:p>
+      <w:pPr>
+        <w:pStyle w:val="Texto-Resumo"/>
+        <w:spacing w:after="0" w:line="360" w:lineRule="auto"/>
+        <w:rPr>
+          <w:bCs/>
+        </w:rPr>
+      </w:pPr>
+    </w:p>
+    <w:p>
+      <w:pPr>
+        <w:pStyle w:val="Texto-Resumo"/>
+        <w:spacing w:after="0" w:line="360" w:lineRule="auto"/>
+        <w:rPr>
+          <w:bCs/>
+        </w:rPr>
+      </w:pPr>
+    </w:p>
+    <w:p>
+      <w:pPr>
+        <w:pStyle w:val="Texto-Resumo"/>
+        <w:spacing w:after="0" w:line="360" w:lineRule="auto"/>
+        <w:rPr>
+          <w:bCs/>
+        </w:rPr>
+      </w:pPr>
+    </w:p>
+    <w:p>
+      <w:pPr>
+        <w:pStyle w:val="Texto-Resumo"/>
+        <w:spacing w:after="0" w:line="360" w:lineRule="auto"/>
+        <w:rPr>
+          <w:bCs/>
+        </w:rPr>
+      </w:pPr>
+    </w:p>
+    <w:p>
+      <w:pPr>
+        <w:pStyle w:val="Texto-Resumo"/>
+        <w:spacing w:after="0" w:line="360" w:lineRule="auto"/>
+        <w:rPr>
+          <w:bCs/>
+        </w:rPr>
+      </w:pPr>
+    </w:p>
+    <w:p>
+      <w:pPr>
+        <w:pStyle w:val="Texto-Resumo"/>
+        <w:spacing w:after="0" w:line="360" w:lineRule="auto"/>
+        <w:rPr>
+          <w:bCs/>
+        </w:rPr>
+      </w:pPr>
+    </w:p>
+    <w:p>
+      <w:pPr>
+        <w:pStyle w:val="Texto-Resumo"/>
+        <w:spacing w:after="0" w:line="360" w:lineRule="auto"/>
+        <w:rPr>
+          <w:bCs/>
+        </w:rPr>
+      </w:pPr>
+    </w:p>
+    <w:p>
+      <w:pPr>
+        <w:pStyle w:val="Texto-Resumo"/>
+        <w:spacing w:after="0" w:line="360" w:lineRule="auto"/>
+        <w:rPr>
+          <w:bCs/>
+        </w:rPr>
+      </w:pPr>
+    </w:p>
+    <w:p>
+      <w:pPr>
+        <w:pStyle w:val="Texto-Resumo"/>
+        <w:spacing w:after="0" w:line="360" w:lineRule="auto"/>
+        <w:rPr>
+          <w:bCs/>
+        </w:rPr>
+      </w:pPr>
+    </w:p>
+    <w:p>
+      <w:pPr>
+        <w:pStyle w:val="Texto-Resumo"/>
+        <w:spacing w:after="0" w:line="360" w:lineRule="auto"/>
+        <w:rPr>
+          <w:bCs/>
+        </w:rPr>
+      </w:pPr>
+    </w:p>
+    <w:p>
+      <w:pPr>
+        <w:pStyle w:val="Texto-Resumo"/>
+        <w:spacing w:after="0" w:line="360" w:lineRule="auto"/>
+        <w:rPr>
+          <w:bCs/>
+        </w:rPr>
+      </w:pPr>
+    </w:p>
+    <w:p>
+      <w:pPr>
+        <w:pStyle w:val="Texto-Resumo"/>
+        <w:spacing w:after="0" w:line="360" w:lineRule="auto"/>
+        <w:rPr>
+          <w:bCs/>
+        </w:rPr>
+      </w:pPr>
+    </w:p>
+    <w:p>
+      <w:pPr>
+        <w:pStyle w:val="Texto-Resumo"/>
+        <w:spacing w:after="0" w:line="360" w:lineRule="auto"/>
+        <w:rPr>
+          <w:bCs/>
+        </w:rPr>
+      </w:pPr>
+    </w:p>
+    <w:p>
+      <w:pPr>
+        <w:pStyle w:val="Texto-Resumo"/>
+        <w:spacing w:after="0" w:line="360" w:lineRule="auto"/>
+        <w:rPr>
+          <w:bCs/>
+        </w:rPr>
+      </w:pPr>
+    </w:p>
+    <w:p>
+      <w:pPr>
+        <w:pStyle w:val="Texto-Resumo"/>
+        <w:spacing w:after="0" w:line="360" w:lineRule="auto"/>
+        <w:rPr>
+          <w:bCs/>
+        </w:rPr>
+      </w:pPr>
+    </w:p>
+    <w:p>
+      <w:pPr>
+        <w:pStyle w:val="Texto-Resumo"/>
+        <w:spacing w:after="0" w:line="360" w:lineRule="auto"/>
+        <w:rPr>
+          <w:bCs/>
+        </w:rPr>
+      </w:pPr>
+    </w:p>
+    <w:p>
+      <w:pPr>
+        <w:pStyle w:val="Texto-Resumo"/>
+        <w:spacing w:after="0" w:line="360" w:lineRule="auto"/>
+        <w:rPr>
+          <w:bCs/>
+        </w:rPr>
+      </w:pPr>
+    </w:p>
+    <w:p>
+      <w:pPr>
+        <w:pStyle w:val="Texto-Resumo"/>
+        <w:spacing w:after="0" w:line="360" w:lineRule="auto"/>
+        <w:rPr>
+          <w:bCs/>
+        </w:rPr>
+      </w:pPr>
+    </w:p>
+    <w:p>
+      <w:pPr>
+        <w:pStyle w:val="Texto-Resumo"/>
+        <w:spacing w:after="0" w:line="360" w:lineRule="auto"/>
+        <w:rPr>
+          <w:bCs/>
+        </w:rPr>
+      </w:pPr>
+    </w:p>
+    <w:p>
+      <w:pPr>
+        <w:pStyle w:val="Texto-Resumo"/>
+        <w:spacing w:after="0" w:line="360" w:lineRule="auto"/>
+        <w:rPr>
+          <w:bCs/>
+        </w:rPr>
+      </w:pPr>
+    </w:p>
+    <w:p>
+      <w:pPr>
+        <w:pStyle w:val="Texto-Resumo"/>
+        <w:spacing w:after="0" w:line="360" w:lineRule="auto"/>
+        <w:rPr>
+          <w:bCs/>
+        </w:rPr>
+      </w:pPr>
+    </w:p>
+    <w:p>
+      <w:pPr>
+        <w:pStyle w:val="Texto-Resumo"/>
+        <w:spacing w:after="0" w:line="360" w:lineRule="auto"/>
+        <w:rPr>
+          <w:bCs/>
+        </w:rPr>
+      </w:pPr>
+    </w:p>
+    <w:p>
+      <w:pPr>
+        <w:pStyle w:val="Texto-Resumo"/>
+        <w:spacing w:after="0" w:line="360" w:lineRule="auto"/>
+        <w:rPr>
+          <w:bCs/>
+        </w:rPr>
+      </w:pPr>
+    </w:p>
+    <w:p>
+      <w:pPr>
+        <w:pStyle w:val="Texto-Resumo"/>
+        <w:spacing w:after="0" w:line="360" w:lineRule="auto"/>
+        <w:rPr>
+          <w:bCs/>
+        </w:rPr>
+      </w:pPr>
+    </w:p>
+    <w:p>
+      <w:pPr>
+        <w:pStyle w:val="Texto-Resumo"/>
+        <w:spacing w:after="0" w:line="360" w:lineRule="auto"/>
+        <w:rPr>
+          <w:bCs/>
+        </w:rPr>
+      </w:pPr>
+    </w:p>
+    <w:p>
+      <w:pPr>
+        <w:pStyle w:val="Texto-Resumo"/>
+        <w:spacing w:after="0" w:line="360" w:lineRule="auto"/>
+        <w:rPr>
+          <w:bCs/>
+        </w:rPr>
+      </w:pPr>
+    </w:p>
+    <w:p>
+      <w:pPr>
+        <w:pStyle w:val="Texto-Resumo"/>
+        <w:spacing w:after="0" w:line="360" w:lineRule="auto"/>
+        <w:rPr>
+          <w:bCs/>
+        </w:rPr>
+      </w:pPr>
+    </w:p>
+    <w:p>
+      <w:pPr>
+        <w:pStyle w:val="Texto-Resumo"/>
+        <w:spacing w:after="0" w:line="360" w:lineRule="auto"/>
+        <w:rPr>
+          <w:bCs/>
+        </w:rPr>
+      </w:pPr>
+    </w:p>
+    <w:p>
+      <w:pPr>
+        <w:pStyle w:val="Texto-Resumo"/>
+        <w:spacing w:after="0" w:line="360" w:lineRule="auto"/>
         <w:rPr>
           <w:bCs/>
         </w:rPr>
@@ -2011,321 +2534,7 @@
           <w:b/>
           <w:szCs w:val="24"/>
         </w:rPr>
-        <w:t>2. DESENVOLVIMENTO</w:t>
-      </w:r>
-    </w:p>
-    <w:p>
-      <w:pPr>
-        <w:pStyle w:val="Texto-Resumo"/>
-        <w:spacing w:after="0" w:line="360" w:lineRule="auto"/>
-        <w:rPr>
-          <w:bCs/>
-        </w:rPr>
-      </w:pPr>
-    </w:p>
-    <w:p>
-      <w:pPr>
-        <w:pStyle w:val="Texto-Resumo"/>
-        <w:spacing w:after="0" w:line="360" w:lineRule="auto"/>
-        <w:rPr>
-          <w:bCs/>
-        </w:rPr>
-      </w:pPr>
-    </w:p>
-    <w:p>
-      <w:pPr>
-        <w:pStyle w:val="Texto-Resumo"/>
-        <w:spacing w:after="0" w:line="360" w:lineRule="auto"/>
-        <w:rPr>
-          <w:bCs/>
-        </w:rPr>
-      </w:pPr>
-    </w:p>
-    <w:p>
-      <w:pPr>
-        <w:pStyle w:val="Texto-Resumo"/>
-        <w:spacing w:after="0" w:line="360" w:lineRule="auto"/>
-        <w:rPr>
-          <w:bCs/>
-        </w:rPr>
-      </w:pPr>
-    </w:p>
-    <w:p>
-      <w:pPr>
-        <w:pStyle w:val="Texto-Resumo"/>
-        <w:spacing w:after="0" w:line="360" w:lineRule="auto"/>
-        <w:rPr>
-          <w:bCs/>
-        </w:rPr>
-      </w:pPr>
-    </w:p>
-    <w:p>
-      <w:pPr>
-        <w:pStyle w:val="Texto-Resumo"/>
-        <w:spacing w:after="0" w:line="360" w:lineRule="auto"/>
-        <w:rPr>
-          <w:bCs/>
-        </w:rPr>
-      </w:pPr>
-    </w:p>
-    <w:p>
-      <w:pPr>
-        <w:pStyle w:val="Texto-Resumo"/>
-        <w:spacing w:after="0" w:line="360" w:lineRule="auto"/>
-        <w:rPr>
-          <w:bCs/>
-        </w:rPr>
-      </w:pPr>
-    </w:p>
-    <w:p>
-      <w:pPr>
-        <w:pStyle w:val="Texto-Resumo"/>
-        <w:spacing w:after="0" w:line="360" w:lineRule="auto"/>
-        <w:rPr>
-          <w:bCs/>
-        </w:rPr>
-      </w:pPr>
-    </w:p>
-    <w:p>
-      <w:pPr>
-        <w:pStyle w:val="Texto-Resumo"/>
-        <w:spacing w:after="0" w:line="360" w:lineRule="auto"/>
-        <w:rPr>
-          <w:bCs/>
-        </w:rPr>
-      </w:pPr>
-    </w:p>
-    <w:p>
-      <w:pPr>
-        <w:pStyle w:val="Texto-Resumo"/>
-        <w:spacing w:after="0" w:line="360" w:lineRule="auto"/>
-        <w:rPr>
-          <w:bCs/>
-        </w:rPr>
-      </w:pPr>
-    </w:p>
-    <w:p>
-      <w:pPr>
-        <w:pStyle w:val="Texto-Resumo"/>
-        <w:spacing w:after="0" w:line="360" w:lineRule="auto"/>
-        <w:rPr>
-          <w:bCs/>
-        </w:rPr>
-      </w:pPr>
-    </w:p>
-    <w:p>
-      <w:pPr>
-        <w:pStyle w:val="Texto-Resumo"/>
-        <w:spacing w:after="0" w:line="360" w:lineRule="auto"/>
-        <w:rPr>
-          <w:bCs/>
-        </w:rPr>
-      </w:pPr>
-    </w:p>
-    <w:p>
-      <w:pPr>
-        <w:pStyle w:val="Texto-Resumo"/>
-        <w:spacing w:after="0" w:line="360" w:lineRule="auto"/>
-        <w:rPr>
-          <w:bCs/>
-        </w:rPr>
-      </w:pPr>
-    </w:p>
-    <w:p>
-      <w:pPr>
-        <w:pStyle w:val="Texto-Resumo"/>
-        <w:spacing w:after="0" w:line="360" w:lineRule="auto"/>
-        <w:rPr>
-          <w:bCs/>
-        </w:rPr>
-      </w:pPr>
-    </w:p>
-    <w:p>
-      <w:pPr>
-        <w:pStyle w:val="Texto-Resumo"/>
-        <w:spacing w:after="0" w:line="360" w:lineRule="auto"/>
-        <w:rPr>
-          <w:bCs/>
-        </w:rPr>
-      </w:pPr>
-    </w:p>
-    <w:p>
-      <w:pPr>
-        <w:pStyle w:val="Texto-Resumo"/>
-        <w:spacing w:after="0" w:line="360" w:lineRule="auto"/>
-        <w:rPr>
-          <w:bCs/>
-        </w:rPr>
-      </w:pPr>
-    </w:p>
-    <w:p>
-      <w:pPr>
-        <w:pStyle w:val="Texto-Resumo"/>
-        <w:spacing w:after="0" w:line="360" w:lineRule="auto"/>
-        <w:rPr>
-          <w:bCs/>
-        </w:rPr>
-      </w:pPr>
-    </w:p>
-    <w:p>
-      <w:pPr>
-        <w:pStyle w:val="Texto-Resumo"/>
-        <w:spacing w:after="0" w:line="360" w:lineRule="auto"/>
-        <w:rPr>
-          <w:bCs/>
-        </w:rPr>
-      </w:pPr>
-    </w:p>
-    <w:p>
-      <w:pPr>
-        <w:pStyle w:val="Texto-Resumo"/>
-        <w:spacing w:after="0" w:line="360" w:lineRule="auto"/>
-        <w:rPr>
-          <w:bCs/>
-        </w:rPr>
-      </w:pPr>
-    </w:p>
-    <w:p>
-      <w:pPr>
-        <w:pStyle w:val="Texto-Resumo"/>
-        <w:spacing w:after="0" w:line="360" w:lineRule="auto"/>
-        <w:rPr>
-          <w:bCs/>
-        </w:rPr>
-      </w:pPr>
-    </w:p>
-    <w:p>
-      <w:pPr>
-        <w:pStyle w:val="Texto-Resumo"/>
-        <w:spacing w:after="0" w:line="360" w:lineRule="auto"/>
-        <w:rPr>
-          <w:bCs/>
-        </w:rPr>
-      </w:pPr>
-    </w:p>
-    <w:p>
-      <w:pPr>
-        <w:pStyle w:val="Texto-Resumo"/>
-        <w:spacing w:after="0" w:line="360" w:lineRule="auto"/>
-        <w:rPr>
-          <w:bCs/>
-        </w:rPr>
-      </w:pPr>
-    </w:p>
-    <w:p>
-      <w:pPr>
-        <w:pStyle w:val="Texto-Resumo"/>
-        <w:spacing w:after="0" w:line="360" w:lineRule="auto"/>
-        <w:rPr>
-          <w:bCs/>
-        </w:rPr>
-      </w:pPr>
-    </w:p>
-    <w:p>
-      <w:pPr>
-        <w:pStyle w:val="Texto-Resumo"/>
-        <w:spacing w:after="0" w:line="360" w:lineRule="auto"/>
-        <w:rPr>
-          <w:bCs/>
-        </w:rPr>
-      </w:pPr>
-    </w:p>
-    <w:p>
-      <w:pPr>
-        <w:pStyle w:val="Texto-Resumo"/>
-        <w:spacing w:after="0" w:line="360" w:lineRule="auto"/>
-        <w:rPr>
-          <w:bCs/>
-        </w:rPr>
-      </w:pPr>
-    </w:p>
-    <w:p>
-      <w:pPr>
-        <w:pStyle w:val="Texto-Resumo"/>
-        <w:spacing w:after="0" w:line="360" w:lineRule="auto"/>
-        <w:rPr>
-          <w:bCs/>
-        </w:rPr>
-      </w:pPr>
-    </w:p>
-    <w:p>
-      <w:pPr>
-        <w:pStyle w:val="Texto-Resumo"/>
-        <w:spacing w:after="0" w:line="360" w:lineRule="auto"/>
-        <w:rPr>
-          <w:bCs/>
-        </w:rPr>
-      </w:pPr>
-    </w:p>
-    <w:p>
-      <w:pPr>
-        <w:pStyle w:val="Texto-Resumo"/>
-        <w:spacing w:after="0" w:line="360" w:lineRule="auto"/>
-        <w:rPr>
-          <w:bCs/>
-        </w:rPr>
-      </w:pPr>
-    </w:p>
-    <w:p>
-      <w:pPr>
-        <w:pStyle w:val="Texto-Resumo"/>
-        <w:spacing w:after="0" w:line="360" w:lineRule="auto"/>
-        <w:rPr>
-          <w:bCs/>
-        </w:rPr>
-      </w:pPr>
-    </w:p>
-    <w:p>
-      <w:pPr>
-        <w:pStyle w:val="Texto-Resumo"/>
-        <w:spacing w:after="0" w:line="360" w:lineRule="auto"/>
-        <w:rPr>
-          <w:bCs/>
-        </w:rPr>
-      </w:pPr>
-    </w:p>
-    <w:p>
-      <w:pPr>
-        <w:pStyle w:val="Texto-Resumo"/>
-        <w:spacing w:after="0" w:line="360" w:lineRule="auto"/>
-        <w:rPr>
-          <w:bCs/>
-        </w:rPr>
-      </w:pPr>
-    </w:p>
-    <w:p>
-      <w:pPr>
-        <w:pStyle w:val="Texto-Resumo"/>
-        <w:spacing w:after="0" w:line="360" w:lineRule="auto"/>
-        <w:rPr>
-          <w:bCs/>
-        </w:rPr>
-      </w:pPr>
-    </w:p>
-    <w:p>
-      <w:pPr>
-        <w:pStyle w:val="Texto-Resumo"/>
-        <w:spacing w:after="0" w:line="360" w:lineRule="auto"/>
-        <w:rPr>
-          <w:bCs/>
-        </w:rPr>
-      </w:pPr>
-    </w:p>
-    <w:p>
-      <w:pPr>
-        <w:pStyle w:val="Texto-Resumo"/>
-        <w:spacing w:after="0" w:line="360" w:lineRule="auto"/>
-        <w:jc w:val="left"/>
-        <w:rPr>
-          <w:b/>
-          <w:szCs w:val="24"/>
-        </w:rPr>
-      </w:pPr>
-      <w:r>
-        <w:rPr>
-          <w:b/>
-          <w:szCs w:val="24"/>
-        </w:rPr>
+        <w:lastRenderedPageBreak/>
         <w:t>3. CONSIDERAÇÕES FINAIS</w:t>
       </w:r>
     </w:p>
@@ -2612,33 +2821,36 @@
       <w:pPr>
         <w:pStyle w:val="Texto-Resumo"/>
         <w:spacing w:after="0" w:line="360" w:lineRule="auto"/>
-        <w:rPr>
-          <w:bCs/>
-        </w:rPr>
-      </w:pPr>
-    </w:p>
-    <w:p>
-      <w:pPr>
-        <w:pStyle w:val="Texto-Resumo"/>
-        <w:spacing w:after="0" w:line="360" w:lineRule="auto"/>
-        <w:rPr>
-          <w:bCs/>
-        </w:rPr>
-      </w:pPr>
-    </w:p>
-    <w:p>
-      <w:pPr>
-        <w:pStyle w:val="Texto-Resumo"/>
-        <w:spacing w:after="0" w:line="360" w:lineRule="auto"/>
-        <w:jc w:val="left"/>
-        <w:rPr>
-          <w:b/>
-        </w:rPr>
-      </w:pPr>
-      <w:r>
-        <w:rPr>
-          <w:b/>
-        </w:rPr>
+        <w:jc w:val="left"/>
+        <w:rPr>
+          <w:bCs/>
+        </w:rPr>
+      </w:pPr>
+    </w:p>
+    <w:p>
+      <w:pPr>
+        <w:pStyle w:val="Texto-Resumo"/>
+        <w:spacing w:after="0" w:line="360" w:lineRule="auto"/>
+        <w:jc w:val="left"/>
+        <w:rPr>
+          <w:b/>
+        </w:rPr>
+      </w:pPr>
+    </w:p>
+    <w:p>
+      <w:pPr>
+        <w:pStyle w:val="Texto-Resumo"/>
+        <w:spacing w:after="0" w:line="360" w:lineRule="auto"/>
+        <w:jc w:val="left"/>
+        <w:rPr>
+          <w:b/>
+        </w:rPr>
+      </w:pPr>
+      <w:r>
+        <w:rPr>
+          <w:b/>
+        </w:rPr>
+        <w:lastRenderedPageBreak/>
         <w:t>REFERÊNCIAS</w:t>
       </w:r>
     </w:p>
@@ -2706,6 +2918,8 @@
           <w:szCs w:val="22"/>
         </w:rPr>
       </w:pPr>
+      <w:bookmarkStart w:id="0" w:name="_GoBack"/>
+      <w:bookmarkEnd w:id="0"/>
     </w:p>
     <w:p>
       <w:pPr>
@@ -2731,12 +2945,38 @@
       </w:pPr>
       <w:r>
         <w:rPr>
-          <w:rFonts w:cs="Arial"/>
-          <w:bCs/>
           <w:sz w:val="22"/>
           <w:szCs w:val="22"/>
         </w:rPr>
+        <w:t xml:space="preserve">UNIÃO BRASILEIRA DOS ESTUDANTES SECUNDARISTAS (UBES). A importância de estudar história nas escolas. Brasília, 30 nov. 2024. Disponível em: </w:t>
+      </w:r>
+      <w:r>
+        <w:rPr>
+          <w:sz w:val="22"/>
+          <w:szCs w:val="22"/>
+        </w:rPr>
         <w:t>https://www.ubes.org.br/2024/a-importancia-de-estudar-historia-nas-escolas/</w:t>
+      </w:r>
+      <w:r>
+        <w:rPr>
+          <w:sz w:val="22"/>
+          <w:szCs w:val="22"/>
+        </w:rPr>
+        <w:t xml:space="preserve">. Acesso em: </w:t>
+      </w:r>
+      <w:r>
+        <w:rPr>
+          <w:sz w:val="22"/>
+          <w:szCs w:val="22"/>
+        </w:rPr>
+        <w:t>21 maio</w:t>
+      </w:r>
+      <w:r>
+        <w:rPr>
+          <w:sz w:val="22"/>
+          <w:szCs w:val="22"/>
+        </w:rPr>
+        <w:t>. 2026.</w:t>
       </w:r>
     </w:p>
     <w:sectPr>
@@ -2752,7 +2992,7 @@
 </file>
 
 <file path=word/endnotes.xml><?xml version="1.0" encoding="utf-8"?>
-<w:endnotes xmlns:wpc="http://schemas.microsoft.com/office/word/2010/wordprocessingCanvas" xmlns:cx="http://schemas.microsoft.com/office/drawing/2014/chartex" xmlns:cx1="http://schemas.microsoft.com/office/drawing/2015/9/8/chartex" xmlns:cx2="http://schemas.microsoft.com/office/drawing/2015/10/21/chartex" xmlns:cx3="http://schemas.microsoft.com/office/drawing/2016/5/9/chartex" xmlns:cx4="http://schemas.microsoft.com/office/drawing/2016/5/10/chartex" xmlns:cx5="http://schemas.microsoft.com/office/drawing/2016/5/11/chartex" xmlns:cx6="http://schemas.microsoft.com/office/drawing/2016/5/12/chartex" xmlns:cx7="http://schemas.microsoft.com/office/drawing/2016/5/13/chartex" xmlns:cx8="http://schemas.microsoft.com/office/drawing/2016/5/14/chartex" xmlns:mc="http://schemas.openxmlformats.org/markup-compatibility/2006" xmlns:aink="http://schemas.microsoft.com/office/drawing/2016/ink" xmlns:am3d="http://schemas.microsoft.com/office/drawing/2017/model3d" xmlns:o="urn:schemas-microsoft-com:office:office" xmlns:oel="http://schemas.microsoft.com/office/2019/extlst" xmlns:r="http://schemas.openxmlformats.org/officeDocument/2006/relationships" xmlns:m="http://schemas.openxmlformats.org/officeDocument/2006/math" xmlns:v="urn:schemas-microsoft-com:vml" xmlns:wp14="http://schemas.microsoft.com/office/word/2010/wordprocessingDrawing" xmlns:wp="http://schemas.openxmlformats.org/drawingml/2006/wordprocessingDrawing" xmlns:w10="urn:schemas-microsoft-com:office:word" xmlns:w="http://schemas.openxmlformats.org/wordprocessingml/2006/main" xmlns:w14="http://schemas.microsoft.com/office/word/2010/wordml" xmlns:w15="http://schemas.microsoft.com/office/word/2012/wordml" xmlns:w16cex="http://schemas.microsoft.com/office/word/2018/wordml/cex" xmlns:w16cid="http://schemas.microsoft.com/office/word/2016/wordml/cid" xmlns:w16="http://schemas.microsoft.com/office/word/2018/wordml" xmlns:w16du="http://schemas.microsoft.com/office/word/2023/wordml/word16du" xmlns:w16sdtdh="http://schemas.microsoft.com/office/word/2020/wordml/sdtdatahash" xmlns:w16sdtfl="http://schemas.microsoft.com/office/word/2024/wordml/sdtformatlock" xmlns:w16se="http://schemas.microsoft.com/office/word/2015/wordml/symex" xmlns:wpg="http://schemas.microsoft.com/office/word/2010/wordprocessingGroup" xmlns:wpi="http://schemas.microsoft.com/office/word/2010/wordprocessingInk" xmlns:wne="http://schemas.microsoft.com/office/word/2006/wordml" xmlns:wps="http://schemas.microsoft.com/office/word/2010/wordprocessingShape" mc:Ignorable="w14 w15 w16se w16cid w16 w16cex w16sdtdh w16sdtfl w16du wp14">
+<w:endnotes xmlns:wpc="http://schemas.microsoft.com/office/word/2010/wordprocessingCanvas" xmlns:cx="http://schemas.microsoft.com/office/drawing/2014/chartex" xmlns:cx1="http://schemas.microsoft.com/office/drawing/2015/9/8/chartex" xmlns:mc="http://schemas.openxmlformats.org/markup-compatibility/2006" xmlns:o="urn:schemas-microsoft-com:office:office" xmlns:r="http://schemas.openxmlformats.org/officeDocument/2006/relationships" xmlns:m="http://schemas.openxmlformats.org/officeDocument/2006/math" xmlns:v="urn:schemas-microsoft-com:vml" xmlns:wp14="http://schemas.microsoft.com/office/word/2010/wordprocessingDrawing" xmlns:wp="http://schemas.openxmlformats.org/drawingml/2006/wordprocessingDrawing" xmlns:w10="urn:schemas-microsoft-com:office:word" xmlns:w="http://schemas.openxmlformats.org/wordprocessingml/2006/main" xmlns:w14="http://schemas.microsoft.com/office/word/2010/wordml" xmlns:w15="http://schemas.microsoft.com/office/word/2012/wordml" xmlns:w16se="http://schemas.microsoft.com/office/word/2015/wordml/symex" xmlns:wpg="http://schemas.microsoft.com/office/word/2010/wordprocessingGroup" xmlns:wpi="http://schemas.microsoft.com/office/word/2010/wordprocessingInk" xmlns:wne="http://schemas.microsoft.com/office/word/2006/wordml" xmlns:wps="http://schemas.microsoft.com/office/word/2010/wordprocessingShape" mc:Ignorable="w14 w15 w16se wp14">
   <w:endnote w:type="separator" w:id="-1">
     <w:p>
       <w:r>
@@ -2771,7 +3011,7 @@
 </file>
 
 <file path=word/footer1.xml><?xml version="1.0" encoding="utf-8"?>
-<w:ftr xmlns:wpc="http://schemas.microsoft.com/office/word/2010/wordprocessingCanvas" xmlns:cx="http://schemas.microsoft.com/office/drawing/2014/chartex" xmlns:cx1="http://schemas.microsoft.com/office/drawing/2015/9/8/chartex" xmlns:cx2="http://schemas.microsoft.com/office/drawing/2015/10/21/chartex" xmlns:cx3="http://schemas.microsoft.com/office/drawing/2016/5/9/chartex" xmlns:cx4="http://schemas.microsoft.com/office/drawing/2016/5/10/chartex" xmlns:cx5="http://schemas.microsoft.com/office/drawing/2016/5/11/chartex" xmlns:cx6="http://schemas.microsoft.com/office/drawing/2016/5/12/chartex" xmlns:cx7="http://schemas.microsoft.com/office/drawing/2016/5/13/chartex" xmlns:cx8="http://schemas.microsoft.com/office/drawing/2016/5/14/chartex" xmlns:mc="http://schemas.openxmlformats.org/markup-compatibility/2006" xmlns:aink="http://schemas.microsoft.com/office/drawing/2016/ink" xmlns:am3d="http://schemas.microsoft.com/office/drawing/2017/model3d" xmlns:o="urn:schemas-microsoft-com:office:office" xmlns:oel="http://schemas.microsoft.com/office/2019/extlst" xmlns:r="http://schemas.openxmlformats.org/officeDocument/2006/relationships" xmlns:m="http://schemas.openxmlformats.org/officeDocument/2006/math" xmlns:v="urn:schemas-microsoft-com:vml" xmlns:wp14="http://schemas.microsoft.com/office/word/2010/wordprocessingDrawing" xmlns:wp="http://schemas.openxmlformats.org/drawingml/2006/wordprocessingDrawing" xmlns:w10="urn:schemas-microsoft-com:office:word" xmlns:w="http://schemas.openxmlformats.org/wordprocessingml/2006/main" xmlns:w14="http://schemas.microsoft.com/office/word/2010/wordml" xmlns:w15="http://schemas.microsoft.com/office/word/2012/wordml" xmlns:w16cex="http://schemas.microsoft.com/office/word/2018/wordml/cex" xmlns:w16cid="http://schemas.microsoft.com/office/word/2016/wordml/cid" xmlns:w16="http://schemas.microsoft.com/office/word/2018/wordml" xmlns:w16du="http://schemas.microsoft.com/office/word/2023/wordml/word16du" xmlns:w16sdtdh="http://schemas.microsoft.com/office/word/2020/wordml/sdtdatahash" xmlns:w16sdtfl="http://schemas.microsoft.com/office/word/2024/wordml/sdtformatlock" xmlns:w16se="http://schemas.microsoft.com/office/word/2015/wordml/symex" xmlns:wpg="http://schemas.microsoft.com/office/word/2010/wordprocessingGroup" xmlns:wpi="http://schemas.microsoft.com/office/word/2010/wordprocessingInk" xmlns:wne="http://schemas.microsoft.com/office/word/2006/wordml" xmlns:wps="http://schemas.microsoft.com/office/word/2010/wordprocessingShape" mc:Ignorable="w14 w15 w16se w16cid w16 w16cex w16sdtdh w16sdtfl w16du wp14">
+<w:ftr xmlns:wpc="http://schemas.microsoft.com/office/word/2010/wordprocessingCanvas" xmlns:cx="http://schemas.microsoft.com/office/drawing/2014/chartex" xmlns:cx1="http://schemas.microsoft.com/office/drawing/2015/9/8/chartex" xmlns:mc="http://schemas.openxmlformats.org/markup-compatibility/2006" xmlns:o="urn:schemas-microsoft-com:office:office" xmlns:r="http://schemas.openxmlformats.org/officeDocument/2006/relationships" xmlns:m="http://schemas.openxmlformats.org/officeDocument/2006/math" xmlns:v="urn:schemas-microsoft-com:vml" xmlns:wp14="http://schemas.microsoft.com/office/word/2010/wordprocessingDrawing" xmlns:wp="http://schemas.openxmlformats.org/drawingml/2006/wordprocessingDrawing" xmlns:w10="urn:schemas-microsoft-com:office:word" xmlns:w="http://schemas.openxmlformats.org/wordprocessingml/2006/main" xmlns:w14="http://schemas.microsoft.com/office/word/2010/wordml" xmlns:w15="http://schemas.microsoft.com/office/word/2012/wordml" xmlns:w16se="http://schemas.microsoft.com/office/word/2015/wordml/symex" xmlns:wpg="http://schemas.microsoft.com/office/word/2010/wordprocessingGroup" xmlns:wpi="http://schemas.microsoft.com/office/word/2010/wordprocessingInk" xmlns:wne="http://schemas.microsoft.com/office/word/2006/wordml" xmlns:wps="http://schemas.microsoft.com/office/word/2010/wordprocessingShape" mc:Ignorable="w14 w15 w16se wp14">
   <w:p>
     <w:pPr>
       <w:pStyle w:val="Rodap"/>
@@ -2845,7 +3085,7 @@
 </file>
 
 <file path=word/footnotes.xml><?xml version="1.0" encoding="utf-8"?>
-<w:footnotes xmlns:wpc="http://schemas.microsoft.com/office/word/2010/wordprocessingCanvas" xmlns:cx="http://schemas.microsoft.com/office/drawing/2014/chartex" xmlns:cx1="http://schemas.microsoft.com/office/drawing/2015/9/8/chartex" xmlns:cx2="http://schemas.microsoft.com/office/drawing/2015/10/21/chartex" xmlns:cx3="http://schemas.microsoft.com/office/drawing/2016/5/9/chartex" xmlns:cx4="http://schemas.microsoft.com/office/drawing/2016/5/10/chartex" xmlns:cx5="http://schemas.microsoft.com/office/drawing/2016/5/11/chartex" xmlns:cx6="http://schemas.microsoft.com/office/drawing/2016/5/12/chartex" xmlns:cx7="http://schemas.microsoft.com/office/drawing/2016/5/13/chartex" xmlns:cx8="http://schemas.microsoft.com/office/drawing/2016/5/14/chartex" xmlns:mc="http://schemas.openxmlformats.org/markup-compatibility/2006" xmlns:aink="http://schemas.microsoft.com/office/drawing/2016/ink" xmlns:am3d="http://schemas.microsoft.com/office/drawing/2017/model3d" xmlns:o="urn:schemas-microsoft-com:office:office" xmlns:oel="http://schemas.microsoft.com/office/2019/extlst" xmlns:r="http://schemas.openxmlformats.org/officeDocument/2006/relationships" xmlns:m="http://schemas.openxmlformats.org/officeDocument/2006/math" xmlns:v="urn:schemas-microsoft-com:vml" xmlns:wp14="http://schemas.microsoft.com/office/word/2010/wordprocessingDrawing" xmlns:wp="http://schemas.openxmlformats.org/drawingml/2006/wordprocessingDrawing" xmlns:w10="urn:schemas-microsoft-com:office:word" xmlns:w="http://schemas.openxmlformats.org/wordprocessingml/2006/main" xmlns:w14="http://schemas.microsoft.com/office/word/2010/wordml" xmlns:w15="http://schemas.microsoft.com/office/word/2012/wordml" xmlns:w16cex="http://schemas.microsoft.com/office/word/2018/wordml/cex" xmlns:w16cid="http://schemas.microsoft.com/office/word/2016/wordml/cid" xmlns:w16="http://schemas.microsoft.com/office/word/2018/wordml" xmlns:w16du="http://schemas.microsoft.com/office/word/2023/wordml/word16du" xmlns:w16sdtdh="http://schemas.microsoft.com/office/word/2020/wordml/sdtdatahash" xmlns:w16sdtfl="http://schemas.microsoft.com/office/word/2024/wordml/sdtformatlock" xmlns:w16se="http://schemas.microsoft.com/office/word/2015/wordml/symex" xmlns:wpg="http://schemas.microsoft.com/office/word/2010/wordprocessingGroup" xmlns:wpi="http://schemas.microsoft.com/office/word/2010/wordprocessingInk" xmlns:wne="http://schemas.microsoft.com/office/word/2006/wordml" xmlns:wps="http://schemas.microsoft.com/office/word/2010/wordprocessingShape" mc:Ignorable="w14 w15 w16se w16cid w16 w16cex w16sdtdh w16sdtfl w16du wp14">
+<w:footnotes xmlns:wpc="http://schemas.microsoft.com/office/word/2010/wordprocessingCanvas" xmlns:cx="http://schemas.microsoft.com/office/drawing/2014/chartex" xmlns:cx1="http://schemas.microsoft.com/office/drawing/2015/9/8/chartex" xmlns:mc="http://schemas.openxmlformats.org/markup-compatibility/2006" xmlns:o="urn:schemas-microsoft-com:office:office" xmlns:r="http://schemas.openxmlformats.org/officeDocument/2006/relationships" xmlns:m="http://schemas.openxmlformats.org/officeDocument/2006/math" xmlns:v="urn:schemas-microsoft-com:vml" xmlns:wp14="http://schemas.microsoft.com/office/word/2010/wordprocessingDrawing" xmlns:wp="http://schemas.openxmlformats.org/drawingml/2006/wordprocessingDrawing" xmlns:w10="urn:schemas-microsoft-com:office:word" xmlns:w="http://schemas.openxmlformats.org/wordprocessingml/2006/main" xmlns:w14="http://schemas.microsoft.com/office/word/2010/wordml" xmlns:w15="http://schemas.microsoft.com/office/word/2012/wordml" xmlns:w16se="http://schemas.microsoft.com/office/word/2015/wordml/symex" xmlns:wpg="http://schemas.microsoft.com/office/word/2010/wordprocessingGroup" xmlns:wpi="http://schemas.microsoft.com/office/word/2010/wordprocessingInk" xmlns:wne="http://schemas.microsoft.com/office/word/2006/wordml" xmlns:wps="http://schemas.microsoft.com/office/word/2010/wordprocessingShape" mc:Ignorable="w14 w15 w16se wp14">
   <w:footnote w:type="separator" w:id="-1">
     <w:p>
       <w:r>
@@ -2864,7 +3104,7 @@
 </file>
 
 <file path=word/header1.xml><?xml version="1.0" encoding="utf-8"?>
-<w:hdr xmlns:wpc="http://schemas.microsoft.com/office/word/2010/wordprocessingCanvas" xmlns:cx="http://schemas.microsoft.com/office/drawing/2014/chartex" xmlns:cx1="http://schemas.microsoft.com/office/drawing/2015/9/8/chartex" xmlns:cx2="http://schemas.microsoft.com/office/drawing/2015/10/21/chartex" xmlns:cx3="http://schemas.microsoft.com/office/drawing/2016/5/9/chartex" xmlns:cx4="http://schemas.microsoft.com/office/drawing/2016/5/10/chartex" xmlns:cx5="http://schemas.microsoft.com/office/drawing/2016/5/11/chartex" xmlns:cx6="http://schemas.microsoft.com/office/drawing/2016/5/12/chartex" xmlns:cx7="http://schemas.microsoft.com/office/drawing/2016/5/13/chartex" xmlns:cx8="http://schemas.microsoft.com/office/drawing/2016/5/14/chartex" xmlns:mc="http://schemas.openxmlformats.org/markup-compatibility/2006" xmlns:aink="http://schemas.microsoft.com/office/drawing/2016/ink" xmlns:am3d="http://schemas.microsoft.com/office/drawing/2017/model3d" xmlns:o="urn:schemas-microsoft-com:office:office" xmlns:oel="http://schemas.microsoft.com/office/2019/extlst" xmlns:r="http://schemas.openxmlformats.org/officeDocument/2006/relationships" xmlns:m="http://schemas.openxmlformats.org/officeDocument/2006/math" xmlns:v="urn:schemas-microsoft-com:vml" xmlns:wp14="http://schemas.microsoft.com/office/word/2010/wordprocessingDrawing" xmlns:wp="http://schemas.openxmlformats.org/drawingml/2006/wordprocessingDrawing" xmlns:w10="urn:schemas-microsoft-com:office:word" xmlns:w="http://schemas.openxmlformats.org/wordprocessingml/2006/main" xmlns:w14="http://schemas.microsoft.com/office/word/2010/wordml" xmlns:w15="http://schemas.microsoft.com/office/word/2012/wordml" xmlns:w16cex="http://schemas.microsoft.com/office/word/2018/wordml/cex" xmlns:w16cid="http://schemas.microsoft.com/office/word/2016/wordml/cid" xmlns:w16="http://schemas.microsoft.com/office/word/2018/wordml" xmlns:w16du="http://schemas.microsoft.com/office/word/2023/wordml/word16du" xmlns:w16sdtdh="http://schemas.microsoft.com/office/word/2020/wordml/sdtdatahash" xmlns:w16sdtfl="http://schemas.microsoft.com/office/word/2024/wordml/sdtformatlock" xmlns:w16se="http://schemas.microsoft.com/office/word/2015/wordml/symex" xmlns:wpg="http://schemas.microsoft.com/office/word/2010/wordprocessingGroup" xmlns:wpi="http://schemas.microsoft.com/office/word/2010/wordprocessingInk" xmlns:wne="http://schemas.microsoft.com/office/word/2006/wordml" xmlns:wps="http://schemas.microsoft.com/office/word/2010/wordprocessingShape" mc:Ignorable="w14 w15 w16se w16cid w16 w16cex w16sdtdh w16sdtfl w16du wp14">
+<w:hdr xmlns:wpc="http://schemas.microsoft.com/office/word/2010/wordprocessingCanvas" xmlns:cx="http://schemas.microsoft.com/office/drawing/2014/chartex" xmlns:cx1="http://schemas.microsoft.com/office/drawing/2015/9/8/chartex" xmlns:mc="http://schemas.openxmlformats.org/markup-compatibility/2006" xmlns:o="urn:schemas-microsoft-com:office:office" xmlns:r="http://schemas.openxmlformats.org/officeDocument/2006/relationships" xmlns:m="http://schemas.openxmlformats.org/officeDocument/2006/math" xmlns:v="urn:schemas-microsoft-com:vml" xmlns:wp14="http://schemas.microsoft.com/office/word/2010/wordprocessingDrawing" xmlns:wp="http://schemas.openxmlformats.org/drawingml/2006/wordprocessingDrawing" xmlns:w10="urn:schemas-microsoft-com:office:word" xmlns:w="http://schemas.openxmlformats.org/wordprocessingml/2006/main" xmlns:w14="http://schemas.microsoft.com/office/word/2010/wordml" xmlns:w15="http://schemas.microsoft.com/office/word/2012/wordml" xmlns:w16se="http://schemas.microsoft.com/office/word/2015/wordml/symex" xmlns:wpg="http://schemas.microsoft.com/office/word/2010/wordprocessingGroup" xmlns:wpi="http://schemas.microsoft.com/office/word/2010/wordprocessingInk" xmlns:wne="http://schemas.microsoft.com/office/word/2006/wordml" xmlns:wps="http://schemas.microsoft.com/office/word/2010/wordprocessingShape" mc:Ignorable="w14 w15 w16se wp14">
   <w:p>
     <w:pPr>
       <w:pStyle w:val="Cabealho"/>
@@ -2875,7 +3115,7 @@
 </file>
 
 <file path=word/header2.xml><?xml version="1.0" encoding="utf-8"?>
-<w:hdr xmlns:wpc="http://schemas.microsoft.com/office/word/2010/wordprocessingCanvas" xmlns:cx="http://schemas.microsoft.com/office/drawing/2014/chartex" xmlns:cx1="http://schemas.microsoft.com/office/drawing/2015/9/8/chartex" xmlns:cx2="http://schemas.microsoft.com/office/drawing/2015/10/21/chartex" xmlns:cx3="http://schemas.microsoft.com/office/drawing/2016/5/9/chartex" xmlns:cx4="http://schemas.microsoft.com/office/drawing/2016/5/10/chartex" xmlns:cx5="http://schemas.microsoft.com/office/drawing/2016/5/11/chartex" xmlns:cx6="http://schemas.microsoft.com/office/drawing/2016/5/12/chartex" xmlns:cx7="http://schemas.microsoft.com/office/drawing/2016/5/13/chartex" xmlns:cx8="http://schemas.microsoft.com/office/drawing/2016/5/14/chartex" xmlns:mc="http://schemas.openxmlformats.org/markup-compatibility/2006" xmlns:aink="http://schemas.microsoft.com/office/drawing/2016/ink" xmlns:am3d="http://schemas.microsoft.com/office/drawing/2017/model3d" xmlns:o="urn:schemas-microsoft-com:office:office" xmlns:oel="http://schemas.microsoft.com/office/2019/extlst" xmlns:r="http://schemas.openxmlformats.org/officeDocument/2006/relationships" xmlns:m="http://schemas.openxmlformats.org/officeDocument/2006/math" xmlns:v="urn:schemas-microsoft-com:vml" xmlns:wp14="http://schemas.microsoft.com/office/word/2010/wordprocessingDrawing" xmlns:wp="http://schemas.openxmlformats.org/drawingml/2006/wordprocessingDrawing" xmlns:w10="urn:schemas-microsoft-com:office:word" xmlns:w="http://schemas.openxmlformats.org/wordprocessingml/2006/main" xmlns:w14="http://schemas.microsoft.com/office/word/2010/wordml" xmlns:w15="http://schemas.microsoft.com/office/word/2012/wordml" xmlns:w16cex="http://schemas.microsoft.com/office/word/2018/wordml/cex" xmlns:w16cid="http://schemas.microsoft.com/office/word/2016/wordml/cid" xmlns:w16="http://schemas.microsoft.com/office/word/2018/wordml" xmlns:w16du="http://schemas.microsoft.com/office/word/2023/wordml/word16du" xmlns:w16sdtdh="http://schemas.microsoft.com/office/word/2020/wordml/sdtdatahash" xmlns:w16sdtfl="http://schemas.microsoft.com/office/word/2024/wordml/sdtformatlock" xmlns:w16se="http://schemas.microsoft.com/office/word/2015/wordml/symex" xmlns:wpg="http://schemas.microsoft.com/office/word/2010/wordprocessingGroup" xmlns:wpi="http://schemas.microsoft.com/office/word/2010/wordprocessingInk" xmlns:wne="http://schemas.microsoft.com/office/word/2006/wordml" xmlns:wps="http://schemas.microsoft.com/office/word/2010/wordprocessingShape" mc:Ignorable="w14 w15 w16se w16cid w16 w16cex w16sdtdh w16sdtfl w16du wp14">
+<w:hdr xmlns:wpc="http://schemas.microsoft.com/office/word/2010/wordprocessingCanvas" xmlns:cx="http://schemas.microsoft.com/office/drawing/2014/chartex" xmlns:cx1="http://schemas.microsoft.com/office/drawing/2015/9/8/chartex" xmlns:mc="http://schemas.openxmlformats.org/markup-compatibility/2006" xmlns:o="urn:schemas-microsoft-com:office:office" xmlns:r="http://schemas.openxmlformats.org/officeDocument/2006/relationships" xmlns:m="http://schemas.openxmlformats.org/officeDocument/2006/math" xmlns:v="urn:schemas-microsoft-com:vml" xmlns:wp14="http://schemas.microsoft.com/office/word/2010/wordprocessingDrawing" xmlns:wp="http://schemas.openxmlformats.org/drawingml/2006/wordprocessingDrawing" xmlns:w10="urn:schemas-microsoft-com:office:word" xmlns:w="http://schemas.openxmlformats.org/wordprocessingml/2006/main" xmlns:w14="http://schemas.microsoft.com/office/word/2010/wordml" xmlns:w15="http://schemas.microsoft.com/office/word/2012/wordml" xmlns:w16se="http://schemas.microsoft.com/office/word/2015/wordml/symex" xmlns:wpg="http://schemas.microsoft.com/office/word/2010/wordprocessingGroup" xmlns:wpi="http://schemas.microsoft.com/office/word/2010/wordprocessingInk" xmlns:wne="http://schemas.microsoft.com/office/word/2006/wordml" xmlns:wps="http://schemas.microsoft.com/office/word/2010/wordprocessingShape" mc:Ignorable="w14 w15 w16se wp14">
   <w:sdt>
     <w:sdtPr>
       <w:id w:val="1684550503"/>
@@ -2884,6 +3124,7 @@
         <w:docPartUnique/>
       </w:docPartObj>
     </w:sdtPr>
+    <w:sdtEndPr/>
     <w:sdtContent>
       <w:p>
         <w:pPr>
@@ -2903,7 +3144,7 @@
           <w:rPr>
             <w:noProof/>
           </w:rPr>
-          <w:t>6</w:t>
+          <w:t>9</w:t>
         </w:r>
         <w:r>
           <w:fldChar w:fldCharType="end"/>
@@ -2920,7 +3161,7 @@
 </file>
 
 <file path=word/numbering.xml><?xml version="1.0" encoding="utf-8"?>
-<w:numbering xmlns:wpc="http://schemas.microsoft.com/office/word/2010/wordprocessingCanvas" xmlns:cx="http://schemas.microsoft.com/office/drawing/2014/chartex" xmlns:cx1="http://schemas.microsoft.com/office/drawing/2015/9/8/chartex" xmlns:cx2="http://schemas.microsoft.com/office/drawing/2015/10/21/chartex" xmlns:cx3="http://schemas.microsoft.com/office/drawing/2016/5/9/chartex" xmlns:cx4="http://schemas.microsoft.com/office/drawing/2016/5/10/chartex" xmlns:cx5="http://schemas.microsoft.com/office/drawing/2016/5/11/chartex" xmlns:cx6="http://schemas.microsoft.com/office/drawing/2016/5/12/chartex" xmlns:cx7="http://schemas.microsoft.com/office/drawing/2016/5/13/chartex" xmlns:cx8="http://schemas.microsoft.com/office/drawing/2016/5/14/chartex" xmlns:mc="http://schemas.openxmlformats.org/markup-compatibility/2006" xmlns:aink="http://schemas.microsoft.com/office/drawing/2016/ink" xmlns:am3d="http://schemas.microsoft.com/office/drawing/2017/model3d" xmlns:o="urn:schemas-microsoft-com:office:office" xmlns:oel="http://schemas.microsoft.com/office/2019/extlst" xmlns:r="http://schemas.openxmlformats.org/officeDocument/2006/relationships" xmlns:m="http://schemas.openxmlformats.org/officeDocument/2006/math" xmlns:v="urn:schemas-microsoft-com:vml" xmlns:wp14="http://schemas.microsoft.com/office/word/2010/wordprocessingDrawing" xmlns:wp="http://schemas.openxmlformats.org/drawingml/2006/wordprocessingDrawing" xmlns:w10="urn:schemas-microsoft-com:office:word" xmlns:w="http://schemas.openxmlformats.org/wordprocessingml/2006/main" xmlns:w14="http://schemas.microsoft.com/office/word/2010/wordml" xmlns:w15="http://schemas.microsoft.com/office/word/2012/wordml" xmlns:w16cex="http://schemas.microsoft.com/office/word/2018/wordml/cex" xmlns:w16cid="http://schemas.microsoft.com/office/word/2016/wordml/cid" xmlns:w16="http://schemas.microsoft.com/office/word/2018/wordml" xmlns:w16du="http://schemas.microsoft.com/office/word/2023/wordml/word16du" xmlns:w16sdtdh="http://schemas.microsoft.com/office/word/2020/wordml/sdtdatahash" xmlns:w16sdtfl="http://schemas.microsoft.com/office/word/2024/wordml/sdtformatlock" xmlns:w16se="http://schemas.microsoft.com/office/word/2015/wordml/symex" xmlns:wpg="http://schemas.microsoft.com/office/word/2010/wordprocessingGroup" xmlns:wpi="http://schemas.microsoft.com/office/word/2010/wordprocessingInk" xmlns:wne="http://schemas.microsoft.com/office/word/2006/wordml" xmlns:wps="http://schemas.microsoft.com/office/word/2010/wordprocessingShape" mc:Ignorable="w14 w15 w16se w16cid w16 w16cex w16sdtdh w16sdtfl w16du wp14">
+<w:numbering xmlns:wpc="http://schemas.microsoft.com/office/word/2010/wordprocessingCanvas" xmlns:cx="http://schemas.microsoft.com/office/drawing/2014/chartex" xmlns:cx1="http://schemas.microsoft.com/office/drawing/2015/9/8/chartex" xmlns:mc="http://schemas.openxmlformats.org/markup-compatibility/2006" xmlns:o="urn:schemas-microsoft-com:office:office" xmlns:r="http://schemas.openxmlformats.org/officeDocument/2006/relationships" xmlns:m="http://schemas.openxmlformats.org/officeDocument/2006/math" xmlns:v="urn:schemas-microsoft-com:vml" xmlns:wp14="http://schemas.microsoft.com/office/word/2010/wordprocessingDrawing" xmlns:wp="http://schemas.openxmlformats.org/drawingml/2006/wordprocessingDrawing" xmlns:w10="urn:schemas-microsoft-com:office:word" xmlns:w="http://schemas.openxmlformats.org/wordprocessingml/2006/main" xmlns:w14="http://schemas.microsoft.com/office/word/2010/wordml" xmlns:w15="http://schemas.microsoft.com/office/word/2012/wordml" xmlns:w16se="http://schemas.microsoft.com/office/word/2015/wordml/symex" xmlns:wpg="http://schemas.microsoft.com/office/word/2010/wordprocessingGroup" xmlns:wpi="http://schemas.microsoft.com/office/word/2010/wordprocessingInk" xmlns:wne="http://schemas.microsoft.com/office/word/2006/wordml" xmlns:wps="http://schemas.microsoft.com/office/word/2010/wordprocessingShape" mc:Ignorable="w14 w15 w16se wp14">
   <w:abstractNum w:abstractNumId="0" w15:restartNumberingAfterBreak="0">
     <w:nsid w:val="1E6535D4"/>
     <w:multiLevelType w:val="multilevel"/>
@@ -3393,23 +3634,23 @@
       </w:pPr>
     </w:lvl>
   </w:abstractNum>
-  <w:num w:numId="1" w16cid:durableId="1368142790">
+  <w:num w:numId="1">
     <w:abstractNumId w:val="3"/>
   </w:num>
-  <w:num w:numId="2" w16cid:durableId="1832334015">
+  <w:num w:numId="2">
     <w:abstractNumId w:val="1"/>
   </w:num>
-  <w:num w:numId="3" w16cid:durableId="1398934964">
+  <w:num w:numId="3">
     <w:abstractNumId w:val="0"/>
   </w:num>
-  <w:num w:numId="4" w16cid:durableId="970788587">
+  <w:num w:numId="4">
     <w:abstractNumId w:val="2"/>
   </w:num>
 </w:numbering>
 </file>
 
 <file path=word/styles.xml><?xml version="1.0" encoding="utf-8"?>
-<w:styles xmlns:mc="http://schemas.openxmlformats.org/markup-compatibility/2006" xmlns:r="http://schemas.openxmlformats.org/officeDocument/2006/relationships" xmlns:w="http://schemas.openxmlformats.org/wordprocessingml/2006/main" xmlns:w14="http://schemas.microsoft.com/office/word/2010/wordml" xmlns:w15="http://schemas.microsoft.com/office/word/2012/wordml" xmlns:w16cex="http://schemas.microsoft.com/office/word/2018/wordml/cex" xmlns:w16cid="http://schemas.microsoft.com/office/word/2016/wordml/cid" xmlns:w16="http://schemas.microsoft.com/office/word/2018/wordml" xmlns:w16du="http://schemas.microsoft.com/office/word/2023/wordml/word16du" xmlns:w16sdtdh="http://schemas.microsoft.com/office/word/2020/wordml/sdtdatahash" xmlns:w16sdtfl="http://schemas.microsoft.com/office/word/2024/wordml/sdtformatlock" xmlns:w16se="http://schemas.microsoft.com/office/word/2015/wordml/symex" mc:Ignorable="w14 w15 w16se w16cid w16 w16cex w16sdtdh w16sdtfl w16du">
+<w:styles xmlns:mc="http://schemas.openxmlformats.org/markup-compatibility/2006" xmlns:r="http://schemas.openxmlformats.org/officeDocument/2006/relationships" xmlns:w="http://schemas.openxmlformats.org/wordprocessingml/2006/main" xmlns:w14="http://schemas.microsoft.com/office/word/2010/wordml" xmlns:w15="http://schemas.microsoft.com/office/word/2012/wordml" xmlns:w16se="http://schemas.microsoft.com/office/word/2015/wordml/symex" mc:Ignorable="w14 w15 w16se">
   <w:docDefaults>
     <w:rPrDefault>
       <w:rPr>
@@ -3425,7 +3666,7 @@
       </w:pPr>
     </w:pPrDefault>
   </w:docDefaults>
-  <w:latentStyles w:defLockedState="0" w:defUIPriority="99" w:defSemiHidden="0" w:defUnhideWhenUsed="0" w:defQFormat="0" w:count="376">
+  <w:latentStyles w:defLockedState="0" w:defUIPriority="99" w:defSemiHidden="0" w:defUnhideWhenUsed="0" w:defQFormat="0" w:count="371">
     <w:lsdException w:name="Normal" w:uiPriority="0" w:qFormat="1"/>
     <w:lsdException w:name="heading 1" w:uiPriority="9" w:qFormat="1"/>
     <w:lsdException w:name="heading 2" w:semiHidden="1" w:uiPriority="9" w:unhideWhenUsed="1" w:qFormat="1"/>
@@ -3797,11 +4038,6 @@
     <w:lsdException w:name="List Table 5 Dark Accent 6" w:uiPriority="50"/>
     <w:lsdException w:name="List Table 6 Colorful Accent 6" w:uiPriority="51"/>
     <w:lsdException w:name="List Table 7 Colorful Accent 6" w:uiPriority="52"/>
-    <w:lsdException w:name="Mention" w:semiHidden="1" w:unhideWhenUsed="1"/>
-    <w:lsdException w:name="Smart Hyperlink" w:semiHidden="1" w:unhideWhenUsed="1"/>
-    <w:lsdException w:name="Hashtag" w:semiHidden="1" w:unhideWhenUsed="1"/>
-    <w:lsdException w:name="Unresolved Mention" w:semiHidden="1" w:unhideWhenUsed="1"/>
-    <w:lsdException w:name="Smart Link" w:semiHidden="1" w:unhideWhenUsed="1"/>
   </w:latentStyles>
   <w:style w:type="paragraph" w:default="1" w:styleId="Normal">
     <w:name w:val="Normal"/>
@@ -4021,6 +4257,18 @@
       <w:rFonts w:ascii="Times New Roman" w:hAnsi="Times New Roman"/>
       <w:snapToGrid/>
       <w:szCs w:val="24"/>
+    </w:rPr>
+  </w:style>
+  <w:style w:type="character" w:styleId="Hyperlink">
+    <w:name w:val="Hyperlink"/>
+    <w:basedOn w:val="Fontepargpadro"/>
+    <w:uiPriority w:val="99"/>
+    <w:semiHidden/>
+    <w:unhideWhenUsed/>
+    <w:rsid w:val="00DA5D5C"/>
+    <w:rPr>
+      <w:color w:val="0000FF"/>
+      <w:u w:val="single"/>
     </w:rPr>
   </w:style>
 </w:styles>
@@ -4292,7 +4540,7 @@
 </file>
 
 <file path=customXml/itemProps1.xml><?xml version="1.0" encoding="utf-8"?>
-<ds:datastoreItem xmlns:ds="http://schemas.openxmlformats.org/officeDocument/2006/customXml" ds:itemID="{D34DA10D-A492-4D08-BAD4-4CD594219B41}">
+<ds:datastoreItem xmlns:ds="http://schemas.openxmlformats.org/officeDocument/2006/customXml" ds:itemID="{085A1556-E6A0-4DC2-A3E6-3300AFC2CA60}">
   <ds:schemaRefs>
     <ds:schemaRef ds:uri="http://schemas.openxmlformats.org/officeDocument/2006/bibliography"/>
   </ds:schemaRefs>

</xml_diff>

<commit_message>
[create] Ponto 1.2 Hipóteses
Adicionando ao documento o ponto da hipótese; pequenas alterações na introdução e no problema, e vendo sobre gamificação
</commit_message>
<xml_diff>
--- a/2026/trabalhos/TCC/TCC_Historiando.docx
+++ b/2026/trabalhos/TCC/TCC_Historiando.docx
@@ -187,229 +187,206 @@
         <w:jc w:val="center"/>
         <w:rPr>
           <w:b/>
-        </w:rPr>
-      </w:pPr>
-    </w:p>
-    <w:p>
-      <w:pPr>
-        <w:spacing w:line="360" w:lineRule="auto"/>
-        <w:jc w:val="center"/>
-        <w:rPr>
-          <w:b/>
-        </w:rPr>
-      </w:pPr>
-    </w:p>
-    <w:p>
-      <w:pPr>
-        <w:spacing w:line="360" w:lineRule="auto"/>
-        <w:jc w:val="center"/>
-        <w:rPr>
-          <w:b/>
-        </w:rPr>
-      </w:pPr>
-    </w:p>
-    <w:p>
-      <w:pPr>
-        <w:spacing w:line="360" w:lineRule="auto"/>
-        <w:jc w:val="center"/>
-        <w:rPr>
-          <w:b/>
-        </w:rPr>
-      </w:pPr>
-    </w:p>
-    <w:p>
-      <w:pPr>
-        <w:spacing w:line="360" w:lineRule="auto"/>
-        <w:jc w:val="center"/>
-        <w:rPr>
-          <w:b/>
-        </w:rPr>
-      </w:pPr>
-    </w:p>
-    <w:p>
-      <w:pPr>
-        <w:pStyle w:val="TtulodoTrabalho"/>
-        <w:spacing w:line="360" w:lineRule="auto"/>
-        <w:rPr>
           <w:sz w:val="28"/>
           <w:szCs w:val="28"/>
         </w:rPr>
       </w:pPr>
       <w:r>
         <w:rPr>
+          <w:b/>
           <w:sz w:val="28"/>
           <w:szCs w:val="28"/>
         </w:rPr>
-        <w:t>Historiando</w:t>
-      </w:r>
-    </w:p>
-    <w:p>
-      <w:pPr>
-        <w:spacing w:line="360" w:lineRule="auto"/>
-        <w:jc w:val="center"/>
-        <w:rPr>
-          <w:b/>
-        </w:rPr>
-      </w:pPr>
-    </w:p>
-    <w:p>
-      <w:pPr>
-        <w:spacing w:line="360" w:lineRule="auto"/>
-        <w:jc w:val="center"/>
-        <w:rPr>
-          <w:b/>
-        </w:rPr>
-      </w:pPr>
-    </w:p>
-    <w:p>
-      <w:pPr>
-        <w:spacing w:line="360" w:lineRule="auto"/>
-        <w:jc w:val="center"/>
-        <w:rPr>
-          <w:b/>
-        </w:rPr>
-      </w:pPr>
-    </w:p>
-    <w:p>
-      <w:pPr>
-        <w:spacing w:line="360" w:lineRule="auto"/>
-        <w:jc w:val="center"/>
-        <w:rPr>
-          <w:b/>
-        </w:rPr>
-      </w:pPr>
-    </w:p>
-    <w:p>
-      <w:pPr>
-        <w:spacing w:line="360" w:lineRule="auto"/>
-        <w:jc w:val="center"/>
-        <w:rPr>
-          <w:b/>
-        </w:rPr>
-      </w:pPr>
-    </w:p>
-    <w:p>
-      <w:pPr>
-        <w:spacing w:line="360" w:lineRule="auto"/>
-        <w:jc w:val="center"/>
-        <w:rPr>
-          <w:b/>
-        </w:rPr>
-      </w:pPr>
-    </w:p>
-    <w:p>
-      <w:pPr>
-        <w:spacing w:line="360" w:lineRule="auto"/>
-        <w:jc w:val="center"/>
-        <w:rPr>
-          <w:b/>
-        </w:rPr>
-      </w:pPr>
-    </w:p>
-    <w:p>
-      <w:pPr>
-        <w:spacing w:line="360" w:lineRule="auto"/>
-        <w:jc w:val="center"/>
-        <w:rPr>
-          <w:b/>
-        </w:rPr>
-      </w:pPr>
-    </w:p>
-    <w:p>
-      <w:pPr>
-        <w:spacing w:line="360" w:lineRule="auto"/>
-        <w:jc w:val="center"/>
-        <w:rPr>
-          <w:b/>
-        </w:rPr>
-      </w:pPr>
-    </w:p>
-    <w:p>
-      <w:pPr>
-        <w:spacing w:line="360" w:lineRule="auto"/>
-        <w:jc w:val="right"/>
-        <w:rPr>
-          <w:b/>
-        </w:rPr>
-      </w:pPr>
-    </w:p>
-    <w:p>
-      <w:pPr>
-        <w:spacing w:line="360" w:lineRule="auto"/>
-        <w:jc w:val="center"/>
+        <w:t xml:space="preserve">Paola </w:t>
+      </w:r>
+      <w:proofErr w:type="spellStart"/>
+      <w:r>
         <w:rPr>
           <w:b/>
           <w:sz w:val="28"/>
           <w:szCs w:val="28"/>
         </w:rPr>
-      </w:pPr>
-      <w:r>
-        <w:rPr>
-          <w:b/>
+        <w:t>Lohana</w:t>
+      </w:r>
+      <w:proofErr w:type="spellEnd"/>
+    </w:p>
+    <w:p>
+      <w:pPr>
+        <w:spacing w:line="360" w:lineRule="auto"/>
+        <w:jc w:val="center"/>
+        <w:rPr>
+          <w:b/>
+        </w:rPr>
+      </w:pPr>
+    </w:p>
+    <w:p>
+      <w:pPr>
+        <w:spacing w:line="360" w:lineRule="auto"/>
+        <w:jc w:val="center"/>
+        <w:rPr>
+          <w:b/>
+        </w:rPr>
+      </w:pPr>
+    </w:p>
+    <w:p>
+      <w:pPr>
+        <w:spacing w:line="360" w:lineRule="auto"/>
+        <w:jc w:val="center"/>
+        <w:rPr>
+          <w:b/>
+        </w:rPr>
+      </w:pPr>
+    </w:p>
+    <w:p>
+      <w:pPr>
+        <w:spacing w:line="360" w:lineRule="auto"/>
+        <w:jc w:val="center"/>
+        <w:rPr>
+          <w:b/>
+        </w:rPr>
+      </w:pPr>
+    </w:p>
+    <w:p>
+      <w:pPr>
+        <w:spacing w:line="360" w:lineRule="auto"/>
+        <w:jc w:val="center"/>
+        <w:rPr>
+          <w:b/>
+        </w:rPr>
+      </w:pPr>
+    </w:p>
+    <w:p>
+      <w:pPr>
+        <w:pStyle w:val="TtulodoTrabalho"/>
+        <w:spacing w:line="360" w:lineRule="auto"/>
+        <w:rPr>
           <w:sz w:val="28"/>
           <w:szCs w:val="28"/>
         </w:rPr>
-        <w:t>Campinas</w:t>
-      </w:r>
-    </w:p>
-    <w:p>
-      <w:pPr>
-        <w:spacing w:line="360" w:lineRule="auto"/>
-        <w:jc w:val="center"/>
-        <w:rPr>
-          <w:b/>
+      </w:pPr>
+      <w:r>
+        <w:rPr>
           <w:sz w:val="28"/>
           <w:szCs w:val="28"/>
         </w:rPr>
-      </w:pPr>
-      <w:r>
+        <w:t>Historiando</w:t>
+      </w:r>
+    </w:p>
+    <w:p>
+      <w:pPr>
+        <w:spacing w:line="360" w:lineRule="auto"/>
+        <w:jc w:val="center"/>
+        <w:rPr>
+          <w:b/>
+        </w:rPr>
+      </w:pPr>
+    </w:p>
+    <w:p>
+      <w:pPr>
+        <w:spacing w:line="360" w:lineRule="auto"/>
+        <w:jc w:val="center"/>
+        <w:rPr>
+          <w:b/>
+        </w:rPr>
+      </w:pPr>
+    </w:p>
+    <w:p>
+      <w:pPr>
+        <w:spacing w:line="360" w:lineRule="auto"/>
+        <w:jc w:val="center"/>
+        <w:rPr>
+          <w:b/>
+        </w:rPr>
+      </w:pPr>
+    </w:p>
+    <w:p>
+      <w:pPr>
+        <w:spacing w:line="360" w:lineRule="auto"/>
+        <w:jc w:val="center"/>
+        <w:rPr>
+          <w:b/>
+        </w:rPr>
+      </w:pPr>
+    </w:p>
+    <w:p>
+      <w:pPr>
+        <w:spacing w:line="360" w:lineRule="auto"/>
+        <w:jc w:val="center"/>
+        <w:rPr>
+          <w:b/>
+        </w:rPr>
+      </w:pPr>
+    </w:p>
+    <w:p>
+      <w:pPr>
+        <w:spacing w:line="360" w:lineRule="auto"/>
+        <w:jc w:val="center"/>
+        <w:rPr>
+          <w:b/>
+        </w:rPr>
+      </w:pPr>
+    </w:p>
+    <w:p>
+      <w:pPr>
+        <w:spacing w:line="360" w:lineRule="auto"/>
+        <w:jc w:val="center"/>
+        <w:rPr>
+          <w:b/>
+        </w:rPr>
+      </w:pPr>
+    </w:p>
+    <w:p>
+      <w:pPr>
+        <w:spacing w:line="360" w:lineRule="auto"/>
+        <w:jc w:val="center"/>
+        <w:rPr>
+          <w:b/>
+        </w:rPr>
+      </w:pPr>
+    </w:p>
+    <w:p>
+      <w:pPr>
+        <w:spacing w:line="360" w:lineRule="auto"/>
+        <w:jc w:val="center"/>
+        <w:rPr>
+          <w:b/>
+        </w:rPr>
+      </w:pPr>
+    </w:p>
+    <w:p>
+      <w:pPr>
+        <w:spacing w:line="360" w:lineRule="auto"/>
+        <w:jc w:val="right"/>
+        <w:rPr>
+          <w:b/>
+        </w:rPr>
+      </w:pPr>
+    </w:p>
+    <w:p>
+      <w:pPr>
+        <w:spacing w:line="360" w:lineRule="auto"/>
+        <w:jc w:val="center"/>
         <w:rPr>
           <w:b/>
           <w:sz w:val="28"/>
           <w:szCs w:val="28"/>
         </w:rPr>
-        <w:t>202</w:t>
-      </w:r>
+      </w:pPr>
       <w:r>
         <w:rPr>
           <w:b/>
           <w:sz w:val="28"/>
           <w:szCs w:val="28"/>
         </w:rPr>
-        <w:t>6</w:t>
-      </w:r>
-    </w:p>
-    <w:p>
-      <w:pPr>
-        <w:spacing w:line="360" w:lineRule="auto"/>
-        <w:jc w:val="center"/>
-      </w:pPr>
-    </w:p>
-    <w:p>
-      <w:pPr>
-        <w:spacing w:line="360" w:lineRule="auto"/>
-        <w:jc w:val="center"/>
-      </w:pPr>
-    </w:p>
-    <w:p>
-      <w:pPr>
-        <w:spacing w:line="360" w:lineRule="auto"/>
-        <w:jc w:val="center"/>
-      </w:pPr>
-    </w:p>
-    <w:p>
-      <w:pPr>
-        <w:spacing w:line="360" w:lineRule="auto"/>
-        <w:jc w:val="center"/>
-      </w:pPr>
-    </w:p>
-    <w:p>
-      <w:pPr>
-        <w:spacing w:line="360" w:lineRule="auto"/>
-        <w:jc w:val="center"/>
-        <w:rPr>
-          <w:b/>
-          <w:bCs/>
+        <w:t>Campinas</w:t>
+      </w:r>
+    </w:p>
+    <w:p>
+      <w:pPr>
+        <w:spacing w:line="360" w:lineRule="auto"/>
+        <w:jc w:val="center"/>
+        <w:rPr>
+          <w:b/>
           <w:sz w:val="28"/>
           <w:szCs w:val="28"/>
         </w:rPr>
@@ -417,86 +394,157 @@
       <w:r>
         <w:rPr>
           <w:b/>
-          <w:bCs/>
           <w:sz w:val="28"/>
           <w:szCs w:val="28"/>
         </w:rPr>
-        <w:t>Julia Mendes Pereira</w:t>
-      </w:r>
-    </w:p>
-    <w:p>
-      <w:pPr>
-        <w:spacing w:line="360" w:lineRule="auto"/>
-        <w:jc w:val="center"/>
-        <w:rPr>
-          <w:b/>
-          <w:bCs/>
+        <w:t>202</w:t>
+      </w:r>
+      <w:r>
+        <w:rPr>
+          <w:b/>
           <w:sz w:val="28"/>
           <w:szCs w:val="28"/>
         </w:rPr>
-      </w:pPr>
-      <w:r>
+        <w:t>6</w:t>
+      </w:r>
+    </w:p>
+    <w:p>
+      <w:pPr>
+        <w:spacing w:line="360" w:lineRule="auto"/>
+        <w:jc w:val="center"/>
+      </w:pPr>
+    </w:p>
+    <w:p>
+      <w:pPr>
+        <w:spacing w:line="360" w:lineRule="auto"/>
+      </w:pPr>
+    </w:p>
+    <w:p>
+      <w:pPr>
+        <w:spacing w:line="360" w:lineRule="auto"/>
+        <w:jc w:val="center"/>
         <w:rPr>
           <w:b/>
           <w:bCs/>
           <w:sz w:val="28"/>
           <w:szCs w:val="28"/>
         </w:rPr>
-        <w:t>Maria Júlia da Silva Araújo</w:t>
-      </w:r>
-    </w:p>
-    <w:p>
-      <w:pPr>
-        <w:spacing w:line="360" w:lineRule="auto"/>
-        <w:jc w:val="center"/>
-      </w:pPr>
-    </w:p>
-    <w:p>
-      <w:pPr>
-        <w:spacing w:line="360" w:lineRule="auto"/>
-        <w:jc w:val="center"/>
-      </w:pPr>
-    </w:p>
-    <w:p>
-      <w:pPr>
-        <w:spacing w:line="360" w:lineRule="auto"/>
-        <w:jc w:val="center"/>
-      </w:pPr>
-    </w:p>
-    <w:p>
-      <w:pPr>
-        <w:spacing w:line="360" w:lineRule="auto"/>
-        <w:jc w:val="center"/>
-      </w:pPr>
-    </w:p>
-    <w:p>
-      <w:pPr>
-        <w:spacing w:line="360" w:lineRule="auto"/>
-        <w:jc w:val="center"/>
-      </w:pPr>
-    </w:p>
-    <w:p>
-      <w:pPr>
-        <w:spacing w:line="360" w:lineRule="auto"/>
-        <w:jc w:val="center"/>
-      </w:pPr>
-    </w:p>
-    <w:p>
-      <w:pPr>
-        <w:pStyle w:val="TtulodoTrabalho"/>
-        <w:spacing w:line="360" w:lineRule="auto"/>
-        <w:rPr>
+      </w:pPr>
+      <w:r>
+        <w:rPr>
+          <w:b/>
           <w:bCs/>
           <w:sz w:val="28"/>
           <w:szCs w:val="28"/>
         </w:rPr>
-      </w:pPr>
-      <w:r>
-        <w:rPr>
+        <w:t>Julia Mendes Pereira</w:t>
+      </w:r>
+    </w:p>
+    <w:p>
+      <w:pPr>
+        <w:spacing w:line="360" w:lineRule="auto"/>
+        <w:jc w:val="center"/>
+        <w:rPr>
+          <w:b/>
           <w:bCs/>
           <w:sz w:val="28"/>
           <w:szCs w:val="28"/>
         </w:rPr>
+      </w:pPr>
+      <w:r>
+        <w:rPr>
+          <w:b/>
+          <w:bCs/>
+          <w:sz w:val="28"/>
+          <w:szCs w:val="28"/>
+        </w:rPr>
+        <w:t>Maria Júlia da Silva Araújo</w:t>
+      </w:r>
+    </w:p>
+    <w:p>
+      <w:pPr>
+        <w:spacing w:line="360" w:lineRule="auto"/>
+        <w:jc w:val="center"/>
+        <w:rPr>
+          <w:b/>
+          <w:bCs/>
+          <w:sz w:val="28"/>
+          <w:szCs w:val="28"/>
+        </w:rPr>
+      </w:pPr>
+      <w:r>
+        <w:rPr>
+          <w:b/>
+          <w:bCs/>
+          <w:sz w:val="28"/>
+          <w:szCs w:val="28"/>
+        </w:rPr>
+        <w:t xml:space="preserve">Paola </w:t>
+      </w:r>
+      <w:proofErr w:type="spellStart"/>
+      <w:r>
+        <w:rPr>
+          <w:b/>
+          <w:bCs/>
+          <w:sz w:val="28"/>
+          <w:szCs w:val="28"/>
+        </w:rPr>
+        <w:t>Lohana</w:t>
+      </w:r>
+      <w:proofErr w:type="spellEnd"/>
+    </w:p>
+    <w:p>
+      <w:pPr>
+        <w:spacing w:line="360" w:lineRule="auto"/>
+        <w:jc w:val="center"/>
+      </w:pPr>
+    </w:p>
+    <w:p>
+      <w:pPr>
+        <w:spacing w:line="360" w:lineRule="auto"/>
+        <w:jc w:val="center"/>
+      </w:pPr>
+    </w:p>
+    <w:p>
+      <w:pPr>
+        <w:spacing w:line="360" w:lineRule="auto"/>
+        <w:jc w:val="center"/>
+      </w:pPr>
+    </w:p>
+    <w:p>
+      <w:pPr>
+        <w:spacing w:line="360" w:lineRule="auto"/>
+        <w:jc w:val="center"/>
+      </w:pPr>
+    </w:p>
+    <w:p>
+      <w:pPr>
+        <w:spacing w:line="360" w:lineRule="auto"/>
+        <w:jc w:val="center"/>
+      </w:pPr>
+    </w:p>
+    <w:p>
+      <w:pPr>
+        <w:spacing w:line="360" w:lineRule="auto"/>
+        <w:jc w:val="center"/>
+      </w:pPr>
+    </w:p>
+    <w:p>
+      <w:pPr>
+        <w:pStyle w:val="TtulodoTrabalho"/>
+        <w:spacing w:line="360" w:lineRule="auto"/>
+        <w:rPr>
+          <w:bCs/>
+          <w:sz w:val="28"/>
+          <w:szCs w:val="28"/>
+        </w:rPr>
+      </w:pPr>
+      <w:r>
+        <w:rPr>
+          <w:bCs/>
+          <w:sz w:val="28"/>
+          <w:szCs w:val="28"/>
+        </w:rPr>
         <w:t>HISTORIANDO</w:t>
       </w:r>
     </w:p>
@@ -598,8 +646,16 @@
         <w:rPr>
           <w:sz w:val="22"/>
         </w:rPr>
-        <w:t xml:space="preserve"> Adriano Doimo</w:t>
-      </w:r>
+        <w:t xml:space="preserve"> Adriano </w:t>
+      </w:r>
+      <w:proofErr w:type="spellStart"/>
+      <w:r>
+        <w:rPr>
+          <w:sz w:val="22"/>
+        </w:rPr>
+        <w:t>Doimo</w:t>
+      </w:r>
+      <w:proofErr w:type="spellEnd"/>
       <w:r>
         <w:rPr>
           <w:sz w:val="22"/>
@@ -745,18 +801,6 @@
     </w:p>
     <w:p>
       <w:pPr>
-        <w:jc w:val="center"/>
-        <w:rPr>
-          <w:rFonts w:cs="Arial"/>
-          <w:b/>
-          <w:bCs/>
-          <w:sz w:val="28"/>
-          <w:szCs w:val="28"/>
-        </w:rPr>
-      </w:pPr>
-    </w:p>
-    <w:p>
-      <w:pPr>
         <w:pStyle w:val="Texto-Resumo"/>
       </w:pPr>
     </w:p>
@@ -818,7 +862,21 @@
         <w:rPr>
           <w:rFonts w:ascii="Arial" w:hAnsi="Arial" w:cs="Arial"/>
         </w:rPr>
-        <w:t>narrativa interativa, com foco na valorização dos povos originários, na contextualização histórica e na perspectiva decolonial. O jogo propõe a inserção do jogador em diferentes períodos históricos, permitindo a vivência de acontecimentos, culturas e conflitos presentes na formação do Brasil. Como resultado, espera-se contribuir para a ampliação do interesse pela História, facilitar a fixação dos conteúdos estudados e promover uma aprendizagem mais dinâmica, crítica e acessível.</w:t>
+        <w:t xml:space="preserve">narrativa interativa, com foco na valorização dos povos originários, na contextualização histórica e na perspectiva </w:t>
+      </w:r>
+      <w:proofErr w:type="spellStart"/>
+      <w:r>
+        <w:rPr>
+          <w:rFonts w:ascii="Arial" w:hAnsi="Arial" w:cs="Arial"/>
+        </w:rPr>
+        <w:t>decolonial</w:t>
+      </w:r>
+      <w:proofErr w:type="spellEnd"/>
+      <w:r>
+        <w:rPr>
+          <w:rFonts w:ascii="Arial" w:hAnsi="Arial" w:cs="Arial"/>
+        </w:rPr>
+        <w:t>. O jogo propõe a inserção do jogador em diferentes períodos históricos, permitindo a vivência de acontecimentos, culturas e conflitos presentes na formação do Brasil. Como resultado, espera-se contribuir para a ampliação do interesse pela História, facilitar a fixação dos conteúdos estudados e promover uma aprendizagem mais dinâmica, crítica e acessível.</w:t>
       </w:r>
     </w:p>
     <w:p>
@@ -842,7 +900,21 @@
         <w:rPr>
           <w:rFonts w:ascii="Arial" w:hAnsi="Arial" w:cs="Arial"/>
         </w:rPr>
-        <w:t>: jogo educativo; história do Brasil; povos originários; gamificação; decolonialidade; aprendizagem imersiva.</w:t>
+        <w:t xml:space="preserve">: jogo educativo; história do Brasil; povos originários; gamificação; </w:t>
+      </w:r>
+      <w:proofErr w:type="spellStart"/>
+      <w:r>
+        <w:rPr>
+          <w:rFonts w:ascii="Arial" w:hAnsi="Arial" w:cs="Arial"/>
+        </w:rPr>
+        <w:t>decolonialidade</w:t>
+      </w:r>
+      <w:proofErr w:type="spellEnd"/>
+      <w:r>
+        <w:rPr>
+          <w:rFonts w:ascii="Arial" w:hAnsi="Arial" w:cs="Arial"/>
+        </w:rPr>
+        <w:t>; aprendizagem imersiva.</w:t>
       </w:r>
     </w:p>
     <w:p>
@@ -947,33 +1019,81 @@
           <w:rFonts w:ascii="Arial" w:hAnsi="Arial" w:cs="Arial"/>
           <w:lang w:val="en-US"/>
         </w:rPr>
-        <w:t>The present work presents the development of the Historiando project, an educational game focused on teaching Pre-Colonial and Colonial Brazilian History through a ludic and immersive approach. The project aims to assist elementary and high school students in understanding Brazilian historical processes by using narrative interaction and the player’s active participation as learning tools. The adopted methodology is based on historiographical research, references on gamification, and interactive narrative construction, focusing on the appreciation of Indigenous peoples, historical contextualization, and a decolonial perspective. The game proposes the insertion of the player into different historical periods, allowing the experience of events, cultures, and conflicts related to the formation of Brazil. As a result, the project is expected to contribute to increasing interest in History, facilitating content retention, and promoting a more dynamic, critical, and accessible learning process.</w:t>
-      </w:r>
-    </w:p>
-    <w:p>
-      <w:pPr>
-        <w:pStyle w:val="NormalWeb"/>
-        <w:spacing w:line="360" w:lineRule="auto"/>
-        <w:jc w:val="both"/>
+        <w:t xml:space="preserve">The present work presents the development of the </w:t>
+      </w:r>
+      <w:proofErr w:type="spellStart"/>
+      <w:r>
         <w:rPr>
           <w:rFonts w:ascii="Arial" w:hAnsi="Arial" w:cs="Arial"/>
           <w:lang w:val="en-US"/>
         </w:rPr>
-      </w:pPr>
-      <w:r>
-        <w:rPr>
-          <w:rFonts w:ascii="Arial" w:hAnsi="Arial" w:cs="Arial"/>
-          <w:b/>
-          <w:lang w:val="en-US"/>
-        </w:rPr>
-        <w:t>Keywords</w:t>
-      </w:r>
+        <w:t>Historiando</w:t>
+      </w:r>
+      <w:proofErr w:type="spellEnd"/>
       <w:r>
         <w:rPr>
           <w:rFonts w:ascii="Arial" w:hAnsi="Arial" w:cs="Arial"/>
           <w:lang w:val="en-US"/>
         </w:rPr>
-        <w:t>: educational game; History of Brazil; Indigenous peoples; gamification; decoloniality; immersive learning.</w:t>
+        <w:t xml:space="preserve"> project, an educational game focused on teaching Pre-Colonial and Colonial Brazilian History through a ludic and immersive approach. The project aims to assist elementary and high school students in understanding Brazilian historical processes by using narrative interaction and the player’s active participation as learning tools. The adopted methodology is based on historiographical research, references on gamification, and interactive narrative construction, focusing on the appreciation of Indigenous peoples, historical contextualization, and a </w:t>
+      </w:r>
+      <w:proofErr w:type="spellStart"/>
+      <w:r>
+        <w:rPr>
+          <w:rFonts w:ascii="Arial" w:hAnsi="Arial" w:cs="Arial"/>
+          <w:lang w:val="en-US"/>
+        </w:rPr>
+        <w:t>decolonial</w:t>
+      </w:r>
+      <w:proofErr w:type="spellEnd"/>
+      <w:r>
+        <w:rPr>
+          <w:rFonts w:ascii="Arial" w:hAnsi="Arial" w:cs="Arial"/>
+          <w:lang w:val="en-US"/>
+        </w:rPr>
+        <w:t xml:space="preserve"> perspective. The game proposes the insertion of the player into different historical periods, allowing the experience of events, cultures, and conflicts related to the formation of Brazil. As a result, the project is expected to contribute to increasing interest in History, facilitating content retention, and promoting a more dynamic, critical, and accessible learning process.</w:t>
+      </w:r>
+    </w:p>
+    <w:p>
+      <w:pPr>
+        <w:pStyle w:val="NormalWeb"/>
+        <w:spacing w:line="360" w:lineRule="auto"/>
+        <w:jc w:val="both"/>
+        <w:rPr>
+          <w:rFonts w:ascii="Arial" w:hAnsi="Arial" w:cs="Arial"/>
+          <w:lang w:val="en-US"/>
+        </w:rPr>
+      </w:pPr>
+      <w:r>
+        <w:rPr>
+          <w:rFonts w:ascii="Arial" w:hAnsi="Arial" w:cs="Arial"/>
+          <w:b/>
+          <w:lang w:val="en-US"/>
+        </w:rPr>
+        <w:t>Keywords</w:t>
+      </w:r>
+      <w:r>
+        <w:rPr>
+          <w:rFonts w:ascii="Arial" w:hAnsi="Arial" w:cs="Arial"/>
+          <w:lang w:val="en-US"/>
+        </w:rPr>
+        <w:t xml:space="preserve">: educational game; History of Brazil; Indigenous peoples; gamification; </w:t>
+      </w:r>
+      <w:proofErr w:type="spellStart"/>
+      <w:r>
+        <w:rPr>
+          <w:rFonts w:ascii="Arial" w:hAnsi="Arial" w:cs="Arial"/>
+          <w:lang w:val="en-US"/>
+        </w:rPr>
+        <w:t>decoloniality</w:t>
+      </w:r>
+      <w:proofErr w:type="spellEnd"/>
+      <w:r>
+        <w:rPr>
+          <w:rFonts w:ascii="Arial" w:hAnsi="Arial" w:cs="Arial"/>
+          <w:lang w:val="en-US"/>
+        </w:rPr>
+        <w:t>; immersive learning.</w:t>
       </w:r>
     </w:p>
     <w:p>
@@ -1340,19 +1460,10 @@
         <w:spacing w:after="0" w:line="360" w:lineRule="auto"/>
       </w:pPr>
       <w:r>
-        <w:t>Segundo o historiador Américo Villela, um pouco d</w:t>
-      </w:r>
-      <w:r>
-        <w:t xml:space="preserve">o papel da disciplina </w:t>
-      </w:r>
-      <w:r>
-        <w:t>H</w:t>
-      </w:r>
-      <w:r>
-        <w:t>istória no ensino médio</w:t>
-      </w:r>
-      <w:r>
-        <w:t xml:space="preserve">, isso é, </w:t>
+        <w:t>Segundo</w:t>
+      </w:r>
+      <w:r>
+        <w:t xml:space="preserve"> o historiador Américo Villela, um dos papéis da disciplina de História no Ensino Médio é “</w:t>
       </w:r>
       <w:r>
         <w:t>qualificar o aluno para entender a realidade social que ele vive e atuar como agente de trans</w:t>
@@ -1361,10 +1472,24 @@
         <w:t xml:space="preserve">formação dessa realidade </w:t>
       </w:r>
       <w:r>
-        <w:t xml:space="preserve">social. </w:t>
-      </w:r>
-      <w:r>
-        <w:t xml:space="preserve">(informação verbal) ¹. </w:t>
+        <w:t>social</w:t>
+      </w:r>
+      <w:r>
+        <w:t>”</w:t>
+      </w:r>
+      <w:r>
+        <w:t xml:space="preserve">. </w:t>
+      </w:r>
+      <w:r>
+        <w:t>(</w:t>
+      </w:r>
+      <w:proofErr w:type="gramStart"/>
+      <w:r>
+        <w:t>informação</w:t>
+      </w:r>
+      <w:proofErr w:type="gramEnd"/>
+      <w:r>
+        <w:t xml:space="preserve"> verbal) ¹. </w:t>
       </w:r>
       <w:r>
         <w:t xml:space="preserve">Desse modo, o entendimento acerca de assuntos históricos torna-se essencial para a transformação social, uma vez que ela é alcançada por meio da compreensão dos mecanismos que conduzem a determinadas situações. A partir dessa compreensão da dinâmica social e da evolução histórica, é possível estabelecer medidas que contribuam para a construção de um futuro diferente. </w:t>
@@ -1473,20 +1598,155 @@
           <w:bCs/>
           <w:szCs w:val="24"/>
         </w:rPr>
-        <w:t xml:space="preserve">É notado no ambiente escolar e social uma taxa significativa de pessoas que tem dificuldade ou desinteresse na história do Brasil pré-colonial e colonial, sendo que, como momento de formação do país, ela é um ponto essencial para entender aspectos da sociedade brasileira, como: o início do seu desenvolvimento étnico, o qual se deu com os povos originários, europeus, em sua maioria portugueses, e povos africanos. Estes contribuíram para a construção do Brasil como </w:t>
+        <w:t>Observa-se,</w:t>
       </w:r>
       <w:r>
         <w:rPr>
           <w:bCs/>
           <w:szCs w:val="24"/>
         </w:rPr>
-        <w:t xml:space="preserve">o </w:t>
+        <w:t xml:space="preserve"> no ambiente escolar </w:t>
       </w:r>
       <w:r>
         <w:rPr>
           <w:bCs/>
           <w:szCs w:val="24"/>
         </w:rPr>
+        <w:t xml:space="preserve">e social, um número expressivo </w:t>
+      </w:r>
+      <w:r>
+        <w:rPr>
+          <w:bCs/>
+          <w:szCs w:val="24"/>
+        </w:rPr>
+        <w:t xml:space="preserve">de pessoas que tem dificuldade ou desinteresse na história do </w:t>
+      </w:r>
+      <w:r>
+        <w:rPr>
+          <w:bCs/>
+          <w:szCs w:val="24"/>
+        </w:rPr>
+        <w:t>Brasil pré-colonial e colonial. Entretanto</w:t>
+      </w:r>
+      <w:r>
+        <w:rPr>
+          <w:bCs/>
+          <w:szCs w:val="24"/>
+        </w:rPr>
+        <w:t xml:space="preserve">, como momento de </w:t>
+      </w:r>
+      <w:r>
+        <w:rPr>
+          <w:bCs/>
+          <w:szCs w:val="24"/>
+        </w:rPr>
+        <w:t>formação do país, esses períodos são essenciais</w:t>
+      </w:r>
+      <w:r>
+        <w:rPr>
+          <w:bCs/>
+          <w:szCs w:val="24"/>
+        </w:rPr>
+        <w:t xml:space="preserve"> para </w:t>
+      </w:r>
+      <w:r>
+        <w:rPr>
+          <w:bCs/>
+          <w:szCs w:val="24"/>
+        </w:rPr>
+        <w:t xml:space="preserve">compreender diversos </w:t>
+      </w:r>
+      <w:r>
+        <w:rPr>
+          <w:bCs/>
+          <w:szCs w:val="24"/>
+        </w:rPr>
+        <w:t>aspecto</w:t>
+      </w:r>
+      <w:r>
+        <w:rPr>
+          <w:bCs/>
+          <w:szCs w:val="24"/>
+        </w:rPr>
+        <w:t xml:space="preserve">s da sociedade brasileira, especialmente </w:t>
+      </w:r>
+      <w:r>
+        <w:rPr>
+          <w:bCs/>
+          <w:szCs w:val="24"/>
+        </w:rPr>
+        <w:t>o início do seu desenvolvimento étnico, o qual se deu com os povos originários,</w:t>
+      </w:r>
+      <w:r>
+        <w:rPr>
+          <w:bCs/>
+          <w:szCs w:val="24"/>
+        </w:rPr>
+        <w:t xml:space="preserve"> os europeus </w:t>
+      </w:r>
+      <w:r>
+        <w:t>—</w:t>
+      </w:r>
+      <w:r>
+        <w:rPr>
+          <w:bCs/>
+          <w:szCs w:val="24"/>
+        </w:rPr>
+        <w:t xml:space="preserve"> em sua maioria portugueses</w:t>
+      </w:r>
+      <w:r>
+        <w:rPr>
+          <w:bCs/>
+          <w:szCs w:val="24"/>
+        </w:rPr>
+        <w:softHyphen/>
+      </w:r>
+      <w:r>
+        <w:rPr>
+          <w:bCs/>
+          <w:szCs w:val="24"/>
+        </w:rPr>
+        <w:softHyphen/>
+      </w:r>
+      <w:r>
+        <w:t xml:space="preserve"> </w:t>
+      </w:r>
+      <w:r>
+        <w:t>—</w:t>
+      </w:r>
+      <w:r>
+        <w:rPr>
+          <w:bCs/>
+          <w:szCs w:val="24"/>
+        </w:rPr>
+        <w:t xml:space="preserve"> e</w:t>
+      </w:r>
+      <w:r>
+        <w:rPr>
+          <w:bCs/>
+          <w:szCs w:val="24"/>
+        </w:rPr>
+        <w:t xml:space="preserve"> os povos africanos. Esses grupos</w:t>
+      </w:r>
+      <w:r>
+        <w:rPr>
+          <w:bCs/>
+          <w:szCs w:val="24"/>
+        </w:rPr>
+        <w:t xml:space="preserve"> contribuíram para a construção do Brasil como </w:t>
+      </w:r>
+      <w:r>
+        <w:rPr>
+          <w:bCs/>
+          <w:szCs w:val="24"/>
+        </w:rPr>
+        <w:t xml:space="preserve">um dos </w:t>
+      </w:r>
+      <w:r>
+        <w:rPr>
+          <w:bCs/>
+          <w:szCs w:val="24"/>
+        </w:rPr>
         <w:t>p</w:t>
       </w:r>
       <w:r>
@@ -1494,14 +1754,66 @@
           <w:bCs/>
           <w:szCs w:val="24"/>
         </w:rPr>
-        <w:t>aís mais miscigenado do mundo e</w:t>
+        <w:t>aís</w:t>
       </w:r>
       <w:r>
         <w:rPr>
           <w:bCs/>
           <w:szCs w:val="24"/>
         </w:rPr>
-        <w:t xml:space="preserve"> deixaram como legado seus costumes e tradições, por exemplo o idioma (língua portuguesa), o qual possui traços dos três grupos.</w:t>
+        <w:t>es</w:t>
+      </w:r>
+      <w:r>
+        <w:rPr>
+          <w:bCs/>
+          <w:szCs w:val="24"/>
+        </w:rPr>
+        <w:t xml:space="preserve"> mais miscigenado</w:t>
+      </w:r>
+      <w:r>
+        <w:rPr>
+          <w:bCs/>
+          <w:szCs w:val="24"/>
+        </w:rPr>
+        <w:t>s</w:t>
+      </w:r>
+      <w:r>
+        <w:rPr>
+          <w:bCs/>
+          <w:szCs w:val="24"/>
+        </w:rPr>
+        <w:t xml:space="preserve"> do mundo e</w:t>
+      </w:r>
+      <w:r>
+        <w:rPr>
+          <w:bCs/>
+          <w:szCs w:val="24"/>
+        </w:rPr>
+        <w:t xml:space="preserve"> deixa</w:t>
+      </w:r>
+      <w:r>
+        <w:rPr>
+          <w:bCs/>
+          <w:szCs w:val="24"/>
+        </w:rPr>
+        <w:t xml:space="preserve">ram como legado seus costumes, </w:t>
+      </w:r>
+      <w:r>
+        <w:rPr>
+          <w:bCs/>
+          <w:szCs w:val="24"/>
+        </w:rPr>
+        <w:t>tradições</w:t>
+      </w:r>
+      <w:r>
+        <w:rPr>
+          <w:bCs/>
+          <w:szCs w:val="24"/>
+        </w:rPr>
+        <w:t xml:space="preserve"> e</w:t>
+      </w:r>
+      <w:r>
+        <w:t xml:space="preserve"> até mesmo a língua portuguesa, que incorporou influências dos três grupos.</w:t>
       </w:r>
     </w:p>
     <w:p>
@@ -1553,6 +1865,267 @@
       <w:pPr>
         <w:pStyle w:val="Texto-Resumo"/>
         <w:spacing w:after="0" w:line="360" w:lineRule="auto"/>
+      </w:pPr>
+      <w:r>
+        <w:lastRenderedPageBreak/>
+        <w:t xml:space="preserve">Diante desse cenário, considera-se que as </w:t>
+      </w:r>
+      <w:r>
+        <w:t>didáticas</w:t>
+      </w:r>
+      <w:r>
+        <w:t xml:space="preserve"> tradicionais de ensino, como aulas expositivas em salas fechadas, estudantes sentados em cadeiras enfileiradas, cópias da lousa e atividades avaliativas convencionais, não têm sido suficientes para despertar o interesse dos estudantes pela História do Brasil. Dessa forma, torna-se necessária a implementação de novas estratégias de ensino capazes de promover maior engajamento e participação dos alunos.</w:t>
+      </w:r>
+    </w:p>
+    <w:p>
+      <w:pPr>
+        <w:pStyle w:val="Texto-Resumo"/>
+        <w:spacing w:after="0" w:line="360" w:lineRule="auto"/>
+        <w:rPr>
+          <w:rFonts w:cs="Arial"/>
+          <w:color w:val="1A1A1A"/>
+          <w:spacing w:val="8"/>
+          <w:shd w:val="clear" w:color="auto" w:fill="FFFFFF"/>
+        </w:rPr>
+      </w:pPr>
+      <w:r>
+        <w:t>Com o avanço tecnológico, os jovens estão cada vez mais imersos no mundo digital, assim, para se adaptar</w:t>
+      </w:r>
+      <w:r>
+        <w:t xml:space="preserve"> a essa realidade, uma alternativa promissora </w:t>
+      </w:r>
+      <w:r>
+        <w:t>seria a gamificação.</w:t>
+      </w:r>
+      <w:r>
+        <w:t xml:space="preserve"> </w:t>
+      </w:r>
+      <w:r>
+        <w:rPr>
+          <w:rStyle w:val="Forte"/>
+          <w:rFonts w:cs="Arial"/>
+          <w:b w:val="0"/>
+          <w:color w:val="1A1A1A"/>
+          <w:spacing w:val="8"/>
+          <w:shd w:val="clear" w:color="auto" w:fill="FFFFFF"/>
+        </w:rPr>
+        <w:t>A</w:t>
+      </w:r>
+      <w:r>
+        <w:rPr>
+          <w:rStyle w:val="Forte"/>
+          <w:rFonts w:cs="Arial"/>
+          <w:color w:val="1A1A1A"/>
+          <w:spacing w:val="8"/>
+          <w:shd w:val="clear" w:color="auto" w:fill="FFFFFF"/>
+        </w:rPr>
+        <w:t xml:space="preserve"> gamificação, </w:t>
+      </w:r>
+      <w:r>
+        <w:rPr>
+          <w:rStyle w:val="Forte"/>
+          <w:rFonts w:cs="Arial"/>
+          <w:b w:val="0"/>
+          <w:color w:val="1A1A1A"/>
+          <w:spacing w:val="8"/>
+          <w:shd w:val="clear" w:color="auto" w:fill="FFFFFF"/>
+        </w:rPr>
+        <w:t>ou</w:t>
+      </w:r>
+      <w:r>
+        <w:rPr>
+          <w:rStyle w:val="Forte"/>
+          <w:rFonts w:cs="Arial"/>
+          <w:color w:val="1A1A1A"/>
+          <w:spacing w:val="8"/>
+          <w:shd w:val="clear" w:color="auto" w:fill="FFFFFF"/>
+        </w:rPr>
+        <w:t xml:space="preserve"> ludificação, </w:t>
+      </w:r>
+      <w:r>
+        <w:rPr>
+          <w:rStyle w:val="Forte"/>
+          <w:rFonts w:cs="Arial"/>
+          <w:b w:val="0"/>
+          <w:color w:val="1A1A1A"/>
+          <w:spacing w:val="8"/>
+          <w:shd w:val="clear" w:color="auto" w:fill="FFFFFF"/>
+        </w:rPr>
+        <w:t>(do inglês Gamification)</w:t>
+      </w:r>
+      <w:r>
+        <w:rPr>
+          <w:rFonts w:cs="Arial"/>
+          <w:color w:val="1A1A1A"/>
+          <w:spacing w:val="8"/>
+          <w:shd w:val="clear" w:color="auto" w:fill="FFFFFF"/>
+        </w:rPr>
+        <w:t> é a metodologia de derivar todos os elementos divertidos e envolventes encontrados em jogos e aplicá-los ao mundo real ou atividades corporativas.</w:t>
+      </w:r>
+      <w:r>
+        <w:rPr>
+          <w:rFonts w:cs="Arial"/>
+          <w:color w:val="1A1A1A"/>
+          <w:spacing w:val="8"/>
+          <w:shd w:val="clear" w:color="auto" w:fill="FFFFFF"/>
+        </w:rPr>
+        <w:t xml:space="preserve"> (GAMEFIC)</w:t>
+      </w:r>
+    </w:p>
+    <w:p>
+      <w:pPr>
+        <w:pStyle w:val="Texto-Resumo"/>
+        <w:spacing w:after="0" w:line="360" w:lineRule="auto"/>
+        <w:rPr>
+          <w:rFonts w:cs="Arial"/>
+          <w:color w:val="1A1A1A"/>
+          <w:spacing w:val="8"/>
+          <w:shd w:val="clear" w:color="auto" w:fill="FFFFFF"/>
+        </w:rPr>
+      </w:pPr>
+      <w:r>
+        <w:rPr>
+          <w:rFonts w:cs="Arial"/>
+          <w:color w:val="1A1A1A"/>
+          <w:spacing w:val="8"/>
+          <w:shd w:val="clear" w:color="auto" w:fill="FFFFFF"/>
+        </w:rPr>
+        <w:t xml:space="preserve">Assim, </w:t>
+      </w:r>
+      <w:r>
+        <w:rPr>
+          <w:rFonts w:cs="Arial"/>
+          <w:color w:val="1A1A1A"/>
+          <w:spacing w:val="8"/>
+          <w:shd w:val="clear" w:color="auto" w:fill="FFFFFF"/>
+        </w:rPr>
+        <w:t xml:space="preserve">acredita-se que a utilização de </w:t>
+      </w:r>
+      <w:r>
+        <w:rPr>
+          <w:rFonts w:cs="Arial"/>
+          <w:color w:val="1A1A1A"/>
+          <w:spacing w:val="8"/>
+          <w:shd w:val="clear" w:color="auto" w:fill="FFFFFF"/>
+        </w:rPr>
+        <w:t>jogo</w:t>
+      </w:r>
+      <w:r>
+        <w:rPr>
+          <w:rFonts w:cs="Arial"/>
+          <w:color w:val="1A1A1A"/>
+          <w:spacing w:val="8"/>
+          <w:shd w:val="clear" w:color="auto" w:fill="FFFFFF"/>
+        </w:rPr>
+        <w:t>s</w:t>
+      </w:r>
+      <w:r>
+        <w:rPr>
+          <w:rFonts w:cs="Arial"/>
+          <w:color w:val="1A1A1A"/>
+          <w:spacing w:val="8"/>
+          <w:shd w:val="clear" w:color="auto" w:fill="FFFFFF"/>
+        </w:rPr>
+        <w:t xml:space="preserve"> educativos (serious games) que </w:t>
+      </w:r>
+      <w:r>
+        <w:rPr>
+          <w:rFonts w:cs="Arial"/>
+          <w:color w:val="1A1A1A"/>
+          <w:spacing w:val="8"/>
+          <w:shd w:val="clear" w:color="auto" w:fill="FFFFFF"/>
+        </w:rPr>
+        <w:t>estimule</w:t>
+      </w:r>
+      <w:r>
+        <w:rPr>
+          <w:rFonts w:cs="Arial"/>
+          <w:color w:val="1A1A1A"/>
+          <w:spacing w:val="8"/>
+          <w:shd w:val="clear" w:color="auto" w:fill="FFFFFF"/>
+        </w:rPr>
+        <w:t>m</w:t>
+      </w:r>
+      <w:r>
+        <w:rPr>
+          <w:rFonts w:cs="Arial"/>
+          <w:color w:val="1A1A1A"/>
+          <w:spacing w:val="8"/>
+          <w:shd w:val="clear" w:color="auto" w:fill="FFFFFF"/>
+        </w:rPr>
+        <w:t xml:space="preserve"> a aprendizagem </w:t>
+      </w:r>
+      <w:r>
+        <w:rPr>
+          <w:rFonts w:cs="Arial"/>
+          <w:color w:val="1A1A1A"/>
+          <w:spacing w:val="8"/>
+          <w:shd w:val="clear" w:color="auto" w:fill="FFFFFF"/>
+        </w:rPr>
+        <w:t>por meio</w:t>
+      </w:r>
+      <w:r>
+        <w:rPr>
+          <w:rFonts w:cs="Arial"/>
+          <w:color w:val="1A1A1A"/>
+          <w:spacing w:val="8"/>
+          <w:shd w:val="clear" w:color="auto" w:fill="FFFFFF"/>
+        </w:rPr>
+        <w:t xml:space="preserve"> de desafios, conquistas e</w:t>
+      </w:r>
+      <w:r>
+        <w:rPr>
+          <w:rFonts w:cs="Arial"/>
+          <w:color w:val="1A1A1A"/>
+          <w:spacing w:val="8"/>
+          <w:shd w:val="clear" w:color="auto" w:fill="FFFFFF"/>
+        </w:rPr>
+        <w:t xml:space="preserve"> pela</w:t>
+      </w:r>
+      <w:r>
+        <w:rPr>
+          <w:rFonts w:cs="Arial"/>
+          <w:color w:val="1A1A1A"/>
+          <w:spacing w:val="8"/>
+          <w:shd w:val="clear" w:color="auto" w:fill="FFFFFF"/>
+        </w:rPr>
+        <w:t xml:space="preserve"> competição, </w:t>
+      </w:r>
+      <w:r>
+        <w:rPr>
+          <w:rFonts w:cs="Arial"/>
+          <w:color w:val="1A1A1A"/>
+          <w:spacing w:val="8"/>
+          <w:shd w:val="clear" w:color="auto" w:fill="FFFFFF"/>
+        </w:rPr>
+        <w:t xml:space="preserve">possa </w:t>
+      </w:r>
+      <w:r>
+        <w:rPr>
+          <w:rFonts w:cs="Arial"/>
+          <w:color w:val="1A1A1A"/>
+          <w:spacing w:val="8"/>
+          <w:shd w:val="clear" w:color="auto" w:fill="FFFFFF"/>
+        </w:rPr>
+        <w:t>auxiliar</w:t>
+      </w:r>
+      <w:r>
+        <w:rPr>
+          <w:rFonts w:cs="Arial"/>
+          <w:color w:val="1A1A1A"/>
+          <w:spacing w:val="8"/>
+          <w:shd w:val="clear" w:color="auto" w:fill="FFFFFF"/>
+        </w:rPr>
+        <w:t xml:space="preserve"> os estudantes a adquirirem conhecimentos e tornar o processo acadêmico mais significativo. </w:t>
+      </w:r>
+      <w:r>
+        <w:t>Essa hipótese é reforçada pelo que afirma Olivia Baldissera ao tratar da gamificação na educação: "professores e alunos têm muito a ganhar com aulas gamificadas. A estratégia dos jogos ajuda a manter a concentração e ainda deixa o período em sala mais dinâmico."</w:t>
+      </w:r>
+    </w:p>
+    <w:p>
+      <w:pPr>
+        <w:pStyle w:val="Texto-Resumo"/>
+        <w:spacing w:after="0" w:line="360" w:lineRule="auto"/>
         <w:jc w:val="left"/>
       </w:pPr>
     </w:p>
@@ -1565,11 +2138,11 @@
           <w:b/>
         </w:rPr>
       </w:pPr>
-      <w:r>
-        <w:rPr>
-          <w:b/>
-        </w:rPr>
-        <w:lastRenderedPageBreak/>
+      <w:proofErr w:type="gramStart"/>
+      <w:r>
+        <w:rPr>
+          <w:b/>
+        </w:rPr>
         <w:t>1.</w:t>
       </w:r>
       <w:r>
@@ -1584,6 +2157,7 @@
         </w:rPr>
         <w:t>ustificativa</w:t>
       </w:r>
+      <w:proofErr w:type="gramEnd"/>
     </w:p>
     <w:p>
       <w:pPr>
@@ -1606,7 +2180,43 @@
         <w:rPr>
           <w:rFonts w:cs="Arial"/>
         </w:rPr>
-        <w:t>Por meio da aplicação de um questionário, em 2025, aos estudantes da escola Etec Bento Quirino, observou-se um desinteresse significativo pelos conteúdos abordados nas disciplinas de História. Os estudantes relataram falta de interesse pelo tema, o que pode estar relacionado à forma limitada como os conteúdos são apresentados, bem como as técnicas de ensino utilizadas no processo de aprendizagem. Mesmo entre os estudantes que demonstram interesse pela disciplina, são mencionadas dificuldades em aprender o conteúdo devido à metodologia adotada. Considerando que os jogos sérios – jogos desenvolvidos com fins educacionais – têm como proposta ensinar por meio da jogabilidade, este trabalho propõe o desenvolvimento de um jogo de aventura como forma de complementar o método de ensino em sala de aula, buscando transmitir o conhecimento por meio de diferentes formas de comunicação.</w:t>
+        <w:t xml:space="preserve">Por meio da aplicação de um questionário, em 2025, aos estudantes da escola </w:t>
+      </w:r>
+      <w:proofErr w:type="spellStart"/>
+      <w:r>
+        <w:rPr>
+          <w:rFonts w:cs="Arial"/>
+        </w:rPr>
+        <w:t>Etec</w:t>
+      </w:r>
+      <w:proofErr w:type="spellEnd"/>
+      <w:r>
+        <w:rPr>
+          <w:rFonts w:cs="Arial"/>
+        </w:rPr>
+        <w:t xml:space="preserve"> Bento Quirino, observou-se um desinteresse significativo pelos conteúdos abordados nas disciplinas de História. Os estudantes relataram falta de interesse pelo tema, o que pode estar relacionado à forma limitada como os conteúdos são apresentados, bem como as técnicas de ensino utilizadas no processo de aprendizagem. Mesmo entre os estudantes que demonstram interesse pela disciplina, são mencionadas dificuldades em aprender o conteúdo devido à metodologia adotada. Considerando que os jogos sérios – jogos desenvolvidos com fins educacionais – têm como proposta ensinar por meio da </w:t>
+      </w:r>
+      <w:proofErr w:type="spellStart"/>
+      <w:r>
+        <w:rPr>
+          <w:rFonts w:cs="Arial"/>
+        </w:rPr>
+        <w:t>jogabilidade</w:t>
+      </w:r>
+      <w:proofErr w:type="spellEnd"/>
+      <w:r>
+        <w:rPr>
+          <w:rFonts w:cs="Arial"/>
+        </w:rPr>
+        <w:t>, este trabalho propõe o desenvolvimento de um jogo de aventura como forma de complementar o método de ensino em sala de aula, bus</w:t>
+      </w:r>
+      <w:bookmarkStart w:id="0" w:name="_GoBack"/>
+      <w:bookmarkEnd w:id="0"/>
+      <w:r>
+        <w:rPr>
+          <w:rFonts w:cs="Arial"/>
+        </w:rPr>
+        <w:t>cando transmitir o conhecimento por meio de diferentes formas de comunicação.</w:t>
       </w:r>
     </w:p>
     <w:p>
@@ -1668,7 +2278,7 @@
     </w:p>
     <w:p>
       <w:pPr>
-        <w:spacing w:after="120" w:line="360" w:lineRule="auto"/>
+        <w:spacing w:line="360" w:lineRule="auto"/>
         <w:rPr>
           <w:rFonts w:cs="Arial"/>
         </w:rPr>
@@ -1854,7 +2464,6 @@
         <w:rPr>
           <w:b/>
         </w:rPr>
-        <w:lastRenderedPageBreak/>
         <w:t xml:space="preserve"> </w:t>
       </w:r>
       <w:r>
@@ -1981,225 +2590,70 @@
         <w:rPr>
           <w:rFonts w:cs="Arial"/>
         </w:rPr>
-        <w:t>à parte técnica do jogo, os personagens serão desenvolvidos por meio de ferramentas de renderização de objetos 3D, como o Blender, e os mecanismos do jogo serão desenvolvidos utilizando a engine Godot 4.</w:t>
-      </w:r>
-    </w:p>
-    <w:p>
-      <w:pPr>
-        <w:pStyle w:val="Texto-Resumo"/>
-        <w:spacing w:after="0" w:line="360" w:lineRule="auto"/>
-        <w:jc w:val="left"/>
-        <w:rPr>
-          <w:b/>
-        </w:rPr>
-      </w:pPr>
-    </w:p>
-    <w:p>
-      <w:pPr>
-        <w:pStyle w:val="Texto-Resumo"/>
-        <w:spacing w:after="0" w:line="360" w:lineRule="auto"/>
-        <w:jc w:val="left"/>
-        <w:rPr>
-          <w:bCs/>
-        </w:rPr>
-      </w:pPr>
-    </w:p>
-    <w:p>
-      <w:pPr>
-        <w:pStyle w:val="Texto-Resumo"/>
-        <w:spacing w:after="0" w:line="360" w:lineRule="auto"/>
-        <w:jc w:val="left"/>
-        <w:rPr>
-          <w:bCs/>
-        </w:rPr>
-      </w:pPr>
-    </w:p>
-    <w:p>
-      <w:pPr>
-        <w:pStyle w:val="Texto-Resumo"/>
-        <w:spacing w:after="0" w:line="360" w:lineRule="auto"/>
-        <w:jc w:val="left"/>
-        <w:rPr>
-          <w:bCs/>
-        </w:rPr>
-      </w:pPr>
-    </w:p>
-    <w:p>
-      <w:pPr>
-        <w:pStyle w:val="Texto-Resumo"/>
-        <w:spacing w:after="0" w:line="360" w:lineRule="auto"/>
-        <w:jc w:val="left"/>
-        <w:rPr>
-          <w:bCs/>
-        </w:rPr>
-      </w:pPr>
-    </w:p>
-    <w:p>
-      <w:pPr>
-        <w:pStyle w:val="Texto-Resumo"/>
-        <w:spacing w:after="0" w:line="360" w:lineRule="auto"/>
-        <w:jc w:val="left"/>
-        <w:rPr>
-          <w:bCs/>
-        </w:rPr>
-      </w:pPr>
-    </w:p>
-    <w:p>
-      <w:pPr>
-        <w:pStyle w:val="Texto-Resumo"/>
-        <w:spacing w:after="0" w:line="360" w:lineRule="auto"/>
-        <w:jc w:val="left"/>
-        <w:rPr>
-          <w:bCs/>
-        </w:rPr>
-      </w:pPr>
-    </w:p>
-    <w:p>
-      <w:pPr>
-        <w:pStyle w:val="Texto-Resumo"/>
-        <w:spacing w:after="0" w:line="360" w:lineRule="auto"/>
-        <w:jc w:val="left"/>
-        <w:rPr>
-          <w:bCs/>
-        </w:rPr>
-      </w:pPr>
-    </w:p>
-    <w:p>
-      <w:pPr>
-        <w:pStyle w:val="Texto-Resumo"/>
-        <w:spacing w:after="0" w:line="360" w:lineRule="auto"/>
-        <w:jc w:val="left"/>
-        <w:rPr>
-          <w:bCs/>
-        </w:rPr>
-      </w:pPr>
-    </w:p>
-    <w:p>
-      <w:pPr>
-        <w:pStyle w:val="Texto-Resumo"/>
-        <w:spacing w:after="0" w:line="360" w:lineRule="auto"/>
-        <w:jc w:val="left"/>
-        <w:rPr>
-          <w:bCs/>
-        </w:rPr>
-      </w:pPr>
-    </w:p>
-    <w:p>
-      <w:pPr>
-        <w:pStyle w:val="Texto-Resumo"/>
-        <w:spacing w:after="0" w:line="360" w:lineRule="auto"/>
-        <w:jc w:val="left"/>
-        <w:rPr>
-          <w:bCs/>
-        </w:rPr>
-      </w:pPr>
-    </w:p>
-    <w:p>
-      <w:pPr>
-        <w:pStyle w:val="Texto-Resumo"/>
-        <w:spacing w:after="0" w:line="360" w:lineRule="auto"/>
-        <w:jc w:val="left"/>
-        <w:rPr>
-          <w:bCs/>
-        </w:rPr>
-      </w:pPr>
-    </w:p>
-    <w:p>
-      <w:pPr>
-        <w:pStyle w:val="Texto-Resumo"/>
-        <w:spacing w:after="0" w:line="360" w:lineRule="auto"/>
-        <w:jc w:val="left"/>
-        <w:rPr>
-          <w:b/>
-          <w:szCs w:val="24"/>
-        </w:rPr>
-      </w:pPr>
-    </w:p>
-    <w:p>
-      <w:pPr>
-        <w:pStyle w:val="Texto-Resumo"/>
-        <w:spacing w:after="0" w:line="360" w:lineRule="auto"/>
-        <w:jc w:val="left"/>
-        <w:rPr>
-          <w:b/>
-          <w:szCs w:val="24"/>
-        </w:rPr>
-      </w:pPr>
-    </w:p>
-    <w:p>
-      <w:pPr>
-        <w:pStyle w:val="Texto-Resumo"/>
-        <w:spacing w:after="0" w:line="360" w:lineRule="auto"/>
-        <w:jc w:val="left"/>
-        <w:rPr>
-          <w:b/>
-          <w:szCs w:val="24"/>
-        </w:rPr>
-      </w:pPr>
-    </w:p>
-    <w:p>
-      <w:pPr>
-        <w:pStyle w:val="Texto-Resumo"/>
-        <w:spacing w:after="0" w:line="360" w:lineRule="auto"/>
-        <w:jc w:val="left"/>
-        <w:rPr>
-          <w:b/>
-          <w:szCs w:val="24"/>
-        </w:rPr>
-      </w:pPr>
-    </w:p>
-    <w:p>
-      <w:pPr>
-        <w:pStyle w:val="Texto-Resumo"/>
-        <w:spacing w:after="0" w:line="360" w:lineRule="auto"/>
-        <w:jc w:val="left"/>
-        <w:rPr>
-          <w:b/>
-          <w:szCs w:val="24"/>
-        </w:rPr>
-      </w:pPr>
-    </w:p>
-    <w:p>
-      <w:pPr>
-        <w:pStyle w:val="Texto-Resumo"/>
-        <w:spacing w:after="0" w:line="360" w:lineRule="auto"/>
-        <w:jc w:val="left"/>
-        <w:rPr>
-          <w:b/>
-          <w:szCs w:val="24"/>
-        </w:rPr>
-      </w:pPr>
-    </w:p>
-    <w:p>
-      <w:pPr>
-        <w:pStyle w:val="Texto-Resumo"/>
-        <w:spacing w:after="0" w:line="360" w:lineRule="auto"/>
-        <w:jc w:val="left"/>
-        <w:rPr>
-          <w:b/>
-          <w:szCs w:val="24"/>
-        </w:rPr>
-      </w:pPr>
-    </w:p>
-    <w:p>
-      <w:pPr>
-        <w:pStyle w:val="Texto-Resumo"/>
-        <w:spacing w:after="0" w:line="360" w:lineRule="auto"/>
-        <w:jc w:val="left"/>
-        <w:rPr>
-          <w:b/>
-          <w:szCs w:val="24"/>
-        </w:rPr>
-      </w:pPr>
-    </w:p>
-    <w:p>
-      <w:pPr>
-        <w:pStyle w:val="Texto-Resumo"/>
-        <w:spacing w:after="0" w:line="360" w:lineRule="auto"/>
-        <w:jc w:val="left"/>
-        <w:rPr>
-          <w:b/>
-          <w:szCs w:val="24"/>
+        <w:t xml:space="preserve">à parte técnica do jogo, os personagens serão desenvolvidos por meio de ferramentas de </w:t>
+      </w:r>
+      <w:proofErr w:type="spellStart"/>
+      <w:r>
+        <w:rPr>
+          <w:rFonts w:cs="Arial"/>
+        </w:rPr>
+        <w:t>renderização</w:t>
+      </w:r>
+      <w:proofErr w:type="spellEnd"/>
+      <w:r>
+        <w:rPr>
+          <w:rFonts w:cs="Arial"/>
+        </w:rPr>
+        <w:t xml:space="preserve"> de objetos 3D, como o </w:t>
+      </w:r>
+      <w:proofErr w:type="spellStart"/>
+      <w:r>
+        <w:rPr>
+          <w:rFonts w:cs="Arial"/>
+        </w:rPr>
+        <w:t>Blender</w:t>
+      </w:r>
+      <w:proofErr w:type="spellEnd"/>
+      <w:r>
+        <w:rPr>
+          <w:rFonts w:cs="Arial"/>
+        </w:rPr>
+        <w:t xml:space="preserve">, e os mecanismos do jogo serão desenvolvidos utilizando a </w:t>
+      </w:r>
+      <w:proofErr w:type="spellStart"/>
+      <w:r>
+        <w:rPr>
+          <w:rFonts w:cs="Arial"/>
+        </w:rPr>
+        <w:t>engine</w:t>
+      </w:r>
+      <w:proofErr w:type="spellEnd"/>
+      <w:r>
+        <w:rPr>
+          <w:rFonts w:cs="Arial"/>
+        </w:rPr>
+        <w:t xml:space="preserve"> </w:t>
+      </w:r>
+      <w:proofErr w:type="spellStart"/>
+      <w:r>
+        <w:rPr>
+          <w:rFonts w:cs="Arial"/>
+        </w:rPr>
+        <w:t>Godot</w:t>
+      </w:r>
+      <w:proofErr w:type="spellEnd"/>
+      <w:r>
+        <w:rPr>
+          <w:rFonts w:cs="Arial"/>
+        </w:rPr>
+        <w:t xml:space="preserve"> 4.</w:t>
+      </w:r>
+    </w:p>
+    <w:p>
+      <w:pPr>
+        <w:spacing w:after="120" w:line="360" w:lineRule="auto"/>
+        <w:rPr>
+          <w:rFonts w:cs="Arial"/>
         </w:rPr>
       </w:pPr>
     </w:p>
@@ -2918,8 +3372,6 @@
           <w:szCs w:val="22"/>
         </w:rPr>
       </w:pPr>
-      <w:bookmarkStart w:id="0" w:name="_GoBack"/>
-      <w:bookmarkEnd w:id="0"/>
     </w:p>
     <w:p>
       <w:pPr>
@@ -2937,8 +3389,6 @@
       <w:pPr>
         <w:jc w:val="left"/>
         <w:rPr>
-          <w:rFonts w:cs="Arial"/>
-          <w:bCs/>
           <w:sz w:val="22"/>
           <w:szCs w:val="22"/>
         </w:rPr>
@@ -2948,35 +3398,55 @@
           <w:sz w:val="22"/>
           <w:szCs w:val="22"/>
         </w:rPr>
-        <w:t xml:space="preserve">UNIÃO BRASILEIRA DOS ESTUDANTES SECUNDARISTAS (UBES). A importância de estudar história nas escolas. Brasília, 30 nov. 2024. Disponível em: </w:t>
+        <w:t xml:space="preserve">UNIÃO BRASILEIRA DOS ESTUDANTES SECUNDARISTAS (UBES). A importância de estudar história nas escolas. Brasília, 30 nov. 2024. Disponível em: https://www.ubes.org.br/2024/a-importancia-de-estudar-historia-nas-escolas/. Acesso em: </w:t>
       </w:r>
       <w:r>
         <w:rPr>
           <w:sz w:val="22"/>
           <w:szCs w:val="22"/>
         </w:rPr>
-        <w:t>https://www.ubes.org.br/2024/a-importancia-de-estudar-historia-nas-escolas/</w:t>
+        <w:t>21 maio</w:t>
       </w:r>
       <w:r>
         <w:rPr>
           <w:sz w:val="22"/>
           <w:szCs w:val="22"/>
         </w:rPr>
-        <w:t xml:space="preserve">. Acesso em: </w:t>
-      </w:r>
-      <w:r>
+        <w:t>. 2026.</w:t>
+      </w:r>
+    </w:p>
+    <w:p>
+      <w:pPr>
+        <w:jc w:val="left"/>
         <w:rPr>
           <w:sz w:val="22"/>
           <w:szCs w:val="22"/>
         </w:rPr>
-        <w:t>21 maio</w:t>
-      </w:r>
+      </w:pPr>
       <w:r>
         <w:rPr>
           <w:sz w:val="22"/>
           <w:szCs w:val="22"/>
         </w:rPr>
-        <w:t>. 2026.</w:t>
+        <w:t>GAMEFIC. O que é gamificação? O guia definitivo. [S. l.], [s. d.]. Disponível em: https://www.gamefic.me/blog/o-que-e-gamificacao-o-guia-definitivo/. Acesso em: 6 ago. 2026.</w:t>
+      </w:r>
+    </w:p>
+    <w:p>
+      <w:pPr>
+        <w:jc w:val="left"/>
+        <w:rPr>
+          <w:rFonts w:cs="Arial"/>
+          <w:bCs/>
+          <w:sz w:val="22"/>
+          <w:szCs w:val="22"/>
+        </w:rPr>
+      </w:pPr>
+      <w:r>
+        <w:rPr>
+          <w:sz w:val="22"/>
+          <w:szCs w:val="22"/>
+        </w:rPr>
+        <w:t>BALDISSERA, Olivia. O que é gamificação e como ela aumenta o engajamento. Pós PUCPR Digital, 5 abr. 2021. Disponível em: https://posdigital.pucpr.br/blog/gamificacao-engajamento. Acesso em: 6 ago. 2026.</w:t>
       </w:r>
     </w:p>
     <w:sectPr>
@@ -3124,7 +3594,6 @@
         <w:docPartUnique/>
       </w:docPartObj>
     </w:sdtPr>
-    <w:sdtEndPr/>
     <w:sdtContent>
       <w:p>
         <w:pPr>
@@ -4059,7 +4528,6 @@
   <w:style w:type="character" w:default="1" w:styleId="Fontepargpadro">
     <w:name w:val="Default Paragraph Font"/>
     <w:uiPriority w:val="1"/>
-    <w:semiHidden/>
     <w:unhideWhenUsed/>
   </w:style>
   <w:style w:type="table" w:default="1" w:styleId="Tabelanormal">
@@ -4269,6 +4737,17 @@
     <w:rPr>
       <w:color w:val="0000FF"/>
       <w:u w:val="single"/>
+    </w:rPr>
+  </w:style>
+  <w:style w:type="character" w:styleId="Forte">
+    <w:name w:val="Strong"/>
+    <w:basedOn w:val="Fontepargpadro"/>
+    <w:uiPriority w:val="22"/>
+    <w:qFormat/>
+    <w:rsid w:val="00BF365F"/>
+    <w:rPr>
+      <w:b/>
+      <w:bCs/>
     </w:rPr>
   </w:style>
 </w:styles>
@@ -4540,7 +5019,7 @@
 </file>
 
 <file path=customXml/itemProps1.xml><?xml version="1.0" encoding="utf-8"?>
-<ds:datastoreItem xmlns:ds="http://schemas.openxmlformats.org/officeDocument/2006/customXml" ds:itemID="{085A1556-E6A0-4DC2-A3E6-3300AFC2CA60}">
+<ds:datastoreItem xmlns:ds="http://schemas.openxmlformats.org/officeDocument/2006/customXml" ds:itemID="{DB2525B7-0405-4ADA-860C-C831100485EA}">
   <ds:schemaRefs>
     <ds:schemaRef ds:uri="http://schemas.openxmlformats.org/officeDocument/2006/bibliography"/>
   </ds:schemaRefs>

</xml_diff>